<commit_message>
+1 ex BFS , BFS lol -_-
</commit_message>
<xml_diff>
--- a/DSA/Graph/DFS ( Tim_kiem_theo_chieu_sau )/DFS + BFS.docx
+++ b/DSA/Graph/DFS ( Tim_kiem_theo_chieu_sau )/DFS + BFS.docx
@@ -3199,23 +3199,7 @@
           <w:sz w:val="32"/>
           <w:szCs w:val="32"/>
         </w:rPr>
-        <w:t xml:space="preserve"> thị </w:t>
-      </w:r>
-      <w:r>
-        <w:rPr>
-          <w:rFonts w:asciiTheme="majorHAnsi" w:hAnsiTheme="majorHAnsi" w:cstheme="majorHAnsi"/>
-          <w:sz w:val="32"/>
-          <w:szCs w:val="32"/>
-        </w:rPr>
-        <w:t xml:space="preserve">có </w:t>
-      </w:r>
-      <w:r>
-        <w:rPr>
-          <w:rFonts w:asciiTheme="majorHAnsi" w:hAnsiTheme="majorHAnsi" w:cstheme="majorHAnsi"/>
-          <w:sz w:val="32"/>
-          <w:szCs w:val="32"/>
-        </w:rPr>
-        <w:t>hướng</w:t>
+        <w:t xml:space="preserve"> thị có hướng</w:t>
       </w:r>
     </w:p>
     <w:p>
@@ -13347,6 +13331,4886 @@
           <w:sz w:val="32"/>
           <w:szCs w:val="32"/>
           <w:lang w:val="en-US"/>
+        </w:rPr>
+      </w:pPr>
+    </w:p>
+    <w:p>
+      <w:pPr>
+        <w:rPr>
+          <w:rFonts w:asciiTheme="majorHAnsi" w:hAnsiTheme="majorHAnsi" w:cstheme="majorHAnsi"/>
+          <w:sz w:val="32"/>
+          <w:szCs w:val="32"/>
+          <w:lang w:val="en-US"/>
+        </w:rPr>
+      </w:pPr>
+    </w:p>
+    <w:p>
+      <w:pPr>
+        <w:rPr>
+          <w:rFonts w:asciiTheme="majorHAnsi" w:hAnsiTheme="majorHAnsi" w:cstheme="majorHAnsi"/>
+          <w:b/>
+          <w:bCs/>
+          <w:sz w:val="32"/>
+          <w:szCs w:val="32"/>
+        </w:rPr>
+      </w:pPr>
+      <w:r>
+        <w:rPr>
+          <w:rFonts w:asciiTheme="majorHAnsi" w:hAnsiTheme="majorHAnsi" w:cstheme="majorHAnsi"/>
+          <w:b/>
+          <w:bCs/>
+          <w:sz w:val="32"/>
+          <w:szCs w:val="32"/>
+          <w:lang w:val="en-US"/>
+        </w:rPr>
+        <w:t>LEETCODE</w:t>
+      </w:r>
+      <w:r>
+        <w:rPr>
+          <w:rFonts w:asciiTheme="majorHAnsi" w:hAnsiTheme="majorHAnsi" w:cstheme="majorHAnsi"/>
+          <w:b/>
+          <w:bCs/>
+          <w:sz w:val="32"/>
+          <w:szCs w:val="32"/>
+        </w:rPr>
+        <w:t xml:space="preserve"> 994: </w:t>
+      </w:r>
+    </w:p>
+    <w:p>
+      <w:pPr>
+        <w:shd w:val="clear" w:color="auto" w:fill="282C34"/>
+        <w:spacing w:after="0" w:line="285" w:lineRule="atLeast"/>
+        <w:rPr>
+          <w:rFonts w:ascii="Consolas" w:eastAsia="Times New Roman" w:hAnsi="Consolas" w:cs="Times New Roman"/>
+          <w:color w:val="ABB2BF"/>
+          <w:sz w:val="21"/>
+          <w:szCs w:val="21"/>
+          <w:lang w:eastAsia="vi-VN"/>
+        </w:rPr>
+      </w:pPr>
+      <w:r>
+        <w:rPr>
+          <w:rFonts w:ascii="Consolas" w:eastAsia="Times New Roman" w:hAnsi="Consolas" w:cs="Times New Roman"/>
+          <w:color w:val="C678DD"/>
+          <w:sz w:val="21"/>
+          <w:szCs w:val="21"/>
+          <w:lang w:eastAsia="vi-VN"/>
+        </w:rPr>
+        <w:t>class</w:t>
+      </w:r>
+      <w:r>
+        <w:rPr>
+          <w:rFonts w:ascii="Consolas" w:eastAsia="Times New Roman" w:hAnsi="Consolas" w:cs="Times New Roman"/>
+          <w:color w:val="ABB2BF"/>
+          <w:sz w:val="21"/>
+          <w:szCs w:val="21"/>
+          <w:lang w:eastAsia="vi-VN"/>
+        </w:rPr>
+        <w:t xml:space="preserve"> </w:t>
+      </w:r>
+      <w:r>
+        <w:rPr>
+          <w:rFonts w:ascii="Consolas" w:eastAsia="Times New Roman" w:hAnsi="Consolas" w:cs="Times New Roman"/>
+          <w:color w:val="E5C07B"/>
+          <w:sz w:val="21"/>
+          <w:szCs w:val="21"/>
+          <w:lang w:eastAsia="vi-VN"/>
+        </w:rPr>
+        <w:t>Solution</w:t>
+      </w:r>
+      <w:r>
+        <w:rPr>
+          <w:rFonts w:ascii="Consolas" w:eastAsia="Times New Roman" w:hAnsi="Consolas" w:cs="Times New Roman"/>
+          <w:color w:val="ABB2BF"/>
+          <w:sz w:val="21"/>
+          <w:szCs w:val="21"/>
+          <w:lang w:eastAsia="vi-VN"/>
+        </w:rPr>
+        <w:t xml:space="preserve"> {</w:t>
+      </w:r>
+    </w:p>
+    <w:p>
+      <w:pPr>
+        <w:shd w:val="clear" w:color="auto" w:fill="282C34"/>
+        <w:spacing w:after="0" w:line="285" w:lineRule="atLeast"/>
+        <w:rPr>
+          <w:rFonts w:ascii="Consolas" w:eastAsia="Times New Roman" w:hAnsi="Consolas" w:cs="Times New Roman"/>
+          <w:color w:val="ABB2BF"/>
+          <w:sz w:val="21"/>
+          <w:szCs w:val="21"/>
+          <w:lang w:eastAsia="vi-VN"/>
+        </w:rPr>
+      </w:pPr>
+      <w:r>
+        <w:rPr>
+          <w:rFonts w:ascii="Consolas" w:eastAsia="Times New Roman" w:hAnsi="Consolas" w:cs="Times New Roman"/>
+          <w:color w:val="C678DD"/>
+          <w:sz w:val="21"/>
+          <w:szCs w:val="21"/>
+          <w:lang w:eastAsia="vi-VN"/>
+        </w:rPr>
+        <w:t>public:</w:t>
+      </w:r>
+    </w:p>
+    <w:p>
+      <w:pPr>
+        <w:shd w:val="clear" w:color="auto" w:fill="282C34"/>
+        <w:spacing w:after="0" w:line="285" w:lineRule="atLeast"/>
+        <w:rPr>
+          <w:rFonts w:ascii="Consolas" w:eastAsia="Times New Roman" w:hAnsi="Consolas" w:cs="Times New Roman"/>
+          <w:color w:val="ABB2BF"/>
+          <w:sz w:val="21"/>
+          <w:szCs w:val="21"/>
+          <w:lang w:eastAsia="vi-VN"/>
+        </w:rPr>
+      </w:pPr>
+      <w:r>
+        <w:rPr>
+          <w:rFonts w:ascii="Consolas" w:eastAsia="Times New Roman" w:hAnsi="Consolas" w:cs="Times New Roman"/>
+          <w:color w:val="ABB2BF"/>
+          <w:sz w:val="21"/>
+          <w:szCs w:val="21"/>
+          <w:lang w:eastAsia="vi-VN"/>
+        </w:rPr>
+        <w:t xml:space="preserve">    </w:t>
+      </w:r>
+      <w:r>
+        <w:rPr>
+          <w:rFonts w:ascii="Consolas" w:eastAsia="Times New Roman" w:hAnsi="Consolas" w:cs="Times New Roman"/>
+          <w:color w:val="C678DD"/>
+          <w:sz w:val="21"/>
+          <w:szCs w:val="21"/>
+          <w:lang w:eastAsia="vi-VN"/>
+        </w:rPr>
+        <w:t>int</w:t>
+      </w:r>
+      <w:r>
+        <w:rPr>
+          <w:rFonts w:ascii="Consolas" w:eastAsia="Times New Roman" w:hAnsi="Consolas" w:cs="Times New Roman"/>
+          <w:color w:val="ABB2BF"/>
+          <w:sz w:val="21"/>
+          <w:szCs w:val="21"/>
+          <w:lang w:eastAsia="vi-VN"/>
+        </w:rPr>
+        <w:t xml:space="preserve"> </w:t>
+      </w:r>
+      <w:r>
+        <w:rPr>
+          <w:rFonts w:ascii="Consolas" w:eastAsia="Times New Roman" w:hAnsi="Consolas" w:cs="Times New Roman"/>
+          <w:color w:val="61AFEF"/>
+          <w:sz w:val="21"/>
+          <w:szCs w:val="21"/>
+          <w:lang w:eastAsia="vi-VN"/>
+        </w:rPr>
+        <w:t>orangesRotting</w:t>
+      </w:r>
+      <w:r>
+        <w:rPr>
+          <w:rFonts w:ascii="Consolas" w:eastAsia="Times New Roman" w:hAnsi="Consolas" w:cs="Times New Roman"/>
+          <w:color w:val="ABB2BF"/>
+          <w:sz w:val="21"/>
+          <w:szCs w:val="21"/>
+          <w:lang w:eastAsia="vi-VN"/>
+        </w:rPr>
+        <w:t>(</w:t>
+      </w:r>
+      <w:r>
+        <w:rPr>
+          <w:rFonts w:ascii="Consolas" w:eastAsia="Times New Roman" w:hAnsi="Consolas" w:cs="Times New Roman"/>
+          <w:color w:val="E5C07B"/>
+          <w:sz w:val="21"/>
+          <w:szCs w:val="21"/>
+          <w:lang w:eastAsia="vi-VN"/>
+        </w:rPr>
+        <w:t>vector</w:t>
+      </w:r>
+      <w:r>
+        <w:rPr>
+          <w:rFonts w:ascii="Consolas" w:eastAsia="Times New Roman" w:hAnsi="Consolas" w:cs="Times New Roman"/>
+          <w:color w:val="ABB2BF"/>
+          <w:sz w:val="21"/>
+          <w:szCs w:val="21"/>
+          <w:lang w:eastAsia="vi-VN"/>
+        </w:rPr>
+        <w:t>&lt;</w:t>
+      </w:r>
+      <w:r>
+        <w:rPr>
+          <w:rFonts w:ascii="Consolas" w:eastAsia="Times New Roman" w:hAnsi="Consolas" w:cs="Times New Roman"/>
+          <w:color w:val="E5C07B"/>
+          <w:sz w:val="21"/>
+          <w:szCs w:val="21"/>
+          <w:lang w:eastAsia="vi-VN"/>
+        </w:rPr>
+        <w:t>vector</w:t>
+      </w:r>
+      <w:r>
+        <w:rPr>
+          <w:rFonts w:ascii="Consolas" w:eastAsia="Times New Roman" w:hAnsi="Consolas" w:cs="Times New Roman"/>
+          <w:color w:val="ABB2BF"/>
+          <w:sz w:val="21"/>
+          <w:szCs w:val="21"/>
+          <w:lang w:eastAsia="vi-VN"/>
+        </w:rPr>
+        <w:t>&lt;</w:t>
+      </w:r>
+      <w:r>
+        <w:rPr>
+          <w:rFonts w:ascii="Consolas" w:eastAsia="Times New Roman" w:hAnsi="Consolas" w:cs="Times New Roman"/>
+          <w:color w:val="C678DD"/>
+          <w:sz w:val="21"/>
+          <w:szCs w:val="21"/>
+          <w:lang w:eastAsia="vi-VN"/>
+        </w:rPr>
+        <w:t>int</w:t>
+      </w:r>
+      <w:r>
+        <w:rPr>
+          <w:rFonts w:ascii="Consolas" w:eastAsia="Times New Roman" w:hAnsi="Consolas" w:cs="Times New Roman"/>
+          <w:color w:val="ABB2BF"/>
+          <w:sz w:val="21"/>
+          <w:szCs w:val="21"/>
+          <w:lang w:eastAsia="vi-VN"/>
+        </w:rPr>
+        <w:t>&gt;&gt;</w:t>
+      </w:r>
+      <w:r>
+        <w:rPr>
+          <w:rFonts w:ascii="Consolas" w:eastAsia="Times New Roman" w:hAnsi="Consolas" w:cs="Times New Roman"/>
+          <w:color w:val="C678DD"/>
+          <w:sz w:val="21"/>
+          <w:szCs w:val="21"/>
+          <w:lang w:eastAsia="vi-VN"/>
+        </w:rPr>
+        <w:t>&amp;</w:t>
+      </w:r>
+      <w:r>
+        <w:rPr>
+          <w:rFonts w:ascii="Consolas" w:eastAsia="Times New Roman" w:hAnsi="Consolas" w:cs="Times New Roman"/>
+          <w:color w:val="ABB2BF"/>
+          <w:sz w:val="21"/>
+          <w:szCs w:val="21"/>
+          <w:lang w:eastAsia="vi-VN"/>
+        </w:rPr>
+        <w:t xml:space="preserve"> </w:t>
+      </w:r>
+      <w:r>
+        <w:rPr>
+          <w:rFonts w:ascii="Consolas" w:eastAsia="Times New Roman" w:hAnsi="Consolas" w:cs="Times New Roman"/>
+          <w:i/>
+          <w:iCs/>
+          <w:color w:val="E06C75"/>
+          <w:sz w:val="21"/>
+          <w:szCs w:val="21"/>
+          <w:lang w:eastAsia="vi-VN"/>
+        </w:rPr>
+        <w:t>grid</w:t>
+      </w:r>
+      <w:r>
+        <w:rPr>
+          <w:rFonts w:ascii="Consolas" w:eastAsia="Times New Roman" w:hAnsi="Consolas" w:cs="Times New Roman"/>
+          <w:color w:val="ABB2BF"/>
+          <w:sz w:val="21"/>
+          <w:szCs w:val="21"/>
+          <w:lang w:eastAsia="vi-VN"/>
+        </w:rPr>
+        <w:t>) {</w:t>
+      </w:r>
+    </w:p>
+    <w:p>
+      <w:pPr>
+        <w:shd w:val="clear" w:color="auto" w:fill="282C34"/>
+        <w:spacing w:after="0" w:line="285" w:lineRule="atLeast"/>
+        <w:rPr>
+          <w:rFonts w:ascii="Consolas" w:eastAsia="Times New Roman" w:hAnsi="Consolas" w:cs="Times New Roman"/>
+          <w:color w:val="ABB2BF"/>
+          <w:sz w:val="21"/>
+          <w:szCs w:val="21"/>
+          <w:lang w:eastAsia="vi-VN"/>
+        </w:rPr>
+      </w:pPr>
+      <w:r>
+        <w:rPr>
+          <w:rFonts w:ascii="Consolas" w:eastAsia="Times New Roman" w:hAnsi="Consolas" w:cs="Times New Roman"/>
+          <w:color w:val="ABB2BF"/>
+          <w:sz w:val="21"/>
+          <w:szCs w:val="21"/>
+          <w:lang w:eastAsia="vi-VN"/>
+        </w:rPr>
+        <w:t xml:space="preserve">        </w:t>
+      </w:r>
+      <w:r>
+        <w:rPr>
+          <w:rFonts w:ascii="Consolas" w:eastAsia="Times New Roman" w:hAnsi="Consolas" w:cs="Times New Roman"/>
+          <w:color w:val="C678DD"/>
+          <w:sz w:val="21"/>
+          <w:szCs w:val="21"/>
+          <w:lang w:eastAsia="vi-VN"/>
+        </w:rPr>
+        <w:t>int</w:t>
+      </w:r>
+      <w:r>
+        <w:rPr>
+          <w:rFonts w:ascii="Consolas" w:eastAsia="Times New Roman" w:hAnsi="Consolas" w:cs="Times New Roman"/>
+          <w:color w:val="ABB2BF"/>
+          <w:sz w:val="21"/>
+          <w:szCs w:val="21"/>
+          <w:lang w:eastAsia="vi-VN"/>
+        </w:rPr>
+        <w:t xml:space="preserve"> </w:t>
+      </w:r>
+      <w:r>
+        <w:rPr>
+          <w:rFonts w:ascii="Consolas" w:eastAsia="Times New Roman" w:hAnsi="Consolas" w:cs="Times New Roman"/>
+          <w:color w:val="E06C75"/>
+          <w:sz w:val="21"/>
+          <w:szCs w:val="21"/>
+          <w:lang w:eastAsia="vi-VN"/>
+        </w:rPr>
+        <w:t>n</w:t>
+      </w:r>
+      <w:r>
+        <w:rPr>
+          <w:rFonts w:ascii="Consolas" w:eastAsia="Times New Roman" w:hAnsi="Consolas" w:cs="Times New Roman"/>
+          <w:color w:val="ABB2BF"/>
+          <w:sz w:val="21"/>
+          <w:szCs w:val="21"/>
+          <w:lang w:eastAsia="vi-VN"/>
+        </w:rPr>
+        <w:t xml:space="preserve"> </w:t>
+      </w:r>
+      <w:r>
+        <w:rPr>
+          <w:rFonts w:ascii="Consolas" w:eastAsia="Times New Roman" w:hAnsi="Consolas" w:cs="Times New Roman"/>
+          <w:color w:val="C678DD"/>
+          <w:sz w:val="21"/>
+          <w:szCs w:val="21"/>
+          <w:lang w:eastAsia="vi-VN"/>
+        </w:rPr>
+        <w:t>=</w:t>
+      </w:r>
+      <w:r>
+        <w:rPr>
+          <w:rFonts w:ascii="Consolas" w:eastAsia="Times New Roman" w:hAnsi="Consolas" w:cs="Times New Roman"/>
+          <w:color w:val="ABB2BF"/>
+          <w:sz w:val="21"/>
+          <w:szCs w:val="21"/>
+          <w:lang w:eastAsia="vi-VN"/>
+        </w:rPr>
+        <w:t xml:space="preserve"> (</w:t>
+      </w:r>
+      <w:r>
+        <w:rPr>
+          <w:rFonts w:ascii="Consolas" w:eastAsia="Times New Roman" w:hAnsi="Consolas" w:cs="Times New Roman"/>
+          <w:color w:val="C678DD"/>
+          <w:sz w:val="21"/>
+          <w:szCs w:val="21"/>
+          <w:lang w:eastAsia="vi-VN"/>
+        </w:rPr>
+        <w:t>int</w:t>
+      </w:r>
+      <w:r>
+        <w:rPr>
+          <w:rFonts w:ascii="Consolas" w:eastAsia="Times New Roman" w:hAnsi="Consolas" w:cs="Times New Roman"/>
+          <w:color w:val="ABB2BF"/>
+          <w:sz w:val="21"/>
+          <w:szCs w:val="21"/>
+          <w:lang w:eastAsia="vi-VN"/>
+        </w:rPr>
+        <w:t>)</w:t>
+      </w:r>
+      <w:r>
+        <w:rPr>
+          <w:rFonts w:ascii="Consolas" w:eastAsia="Times New Roman" w:hAnsi="Consolas" w:cs="Times New Roman"/>
+          <w:i/>
+          <w:iCs/>
+          <w:color w:val="E06C75"/>
+          <w:sz w:val="21"/>
+          <w:szCs w:val="21"/>
+          <w:lang w:eastAsia="vi-VN"/>
+        </w:rPr>
+        <w:t>grid</w:t>
+      </w:r>
+      <w:r>
+        <w:rPr>
+          <w:rFonts w:ascii="Consolas" w:eastAsia="Times New Roman" w:hAnsi="Consolas" w:cs="Times New Roman"/>
+          <w:color w:val="ABB2BF"/>
+          <w:sz w:val="21"/>
+          <w:szCs w:val="21"/>
+          <w:lang w:eastAsia="vi-VN"/>
+        </w:rPr>
+        <w:t>.</w:t>
+      </w:r>
+      <w:r>
+        <w:rPr>
+          <w:rFonts w:ascii="Consolas" w:eastAsia="Times New Roman" w:hAnsi="Consolas" w:cs="Times New Roman"/>
+          <w:color w:val="61AFEF"/>
+          <w:sz w:val="21"/>
+          <w:szCs w:val="21"/>
+          <w:lang w:eastAsia="vi-VN"/>
+        </w:rPr>
+        <w:t>size</w:t>
+      </w:r>
+      <w:r>
+        <w:rPr>
+          <w:rFonts w:ascii="Consolas" w:eastAsia="Times New Roman" w:hAnsi="Consolas" w:cs="Times New Roman"/>
+          <w:color w:val="ABB2BF"/>
+          <w:sz w:val="21"/>
+          <w:szCs w:val="21"/>
+          <w:lang w:eastAsia="vi-VN"/>
+        </w:rPr>
+        <w:t>();</w:t>
+      </w:r>
+    </w:p>
+    <w:p>
+      <w:pPr>
+        <w:shd w:val="clear" w:color="auto" w:fill="282C34"/>
+        <w:spacing w:after="0" w:line="285" w:lineRule="atLeast"/>
+        <w:rPr>
+          <w:rFonts w:ascii="Consolas" w:eastAsia="Times New Roman" w:hAnsi="Consolas" w:cs="Times New Roman"/>
+          <w:color w:val="ABB2BF"/>
+          <w:sz w:val="21"/>
+          <w:szCs w:val="21"/>
+          <w:lang w:eastAsia="vi-VN"/>
+        </w:rPr>
+      </w:pPr>
+      <w:r>
+        <w:rPr>
+          <w:rFonts w:ascii="Consolas" w:eastAsia="Times New Roman" w:hAnsi="Consolas" w:cs="Times New Roman"/>
+          <w:color w:val="ABB2BF"/>
+          <w:sz w:val="21"/>
+          <w:szCs w:val="21"/>
+          <w:lang w:eastAsia="vi-VN"/>
+        </w:rPr>
+        <w:t xml:space="preserve">        </w:t>
+      </w:r>
+      <w:r>
+        <w:rPr>
+          <w:rFonts w:ascii="Consolas" w:eastAsia="Times New Roman" w:hAnsi="Consolas" w:cs="Times New Roman"/>
+          <w:color w:val="C678DD"/>
+          <w:sz w:val="21"/>
+          <w:szCs w:val="21"/>
+          <w:lang w:eastAsia="vi-VN"/>
+        </w:rPr>
+        <w:t>int</w:t>
+      </w:r>
+      <w:r>
+        <w:rPr>
+          <w:rFonts w:ascii="Consolas" w:eastAsia="Times New Roman" w:hAnsi="Consolas" w:cs="Times New Roman"/>
+          <w:color w:val="ABB2BF"/>
+          <w:sz w:val="21"/>
+          <w:szCs w:val="21"/>
+          <w:lang w:eastAsia="vi-VN"/>
+        </w:rPr>
+        <w:t xml:space="preserve"> </w:t>
+      </w:r>
+      <w:r>
+        <w:rPr>
+          <w:rFonts w:ascii="Consolas" w:eastAsia="Times New Roman" w:hAnsi="Consolas" w:cs="Times New Roman"/>
+          <w:color w:val="E06C75"/>
+          <w:sz w:val="21"/>
+          <w:szCs w:val="21"/>
+          <w:lang w:eastAsia="vi-VN"/>
+        </w:rPr>
+        <w:t>m</w:t>
+      </w:r>
+      <w:r>
+        <w:rPr>
+          <w:rFonts w:ascii="Consolas" w:eastAsia="Times New Roman" w:hAnsi="Consolas" w:cs="Times New Roman"/>
+          <w:color w:val="ABB2BF"/>
+          <w:sz w:val="21"/>
+          <w:szCs w:val="21"/>
+          <w:lang w:eastAsia="vi-VN"/>
+        </w:rPr>
+        <w:t xml:space="preserve"> </w:t>
+      </w:r>
+      <w:r>
+        <w:rPr>
+          <w:rFonts w:ascii="Consolas" w:eastAsia="Times New Roman" w:hAnsi="Consolas" w:cs="Times New Roman"/>
+          <w:color w:val="C678DD"/>
+          <w:sz w:val="21"/>
+          <w:szCs w:val="21"/>
+          <w:lang w:eastAsia="vi-VN"/>
+        </w:rPr>
+        <w:t>=</w:t>
+      </w:r>
+      <w:r>
+        <w:rPr>
+          <w:rFonts w:ascii="Consolas" w:eastAsia="Times New Roman" w:hAnsi="Consolas" w:cs="Times New Roman"/>
+          <w:color w:val="ABB2BF"/>
+          <w:sz w:val="21"/>
+          <w:szCs w:val="21"/>
+          <w:lang w:eastAsia="vi-VN"/>
+        </w:rPr>
+        <w:t xml:space="preserve"> </w:t>
+      </w:r>
+      <w:r>
+        <w:rPr>
+          <w:rFonts w:ascii="Consolas" w:eastAsia="Times New Roman" w:hAnsi="Consolas" w:cs="Times New Roman"/>
+          <w:i/>
+          <w:iCs/>
+          <w:color w:val="E06C75"/>
+          <w:sz w:val="21"/>
+          <w:szCs w:val="21"/>
+          <w:lang w:eastAsia="vi-VN"/>
+        </w:rPr>
+        <w:t>grid</w:t>
+      </w:r>
+      <w:r>
+        <w:rPr>
+          <w:rFonts w:ascii="Consolas" w:eastAsia="Times New Roman" w:hAnsi="Consolas" w:cs="Times New Roman"/>
+          <w:color w:val="ABB2BF"/>
+          <w:sz w:val="21"/>
+          <w:szCs w:val="21"/>
+          <w:lang w:eastAsia="vi-VN"/>
+        </w:rPr>
+        <w:t>.</w:t>
+      </w:r>
+      <w:r>
+        <w:rPr>
+          <w:rFonts w:ascii="Consolas" w:eastAsia="Times New Roman" w:hAnsi="Consolas" w:cs="Times New Roman"/>
+          <w:color w:val="61AFEF"/>
+          <w:sz w:val="21"/>
+          <w:szCs w:val="21"/>
+          <w:lang w:eastAsia="vi-VN"/>
+        </w:rPr>
+        <w:t>empty</w:t>
+      </w:r>
+      <w:r>
+        <w:rPr>
+          <w:rFonts w:ascii="Consolas" w:eastAsia="Times New Roman" w:hAnsi="Consolas" w:cs="Times New Roman"/>
+          <w:color w:val="ABB2BF"/>
+          <w:sz w:val="21"/>
+          <w:szCs w:val="21"/>
+          <w:lang w:eastAsia="vi-VN"/>
+        </w:rPr>
+        <w:t xml:space="preserve">() </w:t>
+      </w:r>
+      <w:r>
+        <w:rPr>
+          <w:rFonts w:ascii="Consolas" w:eastAsia="Times New Roman" w:hAnsi="Consolas" w:cs="Times New Roman"/>
+          <w:color w:val="C678DD"/>
+          <w:sz w:val="21"/>
+          <w:szCs w:val="21"/>
+          <w:lang w:eastAsia="vi-VN"/>
+        </w:rPr>
+        <w:t>?</w:t>
+      </w:r>
+      <w:r>
+        <w:rPr>
+          <w:rFonts w:ascii="Consolas" w:eastAsia="Times New Roman" w:hAnsi="Consolas" w:cs="Times New Roman"/>
+          <w:color w:val="ABB2BF"/>
+          <w:sz w:val="21"/>
+          <w:szCs w:val="21"/>
+          <w:lang w:eastAsia="vi-VN"/>
+        </w:rPr>
+        <w:t xml:space="preserve"> </w:t>
+      </w:r>
+      <w:r>
+        <w:rPr>
+          <w:rFonts w:ascii="Consolas" w:eastAsia="Times New Roman" w:hAnsi="Consolas" w:cs="Times New Roman"/>
+          <w:color w:val="D19A66"/>
+          <w:sz w:val="21"/>
+          <w:szCs w:val="21"/>
+          <w:lang w:eastAsia="vi-VN"/>
+        </w:rPr>
+        <w:t>0</w:t>
+      </w:r>
+      <w:r>
+        <w:rPr>
+          <w:rFonts w:ascii="Consolas" w:eastAsia="Times New Roman" w:hAnsi="Consolas" w:cs="Times New Roman"/>
+          <w:color w:val="C678DD"/>
+          <w:sz w:val="21"/>
+          <w:szCs w:val="21"/>
+          <w:lang w:eastAsia="vi-VN"/>
+        </w:rPr>
+        <w:t>:</w:t>
+      </w:r>
+      <w:r>
+        <w:rPr>
+          <w:rFonts w:ascii="Consolas" w:eastAsia="Times New Roman" w:hAnsi="Consolas" w:cs="Times New Roman"/>
+          <w:color w:val="ABB2BF"/>
+          <w:sz w:val="21"/>
+          <w:szCs w:val="21"/>
+          <w:lang w:eastAsia="vi-VN"/>
+        </w:rPr>
+        <w:t xml:space="preserve"> (</w:t>
+      </w:r>
+      <w:r>
+        <w:rPr>
+          <w:rFonts w:ascii="Consolas" w:eastAsia="Times New Roman" w:hAnsi="Consolas" w:cs="Times New Roman"/>
+          <w:color w:val="C678DD"/>
+          <w:sz w:val="21"/>
+          <w:szCs w:val="21"/>
+          <w:lang w:eastAsia="vi-VN"/>
+        </w:rPr>
+        <w:t>int</w:t>
+      </w:r>
+      <w:r>
+        <w:rPr>
+          <w:rFonts w:ascii="Consolas" w:eastAsia="Times New Roman" w:hAnsi="Consolas" w:cs="Times New Roman"/>
+          <w:color w:val="ABB2BF"/>
+          <w:sz w:val="21"/>
+          <w:szCs w:val="21"/>
+          <w:lang w:eastAsia="vi-VN"/>
+        </w:rPr>
+        <w:t>)</w:t>
+      </w:r>
+      <w:r>
+        <w:rPr>
+          <w:rFonts w:ascii="Consolas" w:eastAsia="Times New Roman" w:hAnsi="Consolas" w:cs="Times New Roman"/>
+          <w:i/>
+          <w:iCs/>
+          <w:color w:val="E06C75"/>
+          <w:sz w:val="21"/>
+          <w:szCs w:val="21"/>
+          <w:lang w:eastAsia="vi-VN"/>
+        </w:rPr>
+        <w:t>grid</w:t>
+      </w:r>
+      <w:r>
+        <w:rPr>
+          <w:rFonts w:ascii="Consolas" w:eastAsia="Times New Roman" w:hAnsi="Consolas" w:cs="Times New Roman"/>
+          <w:color w:val="C678DD"/>
+          <w:sz w:val="21"/>
+          <w:szCs w:val="21"/>
+          <w:lang w:eastAsia="vi-VN"/>
+        </w:rPr>
+        <w:t>[</w:t>
+      </w:r>
+      <w:r>
+        <w:rPr>
+          <w:rFonts w:ascii="Consolas" w:eastAsia="Times New Roman" w:hAnsi="Consolas" w:cs="Times New Roman"/>
+          <w:color w:val="D19A66"/>
+          <w:sz w:val="21"/>
+          <w:szCs w:val="21"/>
+          <w:lang w:eastAsia="vi-VN"/>
+        </w:rPr>
+        <w:t>0</w:t>
+      </w:r>
+      <w:r>
+        <w:rPr>
+          <w:rFonts w:ascii="Consolas" w:eastAsia="Times New Roman" w:hAnsi="Consolas" w:cs="Times New Roman"/>
+          <w:color w:val="C678DD"/>
+          <w:sz w:val="21"/>
+          <w:szCs w:val="21"/>
+          <w:lang w:eastAsia="vi-VN"/>
+        </w:rPr>
+        <w:t>]</w:t>
+      </w:r>
+      <w:r>
+        <w:rPr>
+          <w:rFonts w:ascii="Consolas" w:eastAsia="Times New Roman" w:hAnsi="Consolas" w:cs="Times New Roman"/>
+          <w:color w:val="ABB2BF"/>
+          <w:sz w:val="21"/>
+          <w:szCs w:val="21"/>
+          <w:lang w:eastAsia="vi-VN"/>
+        </w:rPr>
+        <w:t>.</w:t>
+      </w:r>
+      <w:r>
+        <w:rPr>
+          <w:rFonts w:ascii="Consolas" w:eastAsia="Times New Roman" w:hAnsi="Consolas" w:cs="Times New Roman"/>
+          <w:color w:val="61AFEF"/>
+          <w:sz w:val="21"/>
+          <w:szCs w:val="21"/>
+          <w:lang w:eastAsia="vi-VN"/>
+        </w:rPr>
+        <w:t>size</w:t>
+      </w:r>
+      <w:r>
+        <w:rPr>
+          <w:rFonts w:ascii="Consolas" w:eastAsia="Times New Roman" w:hAnsi="Consolas" w:cs="Times New Roman"/>
+          <w:color w:val="ABB2BF"/>
+          <w:sz w:val="21"/>
+          <w:szCs w:val="21"/>
+          <w:lang w:eastAsia="vi-VN"/>
+        </w:rPr>
+        <w:t>();</w:t>
+      </w:r>
+    </w:p>
+    <w:p>
+      <w:pPr>
+        <w:shd w:val="clear" w:color="auto" w:fill="282C34"/>
+        <w:spacing w:after="0" w:line="285" w:lineRule="atLeast"/>
+        <w:rPr>
+          <w:rFonts w:ascii="Consolas" w:eastAsia="Times New Roman" w:hAnsi="Consolas" w:cs="Times New Roman"/>
+          <w:color w:val="ABB2BF"/>
+          <w:sz w:val="21"/>
+          <w:szCs w:val="21"/>
+          <w:lang w:eastAsia="vi-VN"/>
+        </w:rPr>
+      </w:pPr>
+      <w:r>
+        <w:rPr>
+          <w:rFonts w:ascii="Consolas" w:eastAsia="Times New Roman" w:hAnsi="Consolas" w:cs="Times New Roman"/>
+          <w:color w:val="ABB2BF"/>
+          <w:sz w:val="21"/>
+          <w:szCs w:val="21"/>
+          <w:lang w:eastAsia="vi-VN"/>
+        </w:rPr>
+        <w:t xml:space="preserve">        </w:t>
+      </w:r>
+      <w:r>
+        <w:rPr>
+          <w:rFonts w:ascii="Consolas" w:eastAsia="Times New Roman" w:hAnsi="Consolas" w:cs="Times New Roman"/>
+          <w:color w:val="C678DD"/>
+          <w:sz w:val="21"/>
+          <w:szCs w:val="21"/>
+          <w:lang w:eastAsia="vi-VN"/>
+        </w:rPr>
+        <w:t>int</w:t>
+      </w:r>
+      <w:r>
+        <w:rPr>
+          <w:rFonts w:ascii="Consolas" w:eastAsia="Times New Roman" w:hAnsi="Consolas" w:cs="Times New Roman"/>
+          <w:color w:val="ABB2BF"/>
+          <w:sz w:val="21"/>
+          <w:szCs w:val="21"/>
+          <w:lang w:eastAsia="vi-VN"/>
+        </w:rPr>
+        <w:t xml:space="preserve"> </w:t>
+      </w:r>
+      <w:r>
+        <w:rPr>
+          <w:rFonts w:ascii="Consolas" w:eastAsia="Times New Roman" w:hAnsi="Consolas" w:cs="Times New Roman"/>
+          <w:color w:val="E06C75"/>
+          <w:sz w:val="21"/>
+          <w:szCs w:val="21"/>
+          <w:lang w:eastAsia="vi-VN"/>
+        </w:rPr>
+        <w:t>fruit</w:t>
+      </w:r>
+      <w:r>
+        <w:rPr>
+          <w:rFonts w:ascii="Consolas" w:eastAsia="Times New Roman" w:hAnsi="Consolas" w:cs="Times New Roman"/>
+          <w:color w:val="ABB2BF"/>
+          <w:sz w:val="21"/>
+          <w:szCs w:val="21"/>
+          <w:lang w:eastAsia="vi-VN"/>
+        </w:rPr>
+        <w:t xml:space="preserve"> </w:t>
+      </w:r>
+      <w:r>
+        <w:rPr>
+          <w:rFonts w:ascii="Consolas" w:eastAsia="Times New Roman" w:hAnsi="Consolas" w:cs="Times New Roman"/>
+          <w:color w:val="C678DD"/>
+          <w:sz w:val="21"/>
+          <w:szCs w:val="21"/>
+          <w:lang w:eastAsia="vi-VN"/>
+        </w:rPr>
+        <w:t>=</w:t>
+      </w:r>
+      <w:r>
+        <w:rPr>
+          <w:rFonts w:ascii="Consolas" w:eastAsia="Times New Roman" w:hAnsi="Consolas" w:cs="Times New Roman"/>
+          <w:color w:val="ABB2BF"/>
+          <w:sz w:val="21"/>
+          <w:szCs w:val="21"/>
+          <w:lang w:eastAsia="vi-VN"/>
+        </w:rPr>
+        <w:t xml:space="preserve"> </w:t>
+      </w:r>
+      <w:r>
+        <w:rPr>
+          <w:rFonts w:ascii="Consolas" w:eastAsia="Times New Roman" w:hAnsi="Consolas" w:cs="Times New Roman"/>
+          <w:color w:val="D19A66"/>
+          <w:sz w:val="21"/>
+          <w:szCs w:val="21"/>
+          <w:lang w:eastAsia="vi-VN"/>
+        </w:rPr>
+        <w:t>0</w:t>
+      </w:r>
+      <w:r>
+        <w:rPr>
+          <w:rFonts w:ascii="Consolas" w:eastAsia="Times New Roman" w:hAnsi="Consolas" w:cs="Times New Roman"/>
+          <w:color w:val="ABB2BF"/>
+          <w:sz w:val="21"/>
+          <w:szCs w:val="21"/>
+          <w:lang w:eastAsia="vi-VN"/>
+        </w:rPr>
+        <w:t>;</w:t>
+      </w:r>
+    </w:p>
+    <w:p>
+      <w:pPr>
+        <w:shd w:val="clear" w:color="auto" w:fill="282C34"/>
+        <w:spacing w:after="0" w:line="285" w:lineRule="atLeast"/>
+        <w:rPr>
+          <w:rFonts w:ascii="Consolas" w:eastAsia="Times New Roman" w:hAnsi="Consolas" w:cs="Times New Roman"/>
+          <w:color w:val="ABB2BF"/>
+          <w:sz w:val="21"/>
+          <w:szCs w:val="21"/>
+          <w:lang w:eastAsia="vi-VN"/>
+        </w:rPr>
+      </w:pPr>
+      <w:r>
+        <w:rPr>
+          <w:rFonts w:ascii="Consolas" w:eastAsia="Times New Roman" w:hAnsi="Consolas" w:cs="Times New Roman"/>
+          <w:color w:val="ABB2BF"/>
+          <w:sz w:val="21"/>
+          <w:szCs w:val="21"/>
+          <w:lang w:eastAsia="vi-VN"/>
+        </w:rPr>
+        <w:t xml:space="preserve">        </w:t>
+      </w:r>
+      <w:r>
+        <w:rPr>
+          <w:rFonts w:ascii="Consolas" w:eastAsia="Times New Roman" w:hAnsi="Consolas" w:cs="Times New Roman"/>
+          <w:color w:val="C678DD"/>
+          <w:sz w:val="21"/>
+          <w:szCs w:val="21"/>
+          <w:lang w:eastAsia="vi-VN"/>
+        </w:rPr>
+        <w:t>int</w:t>
+      </w:r>
+      <w:r>
+        <w:rPr>
+          <w:rFonts w:ascii="Consolas" w:eastAsia="Times New Roman" w:hAnsi="Consolas" w:cs="Times New Roman"/>
+          <w:color w:val="ABB2BF"/>
+          <w:sz w:val="21"/>
+          <w:szCs w:val="21"/>
+          <w:lang w:eastAsia="vi-VN"/>
+        </w:rPr>
+        <w:t xml:space="preserve"> </w:t>
+      </w:r>
+      <w:r>
+        <w:rPr>
+          <w:rFonts w:ascii="Consolas" w:eastAsia="Times New Roman" w:hAnsi="Consolas" w:cs="Times New Roman"/>
+          <w:color w:val="E06C75"/>
+          <w:sz w:val="21"/>
+          <w:szCs w:val="21"/>
+          <w:lang w:eastAsia="vi-VN"/>
+        </w:rPr>
+        <w:t>minutes</w:t>
+      </w:r>
+      <w:r>
+        <w:rPr>
+          <w:rFonts w:ascii="Consolas" w:eastAsia="Times New Roman" w:hAnsi="Consolas" w:cs="Times New Roman"/>
+          <w:color w:val="ABB2BF"/>
+          <w:sz w:val="21"/>
+          <w:szCs w:val="21"/>
+          <w:lang w:eastAsia="vi-VN"/>
+        </w:rPr>
+        <w:t xml:space="preserve"> </w:t>
+      </w:r>
+      <w:r>
+        <w:rPr>
+          <w:rFonts w:ascii="Consolas" w:eastAsia="Times New Roman" w:hAnsi="Consolas" w:cs="Times New Roman"/>
+          <w:color w:val="C678DD"/>
+          <w:sz w:val="21"/>
+          <w:szCs w:val="21"/>
+          <w:lang w:eastAsia="vi-VN"/>
+        </w:rPr>
+        <w:t>=</w:t>
+      </w:r>
+      <w:r>
+        <w:rPr>
+          <w:rFonts w:ascii="Consolas" w:eastAsia="Times New Roman" w:hAnsi="Consolas" w:cs="Times New Roman"/>
+          <w:color w:val="ABB2BF"/>
+          <w:sz w:val="21"/>
+          <w:szCs w:val="21"/>
+          <w:lang w:eastAsia="vi-VN"/>
+        </w:rPr>
+        <w:t xml:space="preserve"> </w:t>
+      </w:r>
+      <w:r>
+        <w:rPr>
+          <w:rFonts w:ascii="Consolas" w:eastAsia="Times New Roman" w:hAnsi="Consolas" w:cs="Times New Roman"/>
+          <w:color w:val="D19A66"/>
+          <w:sz w:val="21"/>
+          <w:szCs w:val="21"/>
+          <w:lang w:eastAsia="vi-VN"/>
+        </w:rPr>
+        <w:t>0</w:t>
+      </w:r>
+      <w:r>
+        <w:rPr>
+          <w:rFonts w:ascii="Consolas" w:eastAsia="Times New Roman" w:hAnsi="Consolas" w:cs="Times New Roman"/>
+          <w:color w:val="ABB2BF"/>
+          <w:sz w:val="21"/>
+          <w:szCs w:val="21"/>
+          <w:lang w:eastAsia="vi-VN"/>
+        </w:rPr>
+        <w:t>;</w:t>
+      </w:r>
+    </w:p>
+    <w:p>
+      <w:pPr>
+        <w:shd w:val="clear" w:color="auto" w:fill="282C34"/>
+        <w:spacing w:after="0" w:line="285" w:lineRule="atLeast"/>
+        <w:rPr>
+          <w:rFonts w:ascii="Consolas" w:eastAsia="Times New Roman" w:hAnsi="Consolas" w:cs="Times New Roman"/>
+          <w:color w:val="ABB2BF"/>
+          <w:sz w:val="21"/>
+          <w:szCs w:val="21"/>
+          <w:lang w:eastAsia="vi-VN"/>
+        </w:rPr>
+      </w:pPr>
+      <w:r>
+        <w:rPr>
+          <w:rFonts w:ascii="Consolas" w:eastAsia="Times New Roman" w:hAnsi="Consolas" w:cs="Times New Roman"/>
+          <w:color w:val="ABB2BF"/>
+          <w:sz w:val="21"/>
+          <w:szCs w:val="21"/>
+          <w:lang w:eastAsia="vi-VN"/>
+        </w:rPr>
+        <w:t xml:space="preserve">        </w:t>
+      </w:r>
+      <w:r>
+        <w:rPr>
+          <w:rFonts w:ascii="Consolas" w:eastAsia="Times New Roman" w:hAnsi="Consolas" w:cs="Times New Roman"/>
+          <w:color w:val="E5C07B"/>
+          <w:sz w:val="21"/>
+          <w:szCs w:val="21"/>
+          <w:lang w:eastAsia="vi-VN"/>
+        </w:rPr>
+        <w:t>queue</w:t>
+      </w:r>
+      <w:r>
+        <w:rPr>
+          <w:rFonts w:ascii="Consolas" w:eastAsia="Times New Roman" w:hAnsi="Consolas" w:cs="Times New Roman"/>
+          <w:color w:val="ABB2BF"/>
+          <w:sz w:val="21"/>
+          <w:szCs w:val="21"/>
+          <w:lang w:eastAsia="vi-VN"/>
+        </w:rPr>
+        <w:t>&lt;</w:t>
+      </w:r>
+      <w:r>
+        <w:rPr>
+          <w:rFonts w:ascii="Consolas" w:eastAsia="Times New Roman" w:hAnsi="Consolas" w:cs="Times New Roman"/>
+          <w:color w:val="E5C07B"/>
+          <w:sz w:val="21"/>
+          <w:szCs w:val="21"/>
+          <w:lang w:eastAsia="vi-VN"/>
+        </w:rPr>
+        <w:t>pair</w:t>
+      </w:r>
+      <w:r>
+        <w:rPr>
+          <w:rFonts w:ascii="Consolas" w:eastAsia="Times New Roman" w:hAnsi="Consolas" w:cs="Times New Roman"/>
+          <w:color w:val="ABB2BF"/>
+          <w:sz w:val="21"/>
+          <w:szCs w:val="21"/>
+          <w:lang w:eastAsia="vi-VN"/>
+        </w:rPr>
+        <w:t>&lt;</w:t>
+      </w:r>
+      <w:r>
+        <w:rPr>
+          <w:rFonts w:ascii="Consolas" w:eastAsia="Times New Roman" w:hAnsi="Consolas" w:cs="Times New Roman"/>
+          <w:color w:val="C678DD"/>
+          <w:sz w:val="21"/>
+          <w:szCs w:val="21"/>
+          <w:lang w:eastAsia="vi-VN"/>
+        </w:rPr>
+        <w:t>int</w:t>
+      </w:r>
+      <w:r>
+        <w:rPr>
+          <w:rFonts w:ascii="Consolas" w:eastAsia="Times New Roman" w:hAnsi="Consolas" w:cs="Times New Roman"/>
+          <w:color w:val="ABB2BF"/>
+          <w:sz w:val="21"/>
+          <w:szCs w:val="21"/>
+          <w:lang w:eastAsia="vi-VN"/>
+        </w:rPr>
+        <w:t xml:space="preserve"> , </w:t>
+      </w:r>
+      <w:r>
+        <w:rPr>
+          <w:rFonts w:ascii="Consolas" w:eastAsia="Times New Roman" w:hAnsi="Consolas" w:cs="Times New Roman"/>
+          <w:color w:val="C678DD"/>
+          <w:sz w:val="21"/>
+          <w:szCs w:val="21"/>
+          <w:lang w:eastAsia="vi-VN"/>
+        </w:rPr>
+        <w:t>int</w:t>
+      </w:r>
+      <w:r>
+        <w:rPr>
+          <w:rFonts w:ascii="Consolas" w:eastAsia="Times New Roman" w:hAnsi="Consolas" w:cs="Times New Roman"/>
+          <w:color w:val="ABB2BF"/>
+          <w:sz w:val="21"/>
+          <w:szCs w:val="21"/>
+          <w:lang w:eastAsia="vi-VN"/>
+        </w:rPr>
+        <w:t xml:space="preserve">&gt;&gt; </w:t>
+      </w:r>
+      <w:r>
+        <w:rPr>
+          <w:rFonts w:ascii="Consolas" w:eastAsia="Times New Roman" w:hAnsi="Consolas" w:cs="Times New Roman"/>
+          <w:color w:val="E06C75"/>
+          <w:sz w:val="21"/>
+          <w:szCs w:val="21"/>
+          <w:lang w:eastAsia="vi-VN"/>
+        </w:rPr>
+        <w:t>pq</w:t>
+      </w:r>
+      <w:r>
+        <w:rPr>
+          <w:rFonts w:ascii="Consolas" w:eastAsia="Times New Roman" w:hAnsi="Consolas" w:cs="Times New Roman"/>
+          <w:color w:val="ABB2BF"/>
+          <w:sz w:val="21"/>
+          <w:szCs w:val="21"/>
+          <w:lang w:eastAsia="vi-VN"/>
+        </w:rPr>
+        <w:t xml:space="preserve">; </w:t>
+      </w:r>
+    </w:p>
+    <w:p>
+      <w:pPr>
+        <w:shd w:val="clear" w:color="auto" w:fill="282C34"/>
+        <w:spacing w:after="0" w:line="285" w:lineRule="atLeast"/>
+        <w:rPr>
+          <w:rFonts w:ascii="Consolas" w:eastAsia="Times New Roman" w:hAnsi="Consolas" w:cs="Times New Roman"/>
+          <w:color w:val="ABB2BF"/>
+          <w:sz w:val="21"/>
+          <w:szCs w:val="21"/>
+          <w:lang w:eastAsia="vi-VN"/>
+        </w:rPr>
+      </w:pPr>
+      <w:r>
+        <w:rPr>
+          <w:rFonts w:ascii="Consolas" w:eastAsia="Times New Roman" w:hAnsi="Consolas" w:cs="Times New Roman"/>
+          <w:color w:val="ABB2BF"/>
+          <w:sz w:val="21"/>
+          <w:szCs w:val="21"/>
+          <w:lang w:eastAsia="vi-VN"/>
+        </w:rPr>
+        <w:t xml:space="preserve">        </w:t>
+      </w:r>
+      <w:r>
+        <w:rPr>
+          <w:rFonts w:ascii="Consolas" w:eastAsia="Times New Roman" w:hAnsi="Consolas" w:cs="Times New Roman"/>
+          <w:color w:val="C678DD"/>
+          <w:sz w:val="21"/>
+          <w:szCs w:val="21"/>
+          <w:lang w:eastAsia="vi-VN"/>
+        </w:rPr>
+        <w:t>for</w:t>
+      </w:r>
+      <w:r>
+        <w:rPr>
+          <w:rFonts w:ascii="Consolas" w:eastAsia="Times New Roman" w:hAnsi="Consolas" w:cs="Times New Roman"/>
+          <w:color w:val="ABB2BF"/>
+          <w:sz w:val="21"/>
+          <w:szCs w:val="21"/>
+          <w:lang w:eastAsia="vi-VN"/>
+        </w:rPr>
+        <w:t>(</w:t>
+      </w:r>
+      <w:r>
+        <w:rPr>
+          <w:rFonts w:ascii="Consolas" w:eastAsia="Times New Roman" w:hAnsi="Consolas" w:cs="Times New Roman"/>
+          <w:color w:val="C678DD"/>
+          <w:sz w:val="21"/>
+          <w:szCs w:val="21"/>
+          <w:lang w:eastAsia="vi-VN"/>
+        </w:rPr>
+        <w:t>int</w:t>
+      </w:r>
+      <w:r>
+        <w:rPr>
+          <w:rFonts w:ascii="Consolas" w:eastAsia="Times New Roman" w:hAnsi="Consolas" w:cs="Times New Roman"/>
+          <w:color w:val="ABB2BF"/>
+          <w:sz w:val="21"/>
+          <w:szCs w:val="21"/>
+          <w:lang w:eastAsia="vi-VN"/>
+        </w:rPr>
+        <w:t xml:space="preserve"> </w:t>
+      </w:r>
+      <w:r>
+        <w:rPr>
+          <w:rFonts w:ascii="Consolas" w:eastAsia="Times New Roman" w:hAnsi="Consolas" w:cs="Times New Roman"/>
+          <w:color w:val="E06C75"/>
+          <w:sz w:val="21"/>
+          <w:szCs w:val="21"/>
+          <w:lang w:eastAsia="vi-VN"/>
+        </w:rPr>
+        <w:t>i</w:t>
+      </w:r>
+      <w:r>
+        <w:rPr>
+          <w:rFonts w:ascii="Consolas" w:eastAsia="Times New Roman" w:hAnsi="Consolas" w:cs="Times New Roman"/>
+          <w:color w:val="C678DD"/>
+          <w:sz w:val="21"/>
+          <w:szCs w:val="21"/>
+          <w:lang w:eastAsia="vi-VN"/>
+        </w:rPr>
+        <w:t>=</w:t>
+      </w:r>
+      <w:r>
+        <w:rPr>
+          <w:rFonts w:ascii="Consolas" w:eastAsia="Times New Roman" w:hAnsi="Consolas" w:cs="Times New Roman"/>
+          <w:color w:val="D19A66"/>
+          <w:sz w:val="21"/>
+          <w:szCs w:val="21"/>
+          <w:lang w:eastAsia="vi-VN"/>
+        </w:rPr>
+        <w:t>0</w:t>
+      </w:r>
+      <w:r>
+        <w:rPr>
+          <w:rFonts w:ascii="Consolas" w:eastAsia="Times New Roman" w:hAnsi="Consolas" w:cs="Times New Roman"/>
+          <w:color w:val="ABB2BF"/>
+          <w:sz w:val="21"/>
+          <w:szCs w:val="21"/>
+          <w:lang w:eastAsia="vi-VN"/>
+        </w:rPr>
+        <w:t xml:space="preserve"> ; </w:t>
+      </w:r>
+      <w:r>
+        <w:rPr>
+          <w:rFonts w:ascii="Consolas" w:eastAsia="Times New Roman" w:hAnsi="Consolas" w:cs="Times New Roman"/>
+          <w:color w:val="E06C75"/>
+          <w:sz w:val="21"/>
+          <w:szCs w:val="21"/>
+          <w:lang w:eastAsia="vi-VN"/>
+        </w:rPr>
+        <w:t>i</w:t>
+      </w:r>
+      <w:r>
+        <w:rPr>
+          <w:rFonts w:ascii="Consolas" w:eastAsia="Times New Roman" w:hAnsi="Consolas" w:cs="Times New Roman"/>
+          <w:color w:val="C678DD"/>
+          <w:sz w:val="21"/>
+          <w:szCs w:val="21"/>
+          <w:lang w:eastAsia="vi-VN"/>
+        </w:rPr>
+        <w:t>&lt;</w:t>
+      </w:r>
+      <w:r>
+        <w:rPr>
+          <w:rFonts w:ascii="Consolas" w:eastAsia="Times New Roman" w:hAnsi="Consolas" w:cs="Times New Roman"/>
+          <w:color w:val="E06C75"/>
+          <w:sz w:val="21"/>
+          <w:szCs w:val="21"/>
+          <w:lang w:eastAsia="vi-VN"/>
+        </w:rPr>
+        <w:t>n</w:t>
+      </w:r>
+      <w:r>
+        <w:rPr>
+          <w:rFonts w:ascii="Consolas" w:eastAsia="Times New Roman" w:hAnsi="Consolas" w:cs="Times New Roman"/>
+          <w:color w:val="ABB2BF"/>
+          <w:sz w:val="21"/>
+          <w:szCs w:val="21"/>
+          <w:lang w:eastAsia="vi-VN"/>
+        </w:rPr>
+        <w:t xml:space="preserve"> ; </w:t>
+      </w:r>
+      <w:r>
+        <w:rPr>
+          <w:rFonts w:ascii="Consolas" w:eastAsia="Times New Roman" w:hAnsi="Consolas" w:cs="Times New Roman"/>
+          <w:color w:val="E06C75"/>
+          <w:sz w:val="21"/>
+          <w:szCs w:val="21"/>
+          <w:lang w:eastAsia="vi-VN"/>
+        </w:rPr>
+        <w:t>i</w:t>
+      </w:r>
+      <w:r>
+        <w:rPr>
+          <w:rFonts w:ascii="Consolas" w:eastAsia="Times New Roman" w:hAnsi="Consolas" w:cs="Times New Roman"/>
+          <w:color w:val="C678DD"/>
+          <w:sz w:val="21"/>
+          <w:szCs w:val="21"/>
+          <w:lang w:eastAsia="vi-VN"/>
+        </w:rPr>
+        <w:t>++</w:t>
+      </w:r>
+      <w:r>
+        <w:rPr>
+          <w:rFonts w:ascii="Consolas" w:eastAsia="Times New Roman" w:hAnsi="Consolas" w:cs="Times New Roman"/>
+          <w:color w:val="ABB2BF"/>
+          <w:sz w:val="21"/>
+          <w:szCs w:val="21"/>
+          <w:lang w:eastAsia="vi-VN"/>
+        </w:rPr>
+        <w:t>)</w:t>
+      </w:r>
+    </w:p>
+    <w:p>
+      <w:pPr>
+        <w:shd w:val="clear" w:color="auto" w:fill="282C34"/>
+        <w:spacing w:after="0" w:line="285" w:lineRule="atLeast"/>
+        <w:rPr>
+          <w:rFonts w:ascii="Consolas" w:eastAsia="Times New Roman" w:hAnsi="Consolas" w:cs="Times New Roman"/>
+          <w:color w:val="ABB2BF"/>
+          <w:sz w:val="21"/>
+          <w:szCs w:val="21"/>
+          <w:lang w:eastAsia="vi-VN"/>
+        </w:rPr>
+      </w:pPr>
+      <w:r>
+        <w:rPr>
+          <w:rFonts w:ascii="Consolas" w:eastAsia="Times New Roman" w:hAnsi="Consolas" w:cs="Times New Roman"/>
+          <w:color w:val="ABB2BF"/>
+          <w:sz w:val="21"/>
+          <w:szCs w:val="21"/>
+          <w:lang w:eastAsia="vi-VN"/>
+        </w:rPr>
+        <w:t xml:space="preserve">            </w:t>
+      </w:r>
+      <w:r>
+        <w:rPr>
+          <w:rFonts w:ascii="Consolas" w:eastAsia="Times New Roman" w:hAnsi="Consolas" w:cs="Times New Roman"/>
+          <w:color w:val="C678DD"/>
+          <w:sz w:val="21"/>
+          <w:szCs w:val="21"/>
+          <w:lang w:eastAsia="vi-VN"/>
+        </w:rPr>
+        <w:t>for</w:t>
+      </w:r>
+      <w:r>
+        <w:rPr>
+          <w:rFonts w:ascii="Consolas" w:eastAsia="Times New Roman" w:hAnsi="Consolas" w:cs="Times New Roman"/>
+          <w:color w:val="ABB2BF"/>
+          <w:sz w:val="21"/>
+          <w:szCs w:val="21"/>
+          <w:lang w:eastAsia="vi-VN"/>
+        </w:rPr>
+        <w:t>(</w:t>
+      </w:r>
+      <w:r>
+        <w:rPr>
+          <w:rFonts w:ascii="Consolas" w:eastAsia="Times New Roman" w:hAnsi="Consolas" w:cs="Times New Roman"/>
+          <w:color w:val="C678DD"/>
+          <w:sz w:val="21"/>
+          <w:szCs w:val="21"/>
+          <w:lang w:eastAsia="vi-VN"/>
+        </w:rPr>
+        <w:t>int</w:t>
+      </w:r>
+      <w:r>
+        <w:rPr>
+          <w:rFonts w:ascii="Consolas" w:eastAsia="Times New Roman" w:hAnsi="Consolas" w:cs="Times New Roman"/>
+          <w:color w:val="ABB2BF"/>
+          <w:sz w:val="21"/>
+          <w:szCs w:val="21"/>
+          <w:lang w:eastAsia="vi-VN"/>
+        </w:rPr>
+        <w:t xml:space="preserve"> </w:t>
+      </w:r>
+      <w:r>
+        <w:rPr>
+          <w:rFonts w:ascii="Consolas" w:eastAsia="Times New Roman" w:hAnsi="Consolas" w:cs="Times New Roman"/>
+          <w:color w:val="E06C75"/>
+          <w:sz w:val="21"/>
+          <w:szCs w:val="21"/>
+          <w:lang w:eastAsia="vi-VN"/>
+        </w:rPr>
+        <w:t>j</w:t>
+      </w:r>
+      <w:r>
+        <w:rPr>
+          <w:rFonts w:ascii="Consolas" w:eastAsia="Times New Roman" w:hAnsi="Consolas" w:cs="Times New Roman"/>
+          <w:color w:val="C678DD"/>
+          <w:sz w:val="21"/>
+          <w:szCs w:val="21"/>
+          <w:lang w:eastAsia="vi-VN"/>
+        </w:rPr>
+        <w:t>=</w:t>
+      </w:r>
+      <w:r>
+        <w:rPr>
+          <w:rFonts w:ascii="Consolas" w:eastAsia="Times New Roman" w:hAnsi="Consolas" w:cs="Times New Roman"/>
+          <w:color w:val="D19A66"/>
+          <w:sz w:val="21"/>
+          <w:szCs w:val="21"/>
+          <w:lang w:eastAsia="vi-VN"/>
+        </w:rPr>
+        <w:t>0</w:t>
+      </w:r>
+      <w:r>
+        <w:rPr>
+          <w:rFonts w:ascii="Consolas" w:eastAsia="Times New Roman" w:hAnsi="Consolas" w:cs="Times New Roman"/>
+          <w:color w:val="ABB2BF"/>
+          <w:sz w:val="21"/>
+          <w:szCs w:val="21"/>
+          <w:lang w:eastAsia="vi-VN"/>
+        </w:rPr>
+        <w:t xml:space="preserve"> ; </w:t>
+      </w:r>
+      <w:r>
+        <w:rPr>
+          <w:rFonts w:ascii="Consolas" w:eastAsia="Times New Roman" w:hAnsi="Consolas" w:cs="Times New Roman"/>
+          <w:color w:val="E06C75"/>
+          <w:sz w:val="21"/>
+          <w:szCs w:val="21"/>
+          <w:lang w:eastAsia="vi-VN"/>
+        </w:rPr>
+        <w:t>j</w:t>
+      </w:r>
+      <w:r>
+        <w:rPr>
+          <w:rFonts w:ascii="Consolas" w:eastAsia="Times New Roman" w:hAnsi="Consolas" w:cs="Times New Roman"/>
+          <w:color w:val="C678DD"/>
+          <w:sz w:val="21"/>
+          <w:szCs w:val="21"/>
+          <w:lang w:eastAsia="vi-VN"/>
+        </w:rPr>
+        <w:t>&lt;</w:t>
+      </w:r>
+      <w:r>
+        <w:rPr>
+          <w:rFonts w:ascii="Consolas" w:eastAsia="Times New Roman" w:hAnsi="Consolas" w:cs="Times New Roman"/>
+          <w:color w:val="E06C75"/>
+          <w:sz w:val="21"/>
+          <w:szCs w:val="21"/>
+          <w:lang w:eastAsia="vi-VN"/>
+        </w:rPr>
+        <w:t>m</w:t>
+      </w:r>
+      <w:r>
+        <w:rPr>
+          <w:rFonts w:ascii="Consolas" w:eastAsia="Times New Roman" w:hAnsi="Consolas" w:cs="Times New Roman"/>
+          <w:color w:val="ABB2BF"/>
+          <w:sz w:val="21"/>
+          <w:szCs w:val="21"/>
+          <w:lang w:eastAsia="vi-VN"/>
+        </w:rPr>
+        <w:t xml:space="preserve"> ; </w:t>
+      </w:r>
+      <w:r>
+        <w:rPr>
+          <w:rFonts w:ascii="Consolas" w:eastAsia="Times New Roman" w:hAnsi="Consolas" w:cs="Times New Roman"/>
+          <w:color w:val="E06C75"/>
+          <w:sz w:val="21"/>
+          <w:szCs w:val="21"/>
+          <w:lang w:eastAsia="vi-VN"/>
+        </w:rPr>
+        <w:t>j</w:t>
+      </w:r>
+      <w:r>
+        <w:rPr>
+          <w:rFonts w:ascii="Consolas" w:eastAsia="Times New Roman" w:hAnsi="Consolas" w:cs="Times New Roman"/>
+          <w:color w:val="C678DD"/>
+          <w:sz w:val="21"/>
+          <w:szCs w:val="21"/>
+          <w:lang w:eastAsia="vi-VN"/>
+        </w:rPr>
+        <w:t>++</w:t>
+      </w:r>
+      <w:r>
+        <w:rPr>
+          <w:rFonts w:ascii="Consolas" w:eastAsia="Times New Roman" w:hAnsi="Consolas" w:cs="Times New Roman"/>
+          <w:color w:val="ABB2BF"/>
+          <w:sz w:val="21"/>
+          <w:szCs w:val="21"/>
+          <w:lang w:eastAsia="vi-VN"/>
+        </w:rPr>
+        <w:t>){</w:t>
+      </w:r>
+    </w:p>
+    <w:p>
+      <w:pPr>
+        <w:shd w:val="clear" w:color="auto" w:fill="282C34"/>
+        <w:spacing w:after="0" w:line="285" w:lineRule="atLeast"/>
+        <w:rPr>
+          <w:rFonts w:ascii="Consolas" w:eastAsia="Times New Roman" w:hAnsi="Consolas" w:cs="Times New Roman"/>
+          <w:color w:val="ABB2BF"/>
+          <w:sz w:val="21"/>
+          <w:szCs w:val="21"/>
+          <w:lang w:eastAsia="vi-VN"/>
+        </w:rPr>
+      </w:pPr>
+      <w:r>
+        <w:rPr>
+          <w:rFonts w:ascii="Consolas" w:eastAsia="Times New Roman" w:hAnsi="Consolas" w:cs="Times New Roman"/>
+          <w:color w:val="ABB2BF"/>
+          <w:sz w:val="21"/>
+          <w:szCs w:val="21"/>
+          <w:lang w:eastAsia="vi-VN"/>
+        </w:rPr>
+        <w:lastRenderedPageBreak/>
+        <w:t xml:space="preserve">                </w:t>
+      </w:r>
+      <w:r>
+        <w:rPr>
+          <w:rFonts w:ascii="Consolas" w:eastAsia="Times New Roman" w:hAnsi="Consolas" w:cs="Times New Roman"/>
+          <w:color w:val="C678DD"/>
+          <w:sz w:val="21"/>
+          <w:szCs w:val="21"/>
+          <w:lang w:eastAsia="vi-VN"/>
+        </w:rPr>
+        <w:t>if</w:t>
+      </w:r>
+      <w:r>
+        <w:rPr>
+          <w:rFonts w:ascii="Consolas" w:eastAsia="Times New Roman" w:hAnsi="Consolas" w:cs="Times New Roman"/>
+          <w:color w:val="ABB2BF"/>
+          <w:sz w:val="21"/>
+          <w:szCs w:val="21"/>
+          <w:lang w:eastAsia="vi-VN"/>
+        </w:rPr>
+        <w:t>(</w:t>
+      </w:r>
+      <w:r>
+        <w:rPr>
+          <w:rFonts w:ascii="Consolas" w:eastAsia="Times New Roman" w:hAnsi="Consolas" w:cs="Times New Roman"/>
+          <w:i/>
+          <w:iCs/>
+          <w:color w:val="E06C75"/>
+          <w:sz w:val="21"/>
+          <w:szCs w:val="21"/>
+          <w:lang w:eastAsia="vi-VN"/>
+        </w:rPr>
+        <w:t>grid</w:t>
+      </w:r>
+      <w:r>
+        <w:rPr>
+          <w:rFonts w:ascii="Consolas" w:eastAsia="Times New Roman" w:hAnsi="Consolas" w:cs="Times New Roman"/>
+          <w:color w:val="C678DD"/>
+          <w:sz w:val="21"/>
+          <w:szCs w:val="21"/>
+          <w:lang w:eastAsia="vi-VN"/>
+        </w:rPr>
+        <w:t>[</w:t>
+      </w:r>
+      <w:r>
+        <w:rPr>
+          <w:rFonts w:ascii="Consolas" w:eastAsia="Times New Roman" w:hAnsi="Consolas" w:cs="Times New Roman"/>
+          <w:color w:val="E06C75"/>
+          <w:sz w:val="21"/>
+          <w:szCs w:val="21"/>
+          <w:lang w:eastAsia="vi-VN"/>
+        </w:rPr>
+        <w:t>i</w:t>
+      </w:r>
+      <w:r>
+        <w:rPr>
+          <w:rFonts w:ascii="Consolas" w:eastAsia="Times New Roman" w:hAnsi="Consolas" w:cs="Times New Roman"/>
+          <w:color w:val="C678DD"/>
+          <w:sz w:val="21"/>
+          <w:szCs w:val="21"/>
+          <w:lang w:eastAsia="vi-VN"/>
+        </w:rPr>
+        <w:t>][</w:t>
+      </w:r>
+      <w:r>
+        <w:rPr>
+          <w:rFonts w:ascii="Consolas" w:eastAsia="Times New Roman" w:hAnsi="Consolas" w:cs="Times New Roman"/>
+          <w:color w:val="E06C75"/>
+          <w:sz w:val="21"/>
+          <w:szCs w:val="21"/>
+          <w:lang w:eastAsia="vi-VN"/>
+        </w:rPr>
+        <w:t>j</w:t>
+      </w:r>
+      <w:r>
+        <w:rPr>
+          <w:rFonts w:ascii="Consolas" w:eastAsia="Times New Roman" w:hAnsi="Consolas" w:cs="Times New Roman"/>
+          <w:color w:val="C678DD"/>
+          <w:sz w:val="21"/>
+          <w:szCs w:val="21"/>
+          <w:lang w:eastAsia="vi-VN"/>
+        </w:rPr>
+        <w:t>]</w:t>
+      </w:r>
+      <w:r>
+        <w:rPr>
+          <w:rFonts w:ascii="Consolas" w:eastAsia="Times New Roman" w:hAnsi="Consolas" w:cs="Times New Roman"/>
+          <w:color w:val="ABB2BF"/>
+          <w:sz w:val="21"/>
+          <w:szCs w:val="21"/>
+          <w:lang w:eastAsia="vi-VN"/>
+        </w:rPr>
+        <w:t xml:space="preserve"> </w:t>
+      </w:r>
+      <w:r>
+        <w:rPr>
+          <w:rFonts w:ascii="Consolas" w:eastAsia="Times New Roman" w:hAnsi="Consolas" w:cs="Times New Roman"/>
+          <w:color w:val="C678DD"/>
+          <w:sz w:val="21"/>
+          <w:szCs w:val="21"/>
+          <w:lang w:eastAsia="vi-VN"/>
+        </w:rPr>
+        <w:t>==</w:t>
+      </w:r>
+      <w:r>
+        <w:rPr>
+          <w:rFonts w:ascii="Consolas" w:eastAsia="Times New Roman" w:hAnsi="Consolas" w:cs="Times New Roman"/>
+          <w:color w:val="ABB2BF"/>
+          <w:sz w:val="21"/>
+          <w:szCs w:val="21"/>
+          <w:lang w:eastAsia="vi-VN"/>
+        </w:rPr>
+        <w:t xml:space="preserve"> </w:t>
+      </w:r>
+      <w:r>
+        <w:rPr>
+          <w:rFonts w:ascii="Consolas" w:eastAsia="Times New Roman" w:hAnsi="Consolas" w:cs="Times New Roman"/>
+          <w:color w:val="D19A66"/>
+          <w:sz w:val="21"/>
+          <w:szCs w:val="21"/>
+          <w:lang w:eastAsia="vi-VN"/>
+        </w:rPr>
+        <w:t>2</w:t>
+      </w:r>
+      <w:r>
+        <w:rPr>
+          <w:rFonts w:ascii="Consolas" w:eastAsia="Times New Roman" w:hAnsi="Consolas" w:cs="Times New Roman"/>
+          <w:color w:val="ABB2BF"/>
+          <w:sz w:val="21"/>
+          <w:szCs w:val="21"/>
+          <w:lang w:eastAsia="vi-VN"/>
+        </w:rPr>
+        <w:t xml:space="preserve">) </w:t>
+      </w:r>
+      <w:r>
+        <w:rPr>
+          <w:rFonts w:ascii="Consolas" w:eastAsia="Times New Roman" w:hAnsi="Consolas" w:cs="Times New Roman"/>
+          <w:color w:val="E06C75"/>
+          <w:sz w:val="21"/>
+          <w:szCs w:val="21"/>
+          <w:lang w:eastAsia="vi-VN"/>
+        </w:rPr>
+        <w:t>pq</w:t>
+      </w:r>
+      <w:r>
+        <w:rPr>
+          <w:rFonts w:ascii="Consolas" w:eastAsia="Times New Roman" w:hAnsi="Consolas" w:cs="Times New Roman"/>
+          <w:color w:val="ABB2BF"/>
+          <w:sz w:val="21"/>
+          <w:szCs w:val="21"/>
+          <w:lang w:eastAsia="vi-VN"/>
+        </w:rPr>
+        <w:t>.</w:t>
+      </w:r>
+      <w:r>
+        <w:rPr>
+          <w:rFonts w:ascii="Consolas" w:eastAsia="Times New Roman" w:hAnsi="Consolas" w:cs="Times New Roman"/>
+          <w:color w:val="61AFEF"/>
+          <w:sz w:val="21"/>
+          <w:szCs w:val="21"/>
+          <w:lang w:eastAsia="vi-VN"/>
+        </w:rPr>
+        <w:t>push</w:t>
+      </w:r>
+      <w:r>
+        <w:rPr>
+          <w:rFonts w:ascii="Consolas" w:eastAsia="Times New Roman" w:hAnsi="Consolas" w:cs="Times New Roman"/>
+          <w:color w:val="ABB2BF"/>
+          <w:sz w:val="21"/>
+          <w:szCs w:val="21"/>
+          <w:lang w:eastAsia="vi-VN"/>
+        </w:rPr>
+        <w:t>({</w:t>
+      </w:r>
+      <w:r>
+        <w:rPr>
+          <w:rFonts w:ascii="Consolas" w:eastAsia="Times New Roman" w:hAnsi="Consolas" w:cs="Times New Roman"/>
+          <w:color w:val="E06C75"/>
+          <w:sz w:val="21"/>
+          <w:szCs w:val="21"/>
+          <w:lang w:eastAsia="vi-VN"/>
+        </w:rPr>
+        <w:t>i</w:t>
+      </w:r>
+      <w:r>
+        <w:rPr>
+          <w:rFonts w:ascii="Consolas" w:eastAsia="Times New Roman" w:hAnsi="Consolas" w:cs="Times New Roman"/>
+          <w:color w:val="ABB2BF"/>
+          <w:sz w:val="21"/>
+          <w:szCs w:val="21"/>
+          <w:lang w:eastAsia="vi-VN"/>
+        </w:rPr>
+        <w:t>,</w:t>
+      </w:r>
+      <w:r>
+        <w:rPr>
+          <w:rFonts w:ascii="Consolas" w:eastAsia="Times New Roman" w:hAnsi="Consolas" w:cs="Times New Roman"/>
+          <w:color w:val="E06C75"/>
+          <w:sz w:val="21"/>
+          <w:szCs w:val="21"/>
+          <w:lang w:eastAsia="vi-VN"/>
+        </w:rPr>
+        <w:t>j</w:t>
+      </w:r>
+      <w:r>
+        <w:rPr>
+          <w:rFonts w:ascii="Consolas" w:eastAsia="Times New Roman" w:hAnsi="Consolas" w:cs="Times New Roman"/>
+          <w:color w:val="ABB2BF"/>
+          <w:sz w:val="21"/>
+          <w:szCs w:val="21"/>
+          <w:lang w:eastAsia="vi-VN"/>
+        </w:rPr>
+        <w:t>});</w:t>
+      </w:r>
+      <w:r>
+        <w:rPr>
+          <w:rFonts w:ascii="Consolas" w:eastAsia="Times New Roman" w:hAnsi="Consolas" w:cs="Times New Roman"/>
+          <w:i/>
+          <w:iCs/>
+          <w:color w:val="7F848E"/>
+          <w:sz w:val="21"/>
+          <w:szCs w:val="21"/>
+          <w:lang w:eastAsia="vi-VN"/>
+        </w:rPr>
+        <w:t xml:space="preserve"> // Đếm xem có bao nhiêu số 2 &lt;=&gt; số lượng cam thối HIỆN TẠI</w:t>
+      </w:r>
+    </w:p>
+    <w:p>
+      <w:pPr>
+        <w:shd w:val="clear" w:color="auto" w:fill="282C34"/>
+        <w:spacing w:after="0" w:line="285" w:lineRule="atLeast"/>
+        <w:rPr>
+          <w:rFonts w:ascii="Consolas" w:eastAsia="Times New Roman" w:hAnsi="Consolas" w:cs="Times New Roman"/>
+          <w:color w:val="ABB2BF"/>
+          <w:sz w:val="21"/>
+          <w:szCs w:val="21"/>
+          <w:lang w:eastAsia="vi-VN"/>
+        </w:rPr>
+      </w:pPr>
+      <w:r>
+        <w:rPr>
+          <w:rFonts w:ascii="Consolas" w:eastAsia="Times New Roman" w:hAnsi="Consolas" w:cs="Times New Roman"/>
+          <w:color w:val="ABB2BF"/>
+          <w:sz w:val="21"/>
+          <w:szCs w:val="21"/>
+          <w:lang w:eastAsia="vi-VN"/>
+        </w:rPr>
+        <w:t xml:space="preserve">                </w:t>
+      </w:r>
+      <w:r>
+        <w:rPr>
+          <w:rFonts w:ascii="Consolas" w:eastAsia="Times New Roman" w:hAnsi="Consolas" w:cs="Times New Roman"/>
+          <w:color w:val="C678DD"/>
+          <w:sz w:val="21"/>
+          <w:szCs w:val="21"/>
+          <w:lang w:eastAsia="vi-VN"/>
+        </w:rPr>
+        <w:t>else</w:t>
+      </w:r>
+      <w:r>
+        <w:rPr>
+          <w:rFonts w:ascii="Consolas" w:eastAsia="Times New Roman" w:hAnsi="Consolas" w:cs="Times New Roman"/>
+          <w:color w:val="ABB2BF"/>
+          <w:sz w:val="21"/>
+          <w:szCs w:val="21"/>
+          <w:lang w:eastAsia="vi-VN"/>
+        </w:rPr>
+        <w:t xml:space="preserve"> </w:t>
+      </w:r>
+      <w:r>
+        <w:rPr>
+          <w:rFonts w:ascii="Consolas" w:eastAsia="Times New Roman" w:hAnsi="Consolas" w:cs="Times New Roman"/>
+          <w:color w:val="C678DD"/>
+          <w:sz w:val="21"/>
+          <w:szCs w:val="21"/>
+          <w:lang w:eastAsia="vi-VN"/>
+        </w:rPr>
+        <w:t>if</w:t>
+      </w:r>
+      <w:r>
+        <w:rPr>
+          <w:rFonts w:ascii="Consolas" w:eastAsia="Times New Roman" w:hAnsi="Consolas" w:cs="Times New Roman"/>
+          <w:color w:val="ABB2BF"/>
+          <w:sz w:val="21"/>
+          <w:szCs w:val="21"/>
+          <w:lang w:eastAsia="vi-VN"/>
+        </w:rPr>
+        <w:t xml:space="preserve"> (</w:t>
+      </w:r>
+      <w:r>
+        <w:rPr>
+          <w:rFonts w:ascii="Consolas" w:eastAsia="Times New Roman" w:hAnsi="Consolas" w:cs="Times New Roman"/>
+          <w:i/>
+          <w:iCs/>
+          <w:color w:val="E06C75"/>
+          <w:sz w:val="21"/>
+          <w:szCs w:val="21"/>
+          <w:lang w:eastAsia="vi-VN"/>
+        </w:rPr>
+        <w:t>grid</w:t>
+      </w:r>
+      <w:r>
+        <w:rPr>
+          <w:rFonts w:ascii="Consolas" w:eastAsia="Times New Roman" w:hAnsi="Consolas" w:cs="Times New Roman"/>
+          <w:color w:val="C678DD"/>
+          <w:sz w:val="21"/>
+          <w:szCs w:val="21"/>
+          <w:lang w:eastAsia="vi-VN"/>
+        </w:rPr>
+        <w:t>[</w:t>
+      </w:r>
+      <w:r>
+        <w:rPr>
+          <w:rFonts w:ascii="Consolas" w:eastAsia="Times New Roman" w:hAnsi="Consolas" w:cs="Times New Roman"/>
+          <w:color w:val="E06C75"/>
+          <w:sz w:val="21"/>
+          <w:szCs w:val="21"/>
+          <w:lang w:eastAsia="vi-VN"/>
+        </w:rPr>
+        <w:t>i</w:t>
+      </w:r>
+      <w:r>
+        <w:rPr>
+          <w:rFonts w:ascii="Consolas" w:eastAsia="Times New Roman" w:hAnsi="Consolas" w:cs="Times New Roman"/>
+          <w:color w:val="C678DD"/>
+          <w:sz w:val="21"/>
+          <w:szCs w:val="21"/>
+          <w:lang w:eastAsia="vi-VN"/>
+        </w:rPr>
+        <w:t>][</w:t>
+      </w:r>
+      <w:r>
+        <w:rPr>
+          <w:rFonts w:ascii="Consolas" w:eastAsia="Times New Roman" w:hAnsi="Consolas" w:cs="Times New Roman"/>
+          <w:color w:val="E06C75"/>
+          <w:sz w:val="21"/>
+          <w:szCs w:val="21"/>
+          <w:lang w:eastAsia="vi-VN"/>
+        </w:rPr>
+        <w:t>j</w:t>
+      </w:r>
+      <w:r>
+        <w:rPr>
+          <w:rFonts w:ascii="Consolas" w:eastAsia="Times New Roman" w:hAnsi="Consolas" w:cs="Times New Roman"/>
+          <w:color w:val="C678DD"/>
+          <w:sz w:val="21"/>
+          <w:szCs w:val="21"/>
+          <w:lang w:eastAsia="vi-VN"/>
+        </w:rPr>
+        <w:t>]</w:t>
+      </w:r>
+      <w:r>
+        <w:rPr>
+          <w:rFonts w:ascii="Consolas" w:eastAsia="Times New Roman" w:hAnsi="Consolas" w:cs="Times New Roman"/>
+          <w:color w:val="ABB2BF"/>
+          <w:sz w:val="21"/>
+          <w:szCs w:val="21"/>
+          <w:lang w:eastAsia="vi-VN"/>
+        </w:rPr>
+        <w:t xml:space="preserve"> </w:t>
+      </w:r>
+      <w:r>
+        <w:rPr>
+          <w:rFonts w:ascii="Consolas" w:eastAsia="Times New Roman" w:hAnsi="Consolas" w:cs="Times New Roman"/>
+          <w:color w:val="C678DD"/>
+          <w:sz w:val="21"/>
+          <w:szCs w:val="21"/>
+          <w:lang w:eastAsia="vi-VN"/>
+        </w:rPr>
+        <w:t>==</w:t>
+      </w:r>
+      <w:r>
+        <w:rPr>
+          <w:rFonts w:ascii="Consolas" w:eastAsia="Times New Roman" w:hAnsi="Consolas" w:cs="Times New Roman"/>
+          <w:color w:val="ABB2BF"/>
+          <w:sz w:val="21"/>
+          <w:szCs w:val="21"/>
+          <w:lang w:eastAsia="vi-VN"/>
+        </w:rPr>
+        <w:t xml:space="preserve"> </w:t>
+      </w:r>
+      <w:r>
+        <w:rPr>
+          <w:rFonts w:ascii="Consolas" w:eastAsia="Times New Roman" w:hAnsi="Consolas" w:cs="Times New Roman"/>
+          <w:color w:val="D19A66"/>
+          <w:sz w:val="21"/>
+          <w:szCs w:val="21"/>
+          <w:lang w:eastAsia="vi-VN"/>
+        </w:rPr>
+        <w:t>1</w:t>
+      </w:r>
+      <w:r>
+        <w:rPr>
+          <w:rFonts w:ascii="Consolas" w:eastAsia="Times New Roman" w:hAnsi="Consolas" w:cs="Times New Roman"/>
+          <w:color w:val="ABB2BF"/>
+          <w:sz w:val="21"/>
+          <w:szCs w:val="21"/>
+          <w:lang w:eastAsia="vi-VN"/>
+        </w:rPr>
+        <w:t xml:space="preserve">) </w:t>
+      </w:r>
+      <w:r>
+        <w:rPr>
+          <w:rFonts w:ascii="Consolas" w:eastAsia="Times New Roman" w:hAnsi="Consolas" w:cs="Times New Roman"/>
+          <w:color w:val="E06C75"/>
+          <w:sz w:val="21"/>
+          <w:szCs w:val="21"/>
+          <w:lang w:eastAsia="vi-VN"/>
+        </w:rPr>
+        <w:t>fruit</w:t>
+      </w:r>
+      <w:r>
+        <w:rPr>
+          <w:rFonts w:ascii="Consolas" w:eastAsia="Times New Roman" w:hAnsi="Consolas" w:cs="Times New Roman"/>
+          <w:color w:val="C678DD"/>
+          <w:sz w:val="21"/>
+          <w:szCs w:val="21"/>
+          <w:lang w:eastAsia="vi-VN"/>
+        </w:rPr>
+        <w:t>++</w:t>
+      </w:r>
+      <w:r>
+        <w:rPr>
+          <w:rFonts w:ascii="Consolas" w:eastAsia="Times New Roman" w:hAnsi="Consolas" w:cs="Times New Roman"/>
+          <w:color w:val="ABB2BF"/>
+          <w:sz w:val="21"/>
+          <w:szCs w:val="21"/>
+          <w:lang w:eastAsia="vi-VN"/>
+        </w:rPr>
+        <w:t>;</w:t>
+      </w:r>
+      <w:r>
+        <w:rPr>
+          <w:rFonts w:ascii="Consolas" w:eastAsia="Times New Roman" w:hAnsi="Consolas" w:cs="Times New Roman"/>
+          <w:i/>
+          <w:iCs/>
+          <w:color w:val="7F848E"/>
+          <w:sz w:val="21"/>
+          <w:szCs w:val="21"/>
+          <w:lang w:eastAsia="vi-VN"/>
+        </w:rPr>
+        <w:t xml:space="preserve"> // Đếm xem có bao nhiêu số 1 </w:t>
+      </w:r>
+    </w:p>
+    <w:p>
+      <w:pPr>
+        <w:shd w:val="clear" w:color="auto" w:fill="282C34"/>
+        <w:spacing w:after="0" w:line="285" w:lineRule="atLeast"/>
+        <w:rPr>
+          <w:rFonts w:ascii="Consolas" w:eastAsia="Times New Roman" w:hAnsi="Consolas" w:cs="Times New Roman"/>
+          <w:color w:val="ABB2BF"/>
+          <w:sz w:val="21"/>
+          <w:szCs w:val="21"/>
+          <w:lang w:eastAsia="vi-VN"/>
+        </w:rPr>
+      </w:pPr>
+      <w:r>
+        <w:rPr>
+          <w:rFonts w:ascii="Consolas" w:eastAsia="Times New Roman" w:hAnsi="Consolas" w:cs="Times New Roman"/>
+          <w:color w:val="ABB2BF"/>
+          <w:sz w:val="21"/>
+          <w:szCs w:val="21"/>
+          <w:lang w:eastAsia="vi-VN"/>
+        </w:rPr>
+        <w:t>            }</w:t>
+      </w:r>
+    </w:p>
+    <w:p>
+      <w:pPr>
+        <w:shd w:val="clear" w:color="auto" w:fill="282C34"/>
+        <w:spacing w:after="0" w:line="285" w:lineRule="atLeast"/>
+        <w:rPr>
+          <w:rFonts w:ascii="Consolas" w:eastAsia="Times New Roman" w:hAnsi="Consolas" w:cs="Times New Roman"/>
+          <w:color w:val="ABB2BF"/>
+          <w:sz w:val="21"/>
+          <w:szCs w:val="21"/>
+          <w:lang w:eastAsia="vi-VN"/>
+        </w:rPr>
+      </w:pPr>
+    </w:p>
+    <w:p>
+      <w:pPr>
+        <w:shd w:val="clear" w:color="auto" w:fill="282C34"/>
+        <w:spacing w:after="0" w:line="285" w:lineRule="atLeast"/>
+        <w:rPr>
+          <w:rFonts w:ascii="Consolas" w:eastAsia="Times New Roman" w:hAnsi="Consolas" w:cs="Times New Roman"/>
+          <w:color w:val="ABB2BF"/>
+          <w:sz w:val="21"/>
+          <w:szCs w:val="21"/>
+          <w:lang w:eastAsia="vi-VN"/>
+        </w:rPr>
+      </w:pPr>
+      <w:r>
+        <w:rPr>
+          <w:rFonts w:ascii="Consolas" w:eastAsia="Times New Roman" w:hAnsi="Consolas" w:cs="Times New Roman"/>
+          <w:color w:val="ABB2BF"/>
+          <w:sz w:val="21"/>
+          <w:szCs w:val="21"/>
+          <w:lang w:eastAsia="vi-VN"/>
+        </w:rPr>
+        <w:t xml:space="preserve">        </w:t>
+      </w:r>
+      <w:r>
+        <w:rPr>
+          <w:rFonts w:ascii="Consolas" w:eastAsia="Times New Roman" w:hAnsi="Consolas" w:cs="Times New Roman"/>
+          <w:color w:val="C678DD"/>
+          <w:sz w:val="21"/>
+          <w:szCs w:val="21"/>
+          <w:lang w:eastAsia="vi-VN"/>
+        </w:rPr>
+        <w:t>if</w:t>
+      </w:r>
+      <w:r>
+        <w:rPr>
+          <w:rFonts w:ascii="Consolas" w:eastAsia="Times New Roman" w:hAnsi="Consolas" w:cs="Times New Roman"/>
+          <w:color w:val="ABB2BF"/>
+          <w:sz w:val="21"/>
+          <w:szCs w:val="21"/>
+          <w:lang w:eastAsia="vi-VN"/>
+        </w:rPr>
+        <w:t>(</w:t>
+      </w:r>
+      <w:r>
+        <w:rPr>
+          <w:rFonts w:ascii="Consolas" w:eastAsia="Times New Roman" w:hAnsi="Consolas" w:cs="Times New Roman"/>
+          <w:color w:val="E06C75"/>
+          <w:sz w:val="21"/>
+          <w:szCs w:val="21"/>
+          <w:lang w:eastAsia="vi-VN"/>
+        </w:rPr>
+        <w:t>fruit</w:t>
+      </w:r>
+      <w:r>
+        <w:rPr>
+          <w:rFonts w:ascii="Consolas" w:eastAsia="Times New Roman" w:hAnsi="Consolas" w:cs="Times New Roman"/>
+          <w:color w:val="ABB2BF"/>
+          <w:sz w:val="21"/>
+          <w:szCs w:val="21"/>
+          <w:lang w:eastAsia="vi-VN"/>
+        </w:rPr>
+        <w:t xml:space="preserve"> </w:t>
+      </w:r>
+      <w:r>
+        <w:rPr>
+          <w:rFonts w:ascii="Consolas" w:eastAsia="Times New Roman" w:hAnsi="Consolas" w:cs="Times New Roman"/>
+          <w:color w:val="C678DD"/>
+          <w:sz w:val="21"/>
+          <w:szCs w:val="21"/>
+          <w:lang w:eastAsia="vi-VN"/>
+        </w:rPr>
+        <w:t>==</w:t>
+      </w:r>
+      <w:r>
+        <w:rPr>
+          <w:rFonts w:ascii="Consolas" w:eastAsia="Times New Roman" w:hAnsi="Consolas" w:cs="Times New Roman"/>
+          <w:color w:val="ABB2BF"/>
+          <w:sz w:val="21"/>
+          <w:szCs w:val="21"/>
+          <w:lang w:eastAsia="vi-VN"/>
+        </w:rPr>
+        <w:t xml:space="preserve"> </w:t>
+      </w:r>
+      <w:r>
+        <w:rPr>
+          <w:rFonts w:ascii="Consolas" w:eastAsia="Times New Roman" w:hAnsi="Consolas" w:cs="Times New Roman"/>
+          <w:color w:val="D19A66"/>
+          <w:sz w:val="21"/>
+          <w:szCs w:val="21"/>
+          <w:lang w:eastAsia="vi-VN"/>
+        </w:rPr>
+        <w:t>0</w:t>
+      </w:r>
+      <w:r>
+        <w:rPr>
+          <w:rFonts w:ascii="Consolas" w:eastAsia="Times New Roman" w:hAnsi="Consolas" w:cs="Times New Roman"/>
+          <w:color w:val="ABB2BF"/>
+          <w:sz w:val="21"/>
+          <w:szCs w:val="21"/>
+          <w:lang w:eastAsia="vi-VN"/>
+        </w:rPr>
+        <w:t xml:space="preserve">) </w:t>
+      </w:r>
+      <w:r>
+        <w:rPr>
+          <w:rFonts w:ascii="Consolas" w:eastAsia="Times New Roman" w:hAnsi="Consolas" w:cs="Times New Roman"/>
+          <w:color w:val="C678DD"/>
+          <w:sz w:val="21"/>
+          <w:szCs w:val="21"/>
+          <w:lang w:eastAsia="vi-VN"/>
+        </w:rPr>
+        <w:t>return</w:t>
+      </w:r>
+      <w:r>
+        <w:rPr>
+          <w:rFonts w:ascii="Consolas" w:eastAsia="Times New Roman" w:hAnsi="Consolas" w:cs="Times New Roman"/>
+          <w:color w:val="ABB2BF"/>
+          <w:sz w:val="21"/>
+          <w:szCs w:val="21"/>
+          <w:lang w:eastAsia="vi-VN"/>
+        </w:rPr>
+        <w:t xml:space="preserve"> </w:t>
+      </w:r>
+      <w:r>
+        <w:rPr>
+          <w:rFonts w:ascii="Consolas" w:eastAsia="Times New Roman" w:hAnsi="Consolas" w:cs="Times New Roman"/>
+          <w:color w:val="D19A66"/>
+          <w:sz w:val="21"/>
+          <w:szCs w:val="21"/>
+          <w:lang w:eastAsia="vi-VN"/>
+        </w:rPr>
+        <w:t>0</w:t>
+      </w:r>
+      <w:r>
+        <w:rPr>
+          <w:rFonts w:ascii="Consolas" w:eastAsia="Times New Roman" w:hAnsi="Consolas" w:cs="Times New Roman"/>
+          <w:color w:val="ABB2BF"/>
+          <w:sz w:val="21"/>
+          <w:szCs w:val="21"/>
+          <w:lang w:eastAsia="vi-VN"/>
+        </w:rPr>
+        <w:t xml:space="preserve"> ;</w:t>
+      </w:r>
+    </w:p>
+    <w:p>
+      <w:pPr>
+        <w:shd w:val="clear" w:color="auto" w:fill="282C34"/>
+        <w:spacing w:after="0" w:line="285" w:lineRule="atLeast"/>
+        <w:rPr>
+          <w:rFonts w:ascii="Consolas" w:eastAsia="Times New Roman" w:hAnsi="Consolas" w:cs="Times New Roman"/>
+          <w:color w:val="ABB2BF"/>
+          <w:sz w:val="21"/>
+          <w:szCs w:val="21"/>
+          <w:lang w:eastAsia="vi-VN"/>
+        </w:rPr>
+      </w:pPr>
+      <w:r>
+        <w:rPr>
+          <w:rFonts w:ascii="Consolas" w:eastAsia="Times New Roman" w:hAnsi="Consolas" w:cs="Times New Roman"/>
+          <w:color w:val="ABB2BF"/>
+          <w:sz w:val="21"/>
+          <w:szCs w:val="21"/>
+          <w:lang w:eastAsia="vi-VN"/>
+        </w:rPr>
+        <w:t xml:space="preserve">        </w:t>
+      </w:r>
+    </w:p>
+    <w:p>
+      <w:pPr>
+        <w:shd w:val="clear" w:color="auto" w:fill="282C34"/>
+        <w:spacing w:after="0" w:line="285" w:lineRule="atLeast"/>
+        <w:rPr>
+          <w:rFonts w:ascii="Consolas" w:eastAsia="Times New Roman" w:hAnsi="Consolas" w:cs="Times New Roman"/>
+          <w:color w:val="ABB2BF"/>
+          <w:sz w:val="21"/>
+          <w:szCs w:val="21"/>
+          <w:lang w:eastAsia="vi-VN"/>
+        </w:rPr>
+      </w:pPr>
+      <w:r>
+        <w:rPr>
+          <w:rFonts w:ascii="Consolas" w:eastAsia="Times New Roman" w:hAnsi="Consolas" w:cs="Times New Roman"/>
+          <w:color w:val="ABB2BF"/>
+          <w:sz w:val="21"/>
+          <w:szCs w:val="21"/>
+          <w:lang w:eastAsia="vi-VN"/>
+        </w:rPr>
+        <w:t xml:space="preserve">        </w:t>
+      </w:r>
+      <w:r>
+        <w:rPr>
+          <w:rFonts w:ascii="Consolas" w:eastAsia="Times New Roman" w:hAnsi="Consolas" w:cs="Times New Roman"/>
+          <w:color w:val="C678DD"/>
+          <w:sz w:val="21"/>
+          <w:szCs w:val="21"/>
+          <w:lang w:eastAsia="vi-VN"/>
+        </w:rPr>
+        <w:t>int</w:t>
+      </w:r>
+      <w:r>
+        <w:rPr>
+          <w:rFonts w:ascii="Consolas" w:eastAsia="Times New Roman" w:hAnsi="Consolas" w:cs="Times New Roman"/>
+          <w:color w:val="ABB2BF"/>
+          <w:sz w:val="21"/>
+          <w:szCs w:val="21"/>
+          <w:lang w:eastAsia="vi-VN"/>
+        </w:rPr>
+        <w:t xml:space="preserve"> </w:t>
+      </w:r>
+      <w:r>
+        <w:rPr>
+          <w:rFonts w:ascii="Consolas" w:eastAsia="Times New Roman" w:hAnsi="Consolas" w:cs="Times New Roman"/>
+          <w:color w:val="E06C75"/>
+          <w:sz w:val="21"/>
+          <w:szCs w:val="21"/>
+          <w:lang w:eastAsia="vi-VN"/>
+        </w:rPr>
+        <w:t>xx</w:t>
+      </w:r>
+      <w:r>
+        <w:rPr>
+          <w:rFonts w:ascii="Consolas" w:eastAsia="Times New Roman" w:hAnsi="Consolas" w:cs="Times New Roman"/>
+          <w:color w:val="ABB2BF"/>
+          <w:sz w:val="21"/>
+          <w:szCs w:val="21"/>
+          <w:lang w:eastAsia="vi-VN"/>
+        </w:rPr>
+        <w:t>[</w:t>
+      </w:r>
+      <w:r>
+        <w:rPr>
+          <w:rFonts w:ascii="Consolas" w:eastAsia="Times New Roman" w:hAnsi="Consolas" w:cs="Times New Roman"/>
+          <w:color w:val="D19A66"/>
+          <w:sz w:val="21"/>
+          <w:szCs w:val="21"/>
+          <w:lang w:eastAsia="vi-VN"/>
+        </w:rPr>
+        <w:t>4</w:t>
+      </w:r>
+      <w:r>
+        <w:rPr>
+          <w:rFonts w:ascii="Consolas" w:eastAsia="Times New Roman" w:hAnsi="Consolas" w:cs="Times New Roman"/>
+          <w:color w:val="ABB2BF"/>
+          <w:sz w:val="21"/>
+          <w:szCs w:val="21"/>
+          <w:lang w:eastAsia="vi-VN"/>
+        </w:rPr>
+        <w:t xml:space="preserve">] </w:t>
+      </w:r>
+      <w:r>
+        <w:rPr>
+          <w:rFonts w:ascii="Consolas" w:eastAsia="Times New Roman" w:hAnsi="Consolas" w:cs="Times New Roman"/>
+          <w:color w:val="C678DD"/>
+          <w:sz w:val="21"/>
+          <w:szCs w:val="21"/>
+          <w:lang w:eastAsia="vi-VN"/>
+        </w:rPr>
+        <w:t>=</w:t>
+      </w:r>
+      <w:r>
+        <w:rPr>
+          <w:rFonts w:ascii="Consolas" w:eastAsia="Times New Roman" w:hAnsi="Consolas" w:cs="Times New Roman"/>
+          <w:color w:val="ABB2BF"/>
+          <w:sz w:val="21"/>
+          <w:szCs w:val="21"/>
+          <w:lang w:eastAsia="vi-VN"/>
+        </w:rPr>
+        <w:t xml:space="preserve"> {</w:t>
+      </w:r>
+      <w:r>
+        <w:rPr>
+          <w:rFonts w:ascii="Consolas" w:eastAsia="Times New Roman" w:hAnsi="Consolas" w:cs="Times New Roman"/>
+          <w:color w:val="D19A66"/>
+          <w:sz w:val="21"/>
+          <w:szCs w:val="21"/>
+          <w:lang w:eastAsia="vi-VN"/>
+        </w:rPr>
+        <w:t>1</w:t>
+      </w:r>
+      <w:r>
+        <w:rPr>
+          <w:rFonts w:ascii="Consolas" w:eastAsia="Times New Roman" w:hAnsi="Consolas" w:cs="Times New Roman"/>
+          <w:color w:val="ABB2BF"/>
+          <w:sz w:val="21"/>
+          <w:szCs w:val="21"/>
+          <w:lang w:eastAsia="vi-VN"/>
+        </w:rPr>
+        <w:t>,</w:t>
+      </w:r>
+      <w:r>
+        <w:rPr>
+          <w:rFonts w:ascii="Consolas" w:eastAsia="Times New Roman" w:hAnsi="Consolas" w:cs="Times New Roman"/>
+          <w:color w:val="C678DD"/>
+          <w:sz w:val="21"/>
+          <w:szCs w:val="21"/>
+          <w:lang w:eastAsia="vi-VN"/>
+        </w:rPr>
+        <w:t>-</w:t>
+      </w:r>
+      <w:r>
+        <w:rPr>
+          <w:rFonts w:ascii="Consolas" w:eastAsia="Times New Roman" w:hAnsi="Consolas" w:cs="Times New Roman"/>
+          <w:color w:val="D19A66"/>
+          <w:sz w:val="21"/>
+          <w:szCs w:val="21"/>
+          <w:lang w:eastAsia="vi-VN"/>
+        </w:rPr>
+        <w:t>1</w:t>
+      </w:r>
+      <w:r>
+        <w:rPr>
+          <w:rFonts w:ascii="Consolas" w:eastAsia="Times New Roman" w:hAnsi="Consolas" w:cs="Times New Roman"/>
+          <w:color w:val="ABB2BF"/>
+          <w:sz w:val="21"/>
+          <w:szCs w:val="21"/>
+          <w:lang w:eastAsia="vi-VN"/>
+        </w:rPr>
+        <w:t>,</w:t>
+      </w:r>
+      <w:r>
+        <w:rPr>
+          <w:rFonts w:ascii="Consolas" w:eastAsia="Times New Roman" w:hAnsi="Consolas" w:cs="Times New Roman"/>
+          <w:color w:val="D19A66"/>
+          <w:sz w:val="21"/>
+          <w:szCs w:val="21"/>
+          <w:lang w:eastAsia="vi-VN"/>
+        </w:rPr>
+        <w:t>0</w:t>
+      </w:r>
+      <w:r>
+        <w:rPr>
+          <w:rFonts w:ascii="Consolas" w:eastAsia="Times New Roman" w:hAnsi="Consolas" w:cs="Times New Roman"/>
+          <w:color w:val="ABB2BF"/>
+          <w:sz w:val="21"/>
+          <w:szCs w:val="21"/>
+          <w:lang w:eastAsia="vi-VN"/>
+        </w:rPr>
+        <w:t>,</w:t>
+      </w:r>
+      <w:r>
+        <w:rPr>
+          <w:rFonts w:ascii="Consolas" w:eastAsia="Times New Roman" w:hAnsi="Consolas" w:cs="Times New Roman"/>
+          <w:color w:val="D19A66"/>
+          <w:sz w:val="21"/>
+          <w:szCs w:val="21"/>
+          <w:lang w:eastAsia="vi-VN"/>
+        </w:rPr>
+        <w:t>0</w:t>
+      </w:r>
+      <w:r>
+        <w:rPr>
+          <w:rFonts w:ascii="Consolas" w:eastAsia="Times New Roman" w:hAnsi="Consolas" w:cs="Times New Roman"/>
+          <w:color w:val="ABB2BF"/>
+          <w:sz w:val="21"/>
+          <w:szCs w:val="21"/>
+          <w:lang w:eastAsia="vi-VN"/>
+        </w:rPr>
+        <w:t>};</w:t>
+      </w:r>
+    </w:p>
+    <w:p>
+      <w:pPr>
+        <w:shd w:val="clear" w:color="auto" w:fill="282C34"/>
+        <w:spacing w:after="0" w:line="285" w:lineRule="atLeast"/>
+        <w:rPr>
+          <w:rFonts w:ascii="Consolas" w:eastAsia="Times New Roman" w:hAnsi="Consolas" w:cs="Times New Roman"/>
+          <w:color w:val="ABB2BF"/>
+          <w:sz w:val="21"/>
+          <w:szCs w:val="21"/>
+          <w:lang w:eastAsia="vi-VN"/>
+        </w:rPr>
+      </w:pPr>
+      <w:r>
+        <w:rPr>
+          <w:rFonts w:ascii="Consolas" w:eastAsia="Times New Roman" w:hAnsi="Consolas" w:cs="Times New Roman"/>
+          <w:color w:val="ABB2BF"/>
+          <w:sz w:val="21"/>
+          <w:szCs w:val="21"/>
+          <w:lang w:eastAsia="vi-VN"/>
+        </w:rPr>
+        <w:t xml:space="preserve">        </w:t>
+      </w:r>
+      <w:r>
+        <w:rPr>
+          <w:rFonts w:ascii="Consolas" w:eastAsia="Times New Roman" w:hAnsi="Consolas" w:cs="Times New Roman"/>
+          <w:color w:val="C678DD"/>
+          <w:sz w:val="21"/>
+          <w:szCs w:val="21"/>
+          <w:lang w:eastAsia="vi-VN"/>
+        </w:rPr>
+        <w:t>int</w:t>
+      </w:r>
+      <w:r>
+        <w:rPr>
+          <w:rFonts w:ascii="Consolas" w:eastAsia="Times New Roman" w:hAnsi="Consolas" w:cs="Times New Roman"/>
+          <w:color w:val="ABB2BF"/>
+          <w:sz w:val="21"/>
+          <w:szCs w:val="21"/>
+          <w:lang w:eastAsia="vi-VN"/>
+        </w:rPr>
+        <w:t xml:space="preserve"> </w:t>
+      </w:r>
+      <w:r>
+        <w:rPr>
+          <w:rFonts w:ascii="Consolas" w:eastAsia="Times New Roman" w:hAnsi="Consolas" w:cs="Times New Roman"/>
+          <w:color w:val="E06C75"/>
+          <w:sz w:val="21"/>
+          <w:szCs w:val="21"/>
+          <w:lang w:eastAsia="vi-VN"/>
+        </w:rPr>
+        <w:t>yy</w:t>
+      </w:r>
+      <w:r>
+        <w:rPr>
+          <w:rFonts w:ascii="Consolas" w:eastAsia="Times New Roman" w:hAnsi="Consolas" w:cs="Times New Roman"/>
+          <w:color w:val="ABB2BF"/>
+          <w:sz w:val="21"/>
+          <w:szCs w:val="21"/>
+          <w:lang w:eastAsia="vi-VN"/>
+        </w:rPr>
+        <w:t>[</w:t>
+      </w:r>
+      <w:r>
+        <w:rPr>
+          <w:rFonts w:ascii="Consolas" w:eastAsia="Times New Roman" w:hAnsi="Consolas" w:cs="Times New Roman"/>
+          <w:color w:val="D19A66"/>
+          <w:sz w:val="21"/>
+          <w:szCs w:val="21"/>
+          <w:lang w:eastAsia="vi-VN"/>
+        </w:rPr>
+        <w:t>4</w:t>
+      </w:r>
+      <w:r>
+        <w:rPr>
+          <w:rFonts w:ascii="Consolas" w:eastAsia="Times New Roman" w:hAnsi="Consolas" w:cs="Times New Roman"/>
+          <w:color w:val="ABB2BF"/>
+          <w:sz w:val="21"/>
+          <w:szCs w:val="21"/>
+          <w:lang w:eastAsia="vi-VN"/>
+        </w:rPr>
+        <w:t xml:space="preserve">] </w:t>
+      </w:r>
+      <w:r>
+        <w:rPr>
+          <w:rFonts w:ascii="Consolas" w:eastAsia="Times New Roman" w:hAnsi="Consolas" w:cs="Times New Roman"/>
+          <w:color w:val="C678DD"/>
+          <w:sz w:val="21"/>
+          <w:szCs w:val="21"/>
+          <w:lang w:eastAsia="vi-VN"/>
+        </w:rPr>
+        <w:t>=</w:t>
+      </w:r>
+      <w:r>
+        <w:rPr>
+          <w:rFonts w:ascii="Consolas" w:eastAsia="Times New Roman" w:hAnsi="Consolas" w:cs="Times New Roman"/>
+          <w:color w:val="ABB2BF"/>
+          <w:sz w:val="21"/>
+          <w:szCs w:val="21"/>
+          <w:lang w:eastAsia="vi-VN"/>
+        </w:rPr>
+        <w:t xml:space="preserve"> {</w:t>
+      </w:r>
+      <w:r>
+        <w:rPr>
+          <w:rFonts w:ascii="Consolas" w:eastAsia="Times New Roman" w:hAnsi="Consolas" w:cs="Times New Roman"/>
+          <w:color w:val="D19A66"/>
+          <w:sz w:val="21"/>
+          <w:szCs w:val="21"/>
+          <w:lang w:eastAsia="vi-VN"/>
+        </w:rPr>
+        <w:t>0</w:t>
+      </w:r>
+      <w:r>
+        <w:rPr>
+          <w:rFonts w:ascii="Consolas" w:eastAsia="Times New Roman" w:hAnsi="Consolas" w:cs="Times New Roman"/>
+          <w:color w:val="ABB2BF"/>
+          <w:sz w:val="21"/>
+          <w:szCs w:val="21"/>
+          <w:lang w:eastAsia="vi-VN"/>
+        </w:rPr>
+        <w:t>,</w:t>
+      </w:r>
+      <w:r>
+        <w:rPr>
+          <w:rFonts w:ascii="Consolas" w:eastAsia="Times New Roman" w:hAnsi="Consolas" w:cs="Times New Roman"/>
+          <w:color w:val="D19A66"/>
+          <w:sz w:val="21"/>
+          <w:szCs w:val="21"/>
+          <w:lang w:eastAsia="vi-VN"/>
+        </w:rPr>
+        <w:t>0</w:t>
+      </w:r>
+      <w:r>
+        <w:rPr>
+          <w:rFonts w:ascii="Consolas" w:eastAsia="Times New Roman" w:hAnsi="Consolas" w:cs="Times New Roman"/>
+          <w:color w:val="ABB2BF"/>
+          <w:sz w:val="21"/>
+          <w:szCs w:val="21"/>
+          <w:lang w:eastAsia="vi-VN"/>
+        </w:rPr>
+        <w:t>,</w:t>
+      </w:r>
+      <w:r>
+        <w:rPr>
+          <w:rFonts w:ascii="Consolas" w:eastAsia="Times New Roman" w:hAnsi="Consolas" w:cs="Times New Roman"/>
+          <w:color w:val="D19A66"/>
+          <w:sz w:val="21"/>
+          <w:szCs w:val="21"/>
+          <w:lang w:eastAsia="vi-VN"/>
+        </w:rPr>
+        <w:t>1</w:t>
+      </w:r>
+      <w:r>
+        <w:rPr>
+          <w:rFonts w:ascii="Consolas" w:eastAsia="Times New Roman" w:hAnsi="Consolas" w:cs="Times New Roman"/>
+          <w:color w:val="ABB2BF"/>
+          <w:sz w:val="21"/>
+          <w:szCs w:val="21"/>
+          <w:lang w:eastAsia="vi-VN"/>
+        </w:rPr>
+        <w:t>,</w:t>
+      </w:r>
+      <w:r>
+        <w:rPr>
+          <w:rFonts w:ascii="Consolas" w:eastAsia="Times New Roman" w:hAnsi="Consolas" w:cs="Times New Roman"/>
+          <w:color w:val="C678DD"/>
+          <w:sz w:val="21"/>
+          <w:szCs w:val="21"/>
+          <w:lang w:eastAsia="vi-VN"/>
+        </w:rPr>
+        <w:t>-</w:t>
+      </w:r>
+      <w:r>
+        <w:rPr>
+          <w:rFonts w:ascii="Consolas" w:eastAsia="Times New Roman" w:hAnsi="Consolas" w:cs="Times New Roman"/>
+          <w:color w:val="D19A66"/>
+          <w:sz w:val="21"/>
+          <w:szCs w:val="21"/>
+          <w:lang w:eastAsia="vi-VN"/>
+        </w:rPr>
+        <w:t>1</w:t>
+      </w:r>
+      <w:r>
+        <w:rPr>
+          <w:rFonts w:ascii="Consolas" w:eastAsia="Times New Roman" w:hAnsi="Consolas" w:cs="Times New Roman"/>
+          <w:color w:val="ABB2BF"/>
+          <w:sz w:val="21"/>
+          <w:szCs w:val="21"/>
+          <w:lang w:eastAsia="vi-VN"/>
+        </w:rPr>
+        <w:t>};</w:t>
+      </w:r>
+    </w:p>
+    <w:p>
+      <w:pPr>
+        <w:shd w:val="clear" w:color="auto" w:fill="282C34"/>
+        <w:spacing w:after="0" w:line="285" w:lineRule="atLeast"/>
+        <w:rPr>
+          <w:rFonts w:ascii="Consolas" w:eastAsia="Times New Roman" w:hAnsi="Consolas" w:cs="Times New Roman"/>
+          <w:color w:val="ABB2BF"/>
+          <w:sz w:val="21"/>
+          <w:szCs w:val="21"/>
+          <w:lang w:eastAsia="vi-VN"/>
+        </w:rPr>
+      </w:pPr>
+      <w:r>
+        <w:rPr>
+          <w:rFonts w:ascii="Consolas" w:eastAsia="Times New Roman" w:hAnsi="Consolas" w:cs="Times New Roman"/>
+          <w:color w:val="ABB2BF"/>
+          <w:sz w:val="21"/>
+          <w:szCs w:val="21"/>
+          <w:lang w:eastAsia="vi-VN"/>
+        </w:rPr>
+        <w:t xml:space="preserve">        </w:t>
+      </w:r>
+      <w:r>
+        <w:rPr>
+          <w:rFonts w:ascii="Consolas" w:eastAsia="Times New Roman" w:hAnsi="Consolas" w:cs="Times New Roman"/>
+          <w:color w:val="C678DD"/>
+          <w:sz w:val="21"/>
+          <w:szCs w:val="21"/>
+          <w:lang w:eastAsia="vi-VN"/>
+        </w:rPr>
+        <w:t>while</w:t>
+      </w:r>
+      <w:r>
+        <w:rPr>
+          <w:rFonts w:ascii="Consolas" w:eastAsia="Times New Roman" w:hAnsi="Consolas" w:cs="Times New Roman"/>
+          <w:color w:val="ABB2BF"/>
+          <w:sz w:val="21"/>
+          <w:szCs w:val="21"/>
+          <w:lang w:eastAsia="vi-VN"/>
+        </w:rPr>
+        <w:t>(</w:t>
+      </w:r>
+      <w:r>
+        <w:rPr>
+          <w:rFonts w:ascii="Consolas" w:eastAsia="Times New Roman" w:hAnsi="Consolas" w:cs="Times New Roman"/>
+          <w:color w:val="56B6C2"/>
+          <w:sz w:val="21"/>
+          <w:szCs w:val="21"/>
+          <w:lang w:eastAsia="vi-VN"/>
+        </w:rPr>
+        <w:t>!</w:t>
+      </w:r>
+      <w:r>
+        <w:rPr>
+          <w:rFonts w:ascii="Consolas" w:eastAsia="Times New Roman" w:hAnsi="Consolas" w:cs="Times New Roman"/>
+          <w:color w:val="E06C75"/>
+          <w:sz w:val="21"/>
+          <w:szCs w:val="21"/>
+          <w:lang w:eastAsia="vi-VN"/>
+        </w:rPr>
+        <w:t>pq</w:t>
+      </w:r>
+      <w:r>
+        <w:rPr>
+          <w:rFonts w:ascii="Consolas" w:eastAsia="Times New Roman" w:hAnsi="Consolas" w:cs="Times New Roman"/>
+          <w:color w:val="ABB2BF"/>
+          <w:sz w:val="21"/>
+          <w:szCs w:val="21"/>
+          <w:lang w:eastAsia="vi-VN"/>
+        </w:rPr>
+        <w:t>.</w:t>
+      </w:r>
+      <w:r>
+        <w:rPr>
+          <w:rFonts w:ascii="Consolas" w:eastAsia="Times New Roman" w:hAnsi="Consolas" w:cs="Times New Roman"/>
+          <w:color w:val="61AFEF"/>
+          <w:sz w:val="21"/>
+          <w:szCs w:val="21"/>
+          <w:lang w:eastAsia="vi-VN"/>
+        </w:rPr>
+        <w:t>empty</w:t>
+      </w:r>
+      <w:r>
+        <w:rPr>
+          <w:rFonts w:ascii="Consolas" w:eastAsia="Times New Roman" w:hAnsi="Consolas" w:cs="Times New Roman"/>
+          <w:color w:val="ABB2BF"/>
+          <w:sz w:val="21"/>
+          <w:szCs w:val="21"/>
+          <w:lang w:eastAsia="vi-VN"/>
+        </w:rPr>
+        <w:t>()){</w:t>
+      </w:r>
+    </w:p>
+    <w:p>
+      <w:pPr>
+        <w:shd w:val="clear" w:color="auto" w:fill="282C34"/>
+        <w:spacing w:after="0" w:line="285" w:lineRule="atLeast"/>
+        <w:rPr>
+          <w:rFonts w:ascii="Consolas" w:eastAsia="Times New Roman" w:hAnsi="Consolas" w:cs="Times New Roman"/>
+          <w:color w:val="ABB2BF"/>
+          <w:sz w:val="21"/>
+          <w:szCs w:val="21"/>
+          <w:lang w:eastAsia="vi-VN"/>
+        </w:rPr>
+      </w:pPr>
+      <w:r>
+        <w:rPr>
+          <w:rFonts w:ascii="Consolas" w:eastAsia="Times New Roman" w:hAnsi="Consolas" w:cs="Times New Roman"/>
+          <w:color w:val="ABB2BF"/>
+          <w:sz w:val="21"/>
+          <w:szCs w:val="21"/>
+          <w:lang w:eastAsia="vi-VN"/>
+        </w:rPr>
+        <w:t xml:space="preserve">            </w:t>
+      </w:r>
+      <w:r>
+        <w:rPr>
+          <w:rFonts w:ascii="Consolas" w:eastAsia="Times New Roman" w:hAnsi="Consolas" w:cs="Times New Roman"/>
+          <w:color w:val="C678DD"/>
+          <w:sz w:val="21"/>
+          <w:szCs w:val="21"/>
+          <w:lang w:eastAsia="vi-VN"/>
+        </w:rPr>
+        <w:t>int</w:t>
+      </w:r>
+      <w:r>
+        <w:rPr>
+          <w:rFonts w:ascii="Consolas" w:eastAsia="Times New Roman" w:hAnsi="Consolas" w:cs="Times New Roman"/>
+          <w:color w:val="ABB2BF"/>
+          <w:sz w:val="21"/>
+          <w:szCs w:val="21"/>
+          <w:lang w:eastAsia="vi-VN"/>
+        </w:rPr>
+        <w:t xml:space="preserve"> </w:t>
+      </w:r>
+      <w:r>
+        <w:rPr>
+          <w:rFonts w:ascii="Consolas" w:eastAsia="Times New Roman" w:hAnsi="Consolas" w:cs="Times New Roman"/>
+          <w:color w:val="E06C75"/>
+          <w:sz w:val="21"/>
+          <w:szCs w:val="21"/>
+          <w:lang w:eastAsia="vi-VN"/>
+        </w:rPr>
+        <w:t>size_pq</w:t>
+      </w:r>
+      <w:r>
+        <w:rPr>
+          <w:rFonts w:ascii="Consolas" w:eastAsia="Times New Roman" w:hAnsi="Consolas" w:cs="Times New Roman"/>
+          <w:color w:val="ABB2BF"/>
+          <w:sz w:val="21"/>
+          <w:szCs w:val="21"/>
+          <w:lang w:eastAsia="vi-VN"/>
+        </w:rPr>
+        <w:t xml:space="preserve"> </w:t>
+      </w:r>
+      <w:r>
+        <w:rPr>
+          <w:rFonts w:ascii="Consolas" w:eastAsia="Times New Roman" w:hAnsi="Consolas" w:cs="Times New Roman"/>
+          <w:color w:val="C678DD"/>
+          <w:sz w:val="21"/>
+          <w:szCs w:val="21"/>
+          <w:lang w:eastAsia="vi-VN"/>
+        </w:rPr>
+        <w:t>=</w:t>
+      </w:r>
+      <w:r>
+        <w:rPr>
+          <w:rFonts w:ascii="Consolas" w:eastAsia="Times New Roman" w:hAnsi="Consolas" w:cs="Times New Roman"/>
+          <w:color w:val="ABB2BF"/>
+          <w:sz w:val="21"/>
+          <w:szCs w:val="21"/>
+          <w:lang w:eastAsia="vi-VN"/>
+        </w:rPr>
+        <w:t xml:space="preserve"> (</w:t>
+      </w:r>
+      <w:r>
+        <w:rPr>
+          <w:rFonts w:ascii="Consolas" w:eastAsia="Times New Roman" w:hAnsi="Consolas" w:cs="Times New Roman"/>
+          <w:color w:val="C678DD"/>
+          <w:sz w:val="21"/>
+          <w:szCs w:val="21"/>
+          <w:lang w:eastAsia="vi-VN"/>
+        </w:rPr>
+        <w:t>int</w:t>
+      </w:r>
+      <w:r>
+        <w:rPr>
+          <w:rFonts w:ascii="Consolas" w:eastAsia="Times New Roman" w:hAnsi="Consolas" w:cs="Times New Roman"/>
+          <w:color w:val="ABB2BF"/>
+          <w:sz w:val="21"/>
+          <w:szCs w:val="21"/>
+          <w:lang w:eastAsia="vi-VN"/>
+        </w:rPr>
+        <w:t>)</w:t>
+      </w:r>
+      <w:r>
+        <w:rPr>
+          <w:rFonts w:ascii="Consolas" w:eastAsia="Times New Roman" w:hAnsi="Consolas" w:cs="Times New Roman"/>
+          <w:color w:val="E06C75"/>
+          <w:sz w:val="21"/>
+          <w:szCs w:val="21"/>
+          <w:lang w:eastAsia="vi-VN"/>
+        </w:rPr>
+        <w:t>pq</w:t>
+      </w:r>
+      <w:r>
+        <w:rPr>
+          <w:rFonts w:ascii="Consolas" w:eastAsia="Times New Roman" w:hAnsi="Consolas" w:cs="Times New Roman"/>
+          <w:color w:val="ABB2BF"/>
+          <w:sz w:val="21"/>
+          <w:szCs w:val="21"/>
+          <w:lang w:eastAsia="vi-VN"/>
+        </w:rPr>
+        <w:t>.</w:t>
+      </w:r>
+      <w:r>
+        <w:rPr>
+          <w:rFonts w:ascii="Consolas" w:eastAsia="Times New Roman" w:hAnsi="Consolas" w:cs="Times New Roman"/>
+          <w:color w:val="61AFEF"/>
+          <w:sz w:val="21"/>
+          <w:szCs w:val="21"/>
+          <w:lang w:eastAsia="vi-VN"/>
+        </w:rPr>
+        <w:t>size</w:t>
+      </w:r>
+      <w:r>
+        <w:rPr>
+          <w:rFonts w:ascii="Consolas" w:eastAsia="Times New Roman" w:hAnsi="Consolas" w:cs="Times New Roman"/>
+          <w:color w:val="ABB2BF"/>
+          <w:sz w:val="21"/>
+          <w:szCs w:val="21"/>
+          <w:lang w:eastAsia="vi-VN"/>
+        </w:rPr>
+        <w:t>();</w:t>
+      </w:r>
+    </w:p>
+    <w:p>
+      <w:pPr>
+        <w:shd w:val="clear" w:color="auto" w:fill="282C34"/>
+        <w:spacing w:after="0" w:line="285" w:lineRule="atLeast"/>
+        <w:rPr>
+          <w:rFonts w:ascii="Consolas" w:eastAsia="Times New Roman" w:hAnsi="Consolas" w:cs="Times New Roman"/>
+          <w:color w:val="ABB2BF"/>
+          <w:sz w:val="21"/>
+          <w:szCs w:val="21"/>
+          <w:lang w:eastAsia="vi-VN"/>
+        </w:rPr>
+      </w:pPr>
+      <w:r>
+        <w:rPr>
+          <w:rFonts w:ascii="Consolas" w:eastAsia="Times New Roman" w:hAnsi="Consolas" w:cs="Times New Roman"/>
+          <w:color w:val="ABB2BF"/>
+          <w:sz w:val="21"/>
+          <w:szCs w:val="21"/>
+          <w:lang w:eastAsia="vi-VN"/>
+        </w:rPr>
+        <w:t xml:space="preserve">            </w:t>
+      </w:r>
+      <w:r>
+        <w:rPr>
+          <w:rFonts w:ascii="Consolas" w:eastAsia="Times New Roman" w:hAnsi="Consolas" w:cs="Times New Roman"/>
+          <w:color w:val="C678DD"/>
+          <w:sz w:val="21"/>
+          <w:szCs w:val="21"/>
+          <w:lang w:eastAsia="vi-VN"/>
+        </w:rPr>
+        <w:t>bool</w:t>
+      </w:r>
+      <w:r>
+        <w:rPr>
+          <w:rFonts w:ascii="Consolas" w:eastAsia="Times New Roman" w:hAnsi="Consolas" w:cs="Times New Roman"/>
+          <w:color w:val="ABB2BF"/>
+          <w:sz w:val="21"/>
+          <w:szCs w:val="21"/>
+          <w:lang w:eastAsia="vi-VN"/>
+        </w:rPr>
+        <w:t xml:space="preserve"> </w:t>
+      </w:r>
+      <w:r>
+        <w:rPr>
+          <w:rFonts w:ascii="Consolas" w:eastAsia="Times New Roman" w:hAnsi="Consolas" w:cs="Times New Roman"/>
+          <w:color w:val="E06C75"/>
+          <w:sz w:val="21"/>
+          <w:szCs w:val="21"/>
+          <w:lang w:eastAsia="vi-VN"/>
+        </w:rPr>
+        <w:t>check</w:t>
+      </w:r>
+      <w:r>
+        <w:rPr>
+          <w:rFonts w:ascii="Consolas" w:eastAsia="Times New Roman" w:hAnsi="Consolas" w:cs="Times New Roman"/>
+          <w:color w:val="ABB2BF"/>
+          <w:sz w:val="21"/>
+          <w:szCs w:val="21"/>
+          <w:lang w:eastAsia="vi-VN"/>
+        </w:rPr>
+        <w:t xml:space="preserve"> </w:t>
+      </w:r>
+      <w:r>
+        <w:rPr>
+          <w:rFonts w:ascii="Consolas" w:eastAsia="Times New Roman" w:hAnsi="Consolas" w:cs="Times New Roman"/>
+          <w:color w:val="C678DD"/>
+          <w:sz w:val="21"/>
+          <w:szCs w:val="21"/>
+          <w:lang w:eastAsia="vi-VN"/>
+        </w:rPr>
+        <w:t>=</w:t>
+      </w:r>
+      <w:r>
+        <w:rPr>
+          <w:rFonts w:ascii="Consolas" w:eastAsia="Times New Roman" w:hAnsi="Consolas" w:cs="Times New Roman"/>
+          <w:color w:val="ABB2BF"/>
+          <w:sz w:val="21"/>
+          <w:szCs w:val="21"/>
+          <w:lang w:eastAsia="vi-VN"/>
+        </w:rPr>
+        <w:t xml:space="preserve"> </w:t>
+      </w:r>
+      <w:r>
+        <w:rPr>
+          <w:rFonts w:ascii="Consolas" w:eastAsia="Times New Roman" w:hAnsi="Consolas" w:cs="Times New Roman"/>
+          <w:color w:val="D19A66"/>
+          <w:sz w:val="21"/>
+          <w:szCs w:val="21"/>
+          <w:lang w:eastAsia="vi-VN"/>
+        </w:rPr>
+        <w:t>false</w:t>
+      </w:r>
+      <w:r>
+        <w:rPr>
+          <w:rFonts w:ascii="Consolas" w:eastAsia="Times New Roman" w:hAnsi="Consolas" w:cs="Times New Roman"/>
+          <w:color w:val="ABB2BF"/>
+          <w:sz w:val="21"/>
+          <w:szCs w:val="21"/>
+          <w:lang w:eastAsia="vi-VN"/>
+        </w:rPr>
+        <w:t xml:space="preserve"> ;</w:t>
+      </w:r>
+    </w:p>
+    <w:p>
+      <w:pPr>
+        <w:shd w:val="clear" w:color="auto" w:fill="282C34"/>
+        <w:spacing w:after="0" w:line="285" w:lineRule="atLeast"/>
+        <w:rPr>
+          <w:rFonts w:ascii="Consolas" w:eastAsia="Times New Roman" w:hAnsi="Consolas" w:cs="Times New Roman"/>
+          <w:color w:val="ABB2BF"/>
+          <w:sz w:val="21"/>
+          <w:szCs w:val="21"/>
+          <w:lang w:eastAsia="vi-VN"/>
+        </w:rPr>
+      </w:pPr>
+      <w:r>
+        <w:rPr>
+          <w:rFonts w:ascii="Consolas" w:eastAsia="Times New Roman" w:hAnsi="Consolas" w:cs="Times New Roman"/>
+          <w:color w:val="ABB2BF"/>
+          <w:sz w:val="21"/>
+          <w:szCs w:val="21"/>
+          <w:lang w:eastAsia="vi-VN"/>
+        </w:rPr>
+        <w:t xml:space="preserve">            </w:t>
+      </w:r>
+      <w:r>
+        <w:rPr>
+          <w:rFonts w:ascii="Consolas" w:eastAsia="Times New Roman" w:hAnsi="Consolas" w:cs="Times New Roman"/>
+          <w:color w:val="C678DD"/>
+          <w:sz w:val="21"/>
+          <w:szCs w:val="21"/>
+          <w:lang w:eastAsia="vi-VN"/>
+        </w:rPr>
+        <w:t>for</w:t>
+      </w:r>
+      <w:r>
+        <w:rPr>
+          <w:rFonts w:ascii="Consolas" w:eastAsia="Times New Roman" w:hAnsi="Consolas" w:cs="Times New Roman"/>
+          <w:color w:val="ABB2BF"/>
+          <w:sz w:val="21"/>
+          <w:szCs w:val="21"/>
+          <w:lang w:eastAsia="vi-VN"/>
+        </w:rPr>
+        <w:t>(</w:t>
+      </w:r>
+      <w:r>
+        <w:rPr>
+          <w:rFonts w:ascii="Consolas" w:eastAsia="Times New Roman" w:hAnsi="Consolas" w:cs="Times New Roman"/>
+          <w:color w:val="C678DD"/>
+          <w:sz w:val="21"/>
+          <w:szCs w:val="21"/>
+          <w:lang w:eastAsia="vi-VN"/>
+        </w:rPr>
+        <w:t>int</w:t>
+      </w:r>
+      <w:r>
+        <w:rPr>
+          <w:rFonts w:ascii="Consolas" w:eastAsia="Times New Roman" w:hAnsi="Consolas" w:cs="Times New Roman"/>
+          <w:color w:val="ABB2BF"/>
+          <w:sz w:val="21"/>
+          <w:szCs w:val="21"/>
+          <w:lang w:eastAsia="vi-VN"/>
+        </w:rPr>
+        <w:t xml:space="preserve"> </w:t>
+      </w:r>
+      <w:r>
+        <w:rPr>
+          <w:rFonts w:ascii="Consolas" w:eastAsia="Times New Roman" w:hAnsi="Consolas" w:cs="Times New Roman"/>
+          <w:color w:val="E06C75"/>
+          <w:sz w:val="21"/>
+          <w:szCs w:val="21"/>
+          <w:lang w:eastAsia="vi-VN"/>
+        </w:rPr>
+        <w:t>i</w:t>
+      </w:r>
+      <w:r>
+        <w:rPr>
+          <w:rFonts w:ascii="Consolas" w:eastAsia="Times New Roman" w:hAnsi="Consolas" w:cs="Times New Roman"/>
+          <w:color w:val="C678DD"/>
+          <w:sz w:val="21"/>
+          <w:szCs w:val="21"/>
+          <w:lang w:eastAsia="vi-VN"/>
+        </w:rPr>
+        <w:t>=</w:t>
+      </w:r>
+      <w:r>
+        <w:rPr>
+          <w:rFonts w:ascii="Consolas" w:eastAsia="Times New Roman" w:hAnsi="Consolas" w:cs="Times New Roman"/>
+          <w:color w:val="D19A66"/>
+          <w:sz w:val="21"/>
+          <w:szCs w:val="21"/>
+          <w:lang w:eastAsia="vi-VN"/>
+        </w:rPr>
+        <w:t>0</w:t>
+      </w:r>
+      <w:r>
+        <w:rPr>
+          <w:rFonts w:ascii="Consolas" w:eastAsia="Times New Roman" w:hAnsi="Consolas" w:cs="Times New Roman"/>
+          <w:color w:val="ABB2BF"/>
+          <w:sz w:val="21"/>
+          <w:szCs w:val="21"/>
+          <w:lang w:eastAsia="vi-VN"/>
+        </w:rPr>
+        <w:t xml:space="preserve"> ; </w:t>
+      </w:r>
+      <w:r>
+        <w:rPr>
+          <w:rFonts w:ascii="Consolas" w:eastAsia="Times New Roman" w:hAnsi="Consolas" w:cs="Times New Roman"/>
+          <w:color w:val="E06C75"/>
+          <w:sz w:val="21"/>
+          <w:szCs w:val="21"/>
+          <w:lang w:eastAsia="vi-VN"/>
+        </w:rPr>
+        <w:t>i</w:t>
+      </w:r>
+      <w:r>
+        <w:rPr>
+          <w:rFonts w:ascii="Consolas" w:eastAsia="Times New Roman" w:hAnsi="Consolas" w:cs="Times New Roman"/>
+          <w:color w:val="C678DD"/>
+          <w:sz w:val="21"/>
+          <w:szCs w:val="21"/>
+          <w:lang w:eastAsia="vi-VN"/>
+        </w:rPr>
+        <w:t>&lt;</w:t>
+      </w:r>
+      <w:r>
+        <w:rPr>
+          <w:rFonts w:ascii="Consolas" w:eastAsia="Times New Roman" w:hAnsi="Consolas" w:cs="Times New Roman"/>
+          <w:color w:val="E06C75"/>
+          <w:sz w:val="21"/>
+          <w:szCs w:val="21"/>
+          <w:lang w:eastAsia="vi-VN"/>
+        </w:rPr>
+        <w:t>size_pq</w:t>
+      </w:r>
+      <w:r>
+        <w:rPr>
+          <w:rFonts w:ascii="Consolas" w:eastAsia="Times New Roman" w:hAnsi="Consolas" w:cs="Times New Roman"/>
+          <w:color w:val="ABB2BF"/>
+          <w:sz w:val="21"/>
+          <w:szCs w:val="21"/>
+          <w:lang w:eastAsia="vi-VN"/>
+        </w:rPr>
+        <w:t xml:space="preserve"> ; </w:t>
+      </w:r>
+      <w:r>
+        <w:rPr>
+          <w:rFonts w:ascii="Consolas" w:eastAsia="Times New Roman" w:hAnsi="Consolas" w:cs="Times New Roman"/>
+          <w:color w:val="E06C75"/>
+          <w:sz w:val="21"/>
+          <w:szCs w:val="21"/>
+          <w:lang w:eastAsia="vi-VN"/>
+        </w:rPr>
+        <w:t>i</w:t>
+      </w:r>
+      <w:r>
+        <w:rPr>
+          <w:rFonts w:ascii="Consolas" w:eastAsia="Times New Roman" w:hAnsi="Consolas" w:cs="Times New Roman"/>
+          <w:color w:val="C678DD"/>
+          <w:sz w:val="21"/>
+          <w:szCs w:val="21"/>
+          <w:lang w:eastAsia="vi-VN"/>
+        </w:rPr>
+        <w:t>++</w:t>
+      </w:r>
+      <w:r>
+        <w:rPr>
+          <w:rFonts w:ascii="Consolas" w:eastAsia="Times New Roman" w:hAnsi="Consolas" w:cs="Times New Roman"/>
+          <w:color w:val="ABB2BF"/>
+          <w:sz w:val="21"/>
+          <w:szCs w:val="21"/>
+          <w:lang w:eastAsia="vi-VN"/>
+        </w:rPr>
+        <w:t>){</w:t>
+      </w:r>
+    </w:p>
+    <w:p>
+      <w:pPr>
+        <w:shd w:val="clear" w:color="auto" w:fill="282C34"/>
+        <w:spacing w:after="0" w:line="285" w:lineRule="atLeast"/>
+        <w:rPr>
+          <w:rFonts w:ascii="Consolas" w:eastAsia="Times New Roman" w:hAnsi="Consolas" w:cs="Times New Roman"/>
+          <w:color w:val="ABB2BF"/>
+          <w:sz w:val="21"/>
+          <w:szCs w:val="21"/>
+          <w:lang w:eastAsia="vi-VN"/>
+        </w:rPr>
+      </w:pPr>
+      <w:r>
+        <w:rPr>
+          <w:rFonts w:ascii="Consolas" w:eastAsia="Times New Roman" w:hAnsi="Consolas" w:cs="Times New Roman"/>
+          <w:color w:val="ABB2BF"/>
+          <w:sz w:val="21"/>
+          <w:szCs w:val="21"/>
+          <w:lang w:eastAsia="vi-VN"/>
+        </w:rPr>
+        <w:t xml:space="preserve">                </w:t>
+      </w:r>
+      <w:r>
+        <w:rPr>
+          <w:rFonts w:ascii="Consolas" w:eastAsia="Times New Roman" w:hAnsi="Consolas" w:cs="Times New Roman"/>
+          <w:color w:val="C678DD"/>
+          <w:sz w:val="21"/>
+          <w:szCs w:val="21"/>
+          <w:lang w:eastAsia="vi-VN"/>
+        </w:rPr>
+        <w:t>auto</w:t>
+      </w:r>
+      <w:r>
+        <w:rPr>
+          <w:rFonts w:ascii="Consolas" w:eastAsia="Times New Roman" w:hAnsi="Consolas" w:cs="Times New Roman"/>
+          <w:color w:val="ABB2BF"/>
+          <w:sz w:val="21"/>
+          <w:szCs w:val="21"/>
+          <w:lang w:eastAsia="vi-VN"/>
+        </w:rPr>
+        <w:t xml:space="preserve"> [</w:t>
+      </w:r>
+      <w:r>
+        <w:rPr>
+          <w:rFonts w:ascii="Consolas" w:eastAsia="Times New Roman" w:hAnsi="Consolas" w:cs="Times New Roman"/>
+          <w:color w:val="E06C75"/>
+          <w:sz w:val="21"/>
+          <w:szCs w:val="21"/>
+          <w:lang w:eastAsia="vi-VN"/>
+        </w:rPr>
+        <w:t>x</w:t>
+      </w:r>
+      <w:r>
+        <w:rPr>
+          <w:rFonts w:ascii="Consolas" w:eastAsia="Times New Roman" w:hAnsi="Consolas" w:cs="Times New Roman"/>
+          <w:color w:val="ABB2BF"/>
+          <w:sz w:val="21"/>
+          <w:szCs w:val="21"/>
+          <w:lang w:eastAsia="vi-VN"/>
+        </w:rPr>
+        <w:t>,</w:t>
+      </w:r>
+      <w:r>
+        <w:rPr>
+          <w:rFonts w:ascii="Consolas" w:eastAsia="Times New Roman" w:hAnsi="Consolas" w:cs="Times New Roman"/>
+          <w:color w:val="E06C75"/>
+          <w:sz w:val="21"/>
+          <w:szCs w:val="21"/>
+          <w:lang w:eastAsia="vi-VN"/>
+        </w:rPr>
+        <w:t>y</w:t>
+      </w:r>
+      <w:r>
+        <w:rPr>
+          <w:rFonts w:ascii="Consolas" w:eastAsia="Times New Roman" w:hAnsi="Consolas" w:cs="Times New Roman"/>
+          <w:color w:val="ABB2BF"/>
+          <w:sz w:val="21"/>
+          <w:szCs w:val="21"/>
+          <w:lang w:eastAsia="vi-VN"/>
+        </w:rPr>
+        <w:t xml:space="preserve">] </w:t>
+      </w:r>
+      <w:r>
+        <w:rPr>
+          <w:rFonts w:ascii="Consolas" w:eastAsia="Times New Roman" w:hAnsi="Consolas" w:cs="Times New Roman"/>
+          <w:color w:val="C678DD"/>
+          <w:sz w:val="21"/>
+          <w:szCs w:val="21"/>
+          <w:lang w:eastAsia="vi-VN"/>
+        </w:rPr>
+        <w:t>=</w:t>
+      </w:r>
+      <w:r>
+        <w:rPr>
+          <w:rFonts w:ascii="Consolas" w:eastAsia="Times New Roman" w:hAnsi="Consolas" w:cs="Times New Roman"/>
+          <w:color w:val="ABB2BF"/>
+          <w:sz w:val="21"/>
+          <w:szCs w:val="21"/>
+          <w:lang w:eastAsia="vi-VN"/>
+        </w:rPr>
+        <w:t xml:space="preserve"> </w:t>
+      </w:r>
+      <w:r>
+        <w:rPr>
+          <w:rFonts w:ascii="Consolas" w:eastAsia="Times New Roman" w:hAnsi="Consolas" w:cs="Times New Roman"/>
+          <w:color w:val="E06C75"/>
+          <w:sz w:val="21"/>
+          <w:szCs w:val="21"/>
+          <w:lang w:eastAsia="vi-VN"/>
+        </w:rPr>
+        <w:t>pq</w:t>
+      </w:r>
+      <w:r>
+        <w:rPr>
+          <w:rFonts w:ascii="Consolas" w:eastAsia="Times New Roman" w:hAnsi="Consolas" w:cs="Times New Roman"/>
+          <w:color w:val="ABB2BF"/>
+          <w:sz w:val="21"/>
+          <w:szCs w:val="21"/>
+          <w:lang w:eastAsia="vi-VN"/>
+        </w:rPr>
+        <w:t>.</w:t>
+      </w:r>
+      <w:r>
+        <w:rPr>
+          <w:rFonts w:ascii="Consolas" w:eastAsia="Times New Roman" w:hAnsi="Consolas" w:cs="Times New Roman"/>
+          <w:color w:val="61AFEF"/>
+          <w:sz w:val="21"/>
+          <w:szCs w:val="21"/>
+          <w:lang w:eastAsia="vi-VN"/>
+        </w:rPr>
+        <w:t>front</w:t>
+      </w:r>
+      <w:r>
+        <w:rPr>
+          <w:rFonts w:ascii="Consolas" w:eastAsia="Times New Roman" w:hAnsi="Consolas" w:cs="Times New Roman"/>
+          <w:color w:val="ABB2BF"/>
+          <w:sz w:val="21"/>
+          <w:szCs w:val="21"/>
+          <w:lang w:eastAsia="vi-VN"/>
+        </w:rPr>
+        <w:t xml:space="preserve">() ; </w:t>
+      </w:r>
+      <w:r>
+        <w:rPr>
+          <w:rFonts w:ascii="Consolas" w:eastAsia="Times New Roman" w:hAnsi="Consolas" w:cs="Times New Roman"/>
+          <w:color w:val="E06C75"/>
+          <w:sz w:val="21"/>
+          <w:szCs w:val="21"/>
+          <w:lang w:eastAsia="vi-VN"/>
+        </w:rPr>
+        <w:t>pq</w:t>
+      </w:r>
+      <w:r>
+        <w:rPr>
+          <w:rFonts w:ascii="Consolas" w:eastAsia="Times New Roman" w:hAnsi="Consolas" w:cs="Times New Roman"/>
+          <w:color w:val="ABB2BF"/>
+          <w:sz w:val="21"/>
+          <w:szCs w:val="21"/>
+          <w:lang w:eastAsia="vi-VN"/>
+        </w:rPr>
+        <w:t>.</w:t>
+      </w:r>
+      <w:r>
+        <w:rPr>
+          <w:rFonts w:ascii="Consolas" w:eastAsia="Times New Roman" w:hAnsi="Consolas" w:cs="Times New Roman"/>
+          <w:color w:val="61AFEF"/>
+          <w:sz w:val="21"/>
+          <w:szCs w:val="21"/>
+          <w:lang w:eastAsia="vi-VN"/>
+        </w:rPr>
+        <w:t>pop</w:t>
+      </w:r>
+      <w:r>
+        <w:rPr>
+          <w:rFonts w:ascii="Consolas" w:eastAsia="Times New Roman" w:hAnsi="Consolas" w:cs="Times New Roman"/>
+          <w:color w:val="ABB2BF"/>
+          <w:sz w:val="21"/>
+          <w:szCs w:val="21"/>
+          <w:lang w:eastAsia="vi-VN"/>
+        </w:rPr>
+        <w:t>();</w:t>
+      </w:r>
+    </w:p>
+    <w:p>
+      <w:pPr>
+        <w:shd w:val="clear" w:color="auto" w:fill="282C34"/>
+        <w:spacing w:after="0" w:line="285" w:lineRule="atLeast"/>
+        <w:rPr>
+          <w:rFonts w:ascii="Consolas" w:eastAsia="Times New Roman" w:hAnsi="Consolas" w:cs="Times New Roman"/>
+          <w:color w:val="ABB2BF"/>
+          <w:sz w:val="21"/>
+          <w:szCs w:val="21"/>
+          <w:lang w:eastAsia="vi-VN"/>
+        </w:rPr>
+      </w:pPr>
+      <w:r>
+        <w:rPr>
+          <w:rFonts w:ascii="Consolas" w:eastAsia="Times New Roman" w:hAnsi="Consolas" w:cs="Times New Roman"/>
+          <w:color w:val="ABB2BF"/>
+          <w:sz w:val="21"/>
+          <w:szCs w:val="21"/>
+          <w:lang w:eastAsia="vi-VN"/>
+        </w:rPr>
+        <w:t xml:space="preserve">                </w:t>
+      </w:r>
+      <w:r>
+        <w:rPr>
+          <w:rFonts w:ascii="Consolas" w:eastAsia="Times New Roman" w:hAnsi="Consolas" w:cs="Times New Roman"/>
+          <w:color w:val="C678DD"/>
+          <w:sz w:val="21"/>
+          <w:szCs w:val="21"/>
+          <w:lang w:eastAsia="vi-VN"/>
+        </w:rPr>
+        <w:t>for</w:t>
+      </w:r>
+      <w:r>
+        <w:rPr>
+          <w:rFonts w:ascii="Consolas" w:eastAsia="Times New Roman" w:hAnsi="Consolas" w:cs="Times New Roman"/>
+          <w:color w:val="ABB2BF"/>
+          <w:sz w:val="21"/>
+          <w:szCs w:val="21"/>
+          <w:lang w:eastAsia="vi-VN"/>
+        </w:rPr>
+        <w:t>(</w:t>
+      </w:r>
+      <w:r>
+        <w:rPr>
+          <w:rFonts w:ascii="Consolas" w:eastAsia="Times New Roman" w:hAnsi="Consolas" w:cs="Times New Roman"/>
+          <w:color w:val="C678DD"/>
+          <w:sz w:val="21"/>
+          <w:szCs w:val="21"/>
+          <w:lang w:eastAsia="vi-VN"/>
+        </w:rPr>
+        <w:t>int</w:t>
+      </w:r>
+      <w:r>
+        <w:rPr>
+          <w:rFonts w:ascii="Consolas" w:eastAsia="Times New Roman" w:hAnsi="Consolas" w:cs="Times New Roman"/>
+          <w:color w:val="ABB2BF"/>
+          <w:sz w:val="21"/>
+          <w:szCs w:val="21"/>
+          <w:lang w:eastAsia="vi-VN"/>
+        </w:rPr>
+        <w:t xml:space="preserve"> </w:t>
+      </w:r>
+      <w:r>
+        <w:rPr>
+          <w:rFonts w:ascii="Consolas" w:eastAsia="Times New Roman" w:hAnsi="Consolas" w:cs="Times New Roman"/>
+          <w:color w:val="E06C75"/>
+          <w:sz w:val="21"/>
+          <w:szCs w:val="21"/>
+          <w:lang w:eastAsia="vi-VN"/>
+        </w:rPr>
+        <w:t>k</w:t>
+      </w:r>
+      <w:r>
+        <w:rPr>
+          <w:rFonts w:ascii="Consolas" w:eastAsia="Times New Roman" w:hAnsi="Consolas" w:cs="Times New Roman"/>
+          <w:color w:val="C678DD"/>
+          <w:sz w:val="21"/>
+          <w:szCs w:val="21"/>
+          <w:lang w:eastAsia="vi-VN"/>
+        </w:rPr>
+        <w:t>=</w:t>
+      </w:r>
+      <w:r>
+        <w:rPr>
+          <w:rFonts w:ascii="Consolas" w:eastAsia="Times New Roman" w:hAnsi="Consolas" w:cs="Times New Roman"/>
+          <w:color w:val="D19A66"/>
+          <w:sz w:val="21"/>
+          <w:szCs w:val="21"/>
+          <w:lang w:eastAsia="vi-VN"/>
+        </w:rPr>
+        <w:t>0</w:t>
+      </w:r>
+      <w:r>
+        <w:rPr>
+          <w:rFonts w:ascii="Consolas" w:eastAsia="Times New Roman" w:hAnsi="Consolas" w:cs="Times New Roman"/>
+          <w:color w:val="ABB2BF"/>
+          <w:sz w:val="21"/>
+          <w:szCs w:val="21"/>
+          <w:lang w:eastAsia="vi-VN"/>
+        </w:rPr>
+        <w:t xml:space="preserve"> ; </w:t>
+      </w:r>
+      <w:r>
+        <w:rPr>
+          <w:rFonts w:ascii="Consolas" w:eastAsia="Times New Roman" w:hAnsi="Consolas" w:cs="Times New Roman"/>
+          <w:color w:val="E06C75"/>
+          <w:sz w:val="21"/>
+          <w:szCs w:val="21"/>
+          <w:lang w:eastAsia="vi-VN"/>
+        </w:rPr>
+        <w:t>k</w:t>
+      </w:r>
+      <w:r>
+        <w:rPr>
+          <w:rFonts w:ascii="Consolas" w:eastAsia="Times New Roman" w:hAnsi="Consolas" w:cs="Times New Roman"/>
+          <w:color w:val="C678DD"/>
+          <w:sz w:val="21"/>
+          <w:szCs w:val="21"/>
+          <w:lang w:eastAsia="vi-VN"/>
+        </w:rPr>
+        <w:t>&lt;</w:t>
+      </w:r>
+      <w:r>
+        <w:rPr>
+          <w:rFonts w:ascii="Consolas" w:eastAsia="Times New Roman" w:hAnsi="Consolas" w:cs="Times New Roman"/>
+          <w:color w:val="D19A66"/>
+          <w:sz w:val="21"/>
+          <w:szCs w:val="21"/>
+          <w:lang w:eastAsia="vi-VN"/>
+        </w:rPr>
+        <w:t>4</w:t>
+      </w:r>
+      <w:r>
+        <w:rPr>
+          <w:rFonts w:ascii="Consolas" w:eastAsia="Times New Roman" w:hAnsi="Consolas" w:cs="Times New Roman"/>
+          <w:color w:val="ABB2BF"/>
+          <w:sz w:val="21"/>
+          <w:szCs w:val="21"/>
+          <w:lang w:eastAsia="vi-VN"/>
+        </w:rPr>
+        <w:t xml:space="preserve"> ; </w:t>
+      </w:r>
+      <w:r>
+        <w:rPr>
+          <w:rFonts w:ascii="Consolas" w:eastAsia="Times New Roman" w:hAnsi="Consolas" w:cs="Times New Roman"/>
+          <w:color w:val="E06C75"/>
+          <w:sz w:val="21"/>
+          <w:szCs w:val="21"/>
+          <w:lang w:eastAsia="vi-VN"/>
+        </w:rPr>
+        <w:t>k</w:t>
+      </w:r>
+      <w:r>
+        <w:rPr>
+          <w:rFonts w:ascii="Consolas" w:eastAsia="Times New Roman" w:hAnsi="Consolas" w:cs="Times New Roman"/>
+          <w:color w:val="C678DD"/>
+          <w:sz w:val="21"/>
+          <w:szCs w:val="21"/>
+          <w:lang w:eastAsia="vi-VN"/>
+        </w:rPr>
+        <w:t>++</w:t>
+      </w:r>
+      <w:r>
+        <w:rPr>
+          <w:rFonts w:ascii="Consolas" w:eastAsia="Times New Roman" w:hAnsi="Consolas" w:cs="Times New Roman"/>
+          <w:color w:val="ABB2BF"/>
+          <w:sz w:val="21"/>
+          <w:szCs w:val="21"/>
+          <w:lang w:eastAsia="vi-VN"/>
+        </w:rPr>
+        <w:t>){</w:t>
+      </w:r>
+    </w:p>
+    <w:p>
+      <w:pPr>
+        <w:shd w:val="clear" w:color="auto" w:fill="282C34"/>
+        <w:spacing w:after="0" w:line="285" w:lineRule="atLeast"/>
+        <w:rPr>
+          <w:rFonts w:ascii="Consolas" w:eastAsia="Times New Roman" w:hAnsi="Consolas" w:cs="Times New Roman"/>
+          <w:color w:val="ABB2BF"/>
+          <w:sz w:val="21"/>
+          <w:szCs w:val="21"/>
+          <w:lang w:eastAsia="vi-VN"/>
+        </w:rPr>
+      </w:pPr>
+      <w:r>
+        <w:rPr>
+          <w:rFonts w:ascii="Consolas" w:eastAsia="Times New Roman" w:hAnsi="Consolas" w:cs="Times New Roman"/>
+          <w:color w:val="ABB2BF"/>
+          <w:sz w:val="21"/>
+          <w:szCs w:val="21"/>
+          <w:lang w:eastAsia="vi-VN"/>
+        </w:rPr>
+        <w:t xml:space="preserve">                    </w:t>
+      </w:r>
+      <w:r>
+        <w:rPr>
+          <w:rFonts w:ascii="Consolas" w:eastAsia="Times New Roman" w:hAnsi="Consolas" w:cs="Times New Roman"/>
+          <w:color w:val="C678DD"/>
+          <w:sz w:val="21"/>
+          <w:szCs w:val="21"/>
+          <w:lang w:eastAsia="vi-VN"/>
+        </w:rPr>
+        <w:t>int</w:t>
+      </w:r>
+      <w:r>
+        <w:rPr>
+          <w:rFonts w:ascii="Consolas" w:eastAsia="Times New Roman" w:hAnsi="Consolas" w:cs="Times New Roman"/>
+          <w:color w:val="ABB2BF"/>
+          <w:sz w:val="21"/>
+          <w:szCs w:val="21"/>
+          <w:lang w:eastAsia="vi-VN"/>
+        </w:rPr>
+        <w:t xml:space="preserve"> </w:t>
+      </w:r>
+      <w:r>
+        <w:rPr>
+          <w:rFonts w:ascii="Consolas" w:eastAsia="Times New Roman" w:hAnsi="Consolas" w:cs="Times New Roman"/>
+          <w:color w:val="E06C75"/>
+          <w:sz w:val="21"/>
+          <w:szCs w:val="21"/>
+          <w:lang w:eastAsia="vi-VN"/>
+        </w:rPr>
+        <w:t>nx</w:t>
+      </w:r>
+      <w:r>
+        <w:rPr>
+          <w:rFonts w:ascii="Consolas" w:eastAsia="Times New Roman" w:hAnsi="Consolas" w:cs="Times New Roman"/>
+          <w:color w:val="ABB2BF"/>
+          <w:sz w:val="21"/>
+          <w:szCs w:val="21"/>
+          <w:lang w:eastAsia="vi-VN"/>
+        </w:rPr>
+        <w:t xml:space="preserve"> </w:t>
+      </w:r>
+      <w:r>
+        <w:rPr>
+          <w:rFonts w:ascii="Consolas" w:eastAsia="Times New Roman" w:hAnsi="Consolas" w:cs="Times New Roman"/>
+          <w:color w:val="C678DD"/>
+          <w:sz w:val="21"/>
+          <w:szCs w:val="21"/>
+          <w:lang w:eastAsia="vi-VN"/>
+        </w:rPr>
+        <w:t>=</w:t>
+      </w:r>
+      <w:r>
+        <w:rPr>
+          <w:rFonts w:ascii="Consolas" w:eastAsia="Times New Roman" w:hAnsi="Consolas" w:cs="Times New Roman"/>
+          <w:color w:val="ABB2BF"/>
+          <w:sz w:val="21"/>
+          <w:szCs w:val="21"/>
+          <w:lang w:eastAsia="vi-VN"/>
+        </w:rPr>
+        <w:t xml:space="preserve"> </w:t>
+      </w:r>
+      <w:r>
+        <w:rPr>
+          <w:rFonts w:ascii="Consolas" w:eastAsia="Times New Roman" w:hAnsi="Consolas" w:cs="Times New Roman"/>
+          <w:color w:val="E06C75"/>
+          <w:sz w:val="21"/>
+          <w:szCs w:val="21"/>
+          <w:lang w:eastAsia="vi-VN"/>
+        </w:rPr>
+        <w:t>x</w:t>
+      </w:r>
+      <w:r>
+        <w:rPr>
+          <w:rFonts w:ascii="Consolas" w:eastAsia="Times New Roman" w:hAnsi="Consolas" w:cs="Times New Roman"/>
+          <w:color w:val="ABB2BF"/>
+          <w:sz w:val="21"/>
+          <w:szCs w:val="21"/>
+          <w:lang w:eastAsia="vi-VN"/>
+        </w:rPr>
+        <w:t xml:space="preserve"> </w:t>
+      </w:r>
+      <w:r>
+        <w:rPr>
+          <w:rFonts w:ascii="Consolas" w:eastAsia="Times New Roman" w:hAnsi="Consolas" w:cs="Times New Roman"/>
+          <w:color w:val="C678DD"/>
+          <w:sz w:val="21"/>
+          <w:szCs w:val="21"/>
+          <w:lang w:eastAsia="vi-VN"/>
+        </w:rPr>
+        <w:t>+</w:t>
+      </w:r>
+      <w:r>
+        <w:rPr>
+          <w:rFonts w:ascii="Consolas" w:eastAsia="Times New Roman" w:hAnsi="Consolas" w:cs="Times New Roman"/>
+          <w:color w:val="ABB2BF"/>
+          <w:sz w:val="21"/>
+          <w:szCs w:val="21"/>
+          <w:lang w:eastAsia="vi-VN"/>
+        </w:rPr>
+        <w:t xml:space="preserve"> </w:t>
+      </w:r>
+      <w:r>
+        <w:rPr>
+          <w:rFonts w:ascii="Consolas" w:eastAsia="Times New Roman" w:hAnsi="Consolas" w:cs="Times New Roman"/>
+          <w:color w:val="E06C75"/>
+          <w:sz w:val="21"/>
+          <w:szCs w:val="21"/>
+          <w:lang w:eastAsia="vi-VN"/>
+        </w:rPr>
+        <w:t>xx</w:t>
+      </w:r>
+      <w:r>
+        <w:rPr>
+          <w:rFonts w:ascii="Consolas" w:eastAsia="Times New Roman" w:hAnsi="Consolas" w:cs="Times New Roman"/>
+          <w:color w:val="ABB2BF"/>
+          <w:sz w:val="21"/>
+          <w:szCs w:val="21"/>
+          <w:lang w:eastAsia="vi-VN"/>
+        </w:rPr>
+        <w:t>[</w:t>
+      </w:r>
+      <w:r>
+        <w:rPr>
+          <w:rFonts w:ascii="Consolas" w:eastAsia="Times New Roman" w:hAnsi="Consolas" w:cs="Times New Roman"/>
+          <w:color w:val="E06C75"/>
+          <w:sz w:val="21"/>
+          <w:szCs w:val="21"/>
+          <w:lang w:eastAsia="vi-VN"/>
+        </w:rPr>
+        <w:t>k</w:t>
+      </w:r>
+      <w:r>
+        <w:rPr>
+          <w:rFonts w:ascii="Consolas" w:eastAsia="Times New Roman" w:hAnsi="Consolas" w:cs="Times New Roman"/>
+          <w:color w:val="ABB2BF"/>
+          <w:sz w:val="21"/>
+          <w:szCs w:val="21"/>
+          <w:lang w:eastAsia="vi-VN"/>
+        </w:rPr>
+        <w:t>];</w:t>
+      </w:r>
+      <w:r>
+        <w:rPr>
+          <w:rFonts w:ascii="Consolas" w:eastAsia="Times New Roman" w:hAnsi="Consolas" w:cs="Times New Roman"/>
+          <w:i/>
+          <w:iCs/>
+          <w:color w:val="7F848E"/>
+          <w:sz w:val="21"/>
+          <w:szCs w:val="21"/>
+          <w:lang w:eastAsia="vi-VN"/>
+        </w:rPr>
+        <w:t>// Tạo ra nx , ny sau đó nó sẽ lặp qua if bên dưới để biến toàn bộ số 1 ở 4 hướng thành 2</w:t>
+      </w:r>
+    </w:p>
+    <w:p>
+      <w:pPr>
+        <w:shd w:val="clear" w:color="auto" w:fill="282C34"/>
+        <w:spacing w:after="0" w:line="285" w:lineRule="atLeast"/>
+        <w:rPr>
+          <w:rFonts w:ascii="Consolas" w:eastAsia="Times New Roman" w:hAnsi="Consolas" w:cs="Times New Roman"/>
+          <w:color w:val="ABB2BF"/>
+          <w:sz w:val="21"/>
+          <w:szCs w:val="21"/>
+          <w:lang w:eastAsia="vi-VN"/>
+        </w:rPr>
+      </w:pPr>
+      <w:r>
+        <w:rPr>
+          <w:rFonts w:ascii="Consolas" w:eastAsia="Times New Roman" w:hAnsi="Consolas" w:cs="Times New Roman"/>
+          <w:color w:val="ABB2BF"/>
+          <w:sz w:val="21"/>
+          <w:szCs w:val="21"/>
+          <w:lang w:eastAsia="vi-VN"/>
+        </w:rPr>
+        <w:t xml:space="preserve">                    </w:t>
+      </w:r>
+      <w:r>
+        <w:rPr>
+          <w:rFonts w:ascii="Consolas" w:eastAsia="Times New Roman" w:hAnsi="Consolas" w:cs="Times New Roman"/>
+          <w:color w:val="C678DD"/>
+          <w:sz w:val="21"/>
+          <w:szCs w:val="21"/>
+          <w:lang w:eastAsia="vi-VN"/>
+        </w:rPr>
+        <w:t>int</w:t>
+      </w:r>
+      <w:r>
+        <w:rPr>
+          <w:rFonts w:ascii="Consolas" w:eastAsia="Times New Roman" w:hAnsi="Consolas" w:cs="Times New Roman"/>
+          <w:color w:val="ABB2BF"/>
+          <w:sz w:val="21"/>
+          <w:szCs w:val="21"/>
+          <w:lang w:eastAsia="vi-VN"/>
+        </w:rPr>
+        <w:t xml:space="preserve"> </w:t>
+      </w:r>
+      <w:r>
+        <w:rPr>
+          <w:rFonts w:ascii="Consolas" w:eastAsia="Times New Roman" w:hAnsi="Consolas" w:cs="Times New Roman"/>
+          <w:color w:val="E06C75"/>
+          <w:sz w:val="21"/>
+          <w:szCs w:val="21"/>
+          <w:lang w:eastAsia="vi-VN"/>
+        </w:rPr>
+        <w:t>ny</w:t>
+      </w:r>
+      <w:r>
+        <w:rPr>
+          <w:rFonts w:ascii="Consolas" w:eastAsia="Times New Roman" w:hAnsi="Consolas" w:cs="Times New Roman"/>
+          <w:color w:val="ABB2BF"/>
+          <w:sz w:val="21"/>
+          <w:szCs w:val="21"/>
+          <w:lang w:eastAsia="vi-VN"/>
+        </w:rPr>
+        <w:t xml:space="preserve"> </w:t>
+      </w:r>
+      <w:r>
+        <w:rPr>
+          <w:rFonts w:ascii="Consolas" w:eastAsia="Times New Roman" w:hAnsi="Consolas" w:cs="Times New Roman"/>
+          <w:color w:val="C678DD"/>
+          <w:sz w:val="21"/>
+          <w:szCs w:val="21"/>
+          <w:lang w:eastAsia="vi-VN"/>
+        </w:rPr>
+        <w:t>=</w:t>
+      </w:r>
+      <w:r>
+        <w:rPr>
+          <w:rFonts w:ascii="Consolas" w:eastAsia="Times New Roman" w:hAnsi="Consolas" w:cs="Times New Roman"/>
+          <w:color w:val="ABB2BF"/>
+          <w:sz w:val="21"/>
+          <w:szCs w:val="21"/>
+          <w:lang w:eastAsia="vi-VN"/>
+        </w:rPr>
+        <w:t xml:space="preserve"> </w:t>
+      </w:r>
+      <w:r>
+        <w:rPr>
+          <w:rFonts w:ascii="Consolas" w:eastAsia="Times New Roman" w:hAnsi="Consolas" w:cs="Times New Roman"/>
+          <w:color w:val="E06C75"/>
+          <w:sz w:val="21"/>
+          <w:szCs w:val="21"/>
+          <w:lang w:eastAsia="vi-VN"/>
+        </w:rPr>
+        <w:t>y</w:t>
+      </w:r>
+      <w:r>
+        <w:rPr>
+          <w:rFonts w:ascii="Consolas" w:eastAsia="Times New Roman" w:hAnsi="Consolas" w:cs="Times New Roman"/>
+          <w:color w:val="ABB2BF"/>
+          <w:sz w:val="21"/>
+          <w:szCs w:val="21"/>
+          <w:lang w:eastAsia="vi-VN"/>
+        </w:rPr>
+        <w:t xml:space="preserve"> </w:t>
+      </w:r>
+      <w:r>
+        <w:rPr>
+          <w:rFonts w:ascii="Consolas" w:eastAsia="Times New Roman" w:hAnsi="Consolas" w:cs="Times New Roman"/>
+          <w:color w:val="C678DD"/>
+          <w:sz w:val="21"/>
+          <w:szCs w:val="21"/>
+          <w:lang w:eastAsia="vi-VN"/>
+        </w:rPr>
+        <w:t>+</w:t>
+      </w:r>
+      <w:r>
+        <w:rPr>
+          <w:rFonts w:ascii="Consolas" w:eastAsia="Times New Roman" w:hAnsi="Consolas" w:cs="Times New Roman"/>
+          <w:color w:val="ABB2BF"/>
+          <w:sz w:val="21"/>
+          <w:szCs w:val="21"/>
+          <w:lang w:eastAsia="vi-VN"/>
+        </w:rPr>
+        <w:t xml:space="preserve"> </w:t>
+      </w:r>
+      <w:r>
+        <w:rPr>
+          <w:rFonts w:ascii="Consolas" w:eastAsia="Times New Roman" w:hAnsi="Consolas" w:cs="Times New Roman"/>
+          <w:color w:val="E06C75"/>
+          <w:sz w:val="21"/>
+          <w:szCs w:val="21"/>
+          <w:lang w:eastAsia="vi-VN"/>
+        </w:rPr>
+        <w:t>yy</w:t>
+      </w:r>
+      <w:r>
+        <w:rPr>
+          <w:rFonts w:ascii="Consolas" w:eastAsia="Times New Roman" w:hAnsi="Consolas" w:cs="Times New Roman"/>
+          <w:color w:val="ABB2BF"/>
+          <w:sz w:val="21"/>
+          <w:szCs w:val="21"/>
+          <w:lang w:eastAsia="vi-VN"/>
+        </w:rPr>
+        <w:t>[</w:t>
+      </w:r>
+      <w:r>
+        <w:rPr>
+          <w:rFonts w:ascii="Consolas" w:eastAsia="Times New Roman" w:hAnsi="Consolas" w:cs="Times New Roman"/>
+          <w:color w:val="E06C75"/>
+          <w:sz w:val="21"/>
+          <w:szCs w:val="21"/>
+          <w:lang w:eastAsia="vi-VN"/>
+        </w:rPr>
+        <w:t>k</w:t>
+      </w:r>
+      <w:r>
+        <w:rPr>
+          <w:rFonts w:ascii="Consolas" w:eastAsia="Times New Roman" w:hAnsi="Consolas" w:cs="Times New Roman"/>
+          <w:color w:val="ABB2BF"/>
+          <w:sz w:val="21"/>
+          <w:szCs w:val="21"/>
+          <w:lang w:eastAsia="vi-VN"/>
+        </w:rPr>
+        <w:t>];</w:t>
+      </w:r>
+    </w:p>
+    <w:p>
+      <w:pPr>
+        <w:shd w:val="clear" w:color="auto" w:fill="282C34"/>
+        <w:spacing w:after="0" w:line="285" w:lineRule="atLeast"/>
+        <w:rPr>
+          <w:rFonts w:ascii="Consolas" w:eastAsia="Times New Roman" w:hAnsi="Consolas" w:cs="Times New Roman"/>
+          <w:color w:val="ABB2BF"/>
+          <w:sz w:val="21"/>
+          <w:szCs w:val="21"/>
+          <w:lang w:eastAsia="vi-VN"/>
+        </w:rPr>
+      </w:pPr>
+      <w:r>
+        <w:rPr>
+          <w:rFonts w:ascii="Consolas" w:eastAsia="Times New Roman" w:hAnsi="Consolas" w:cs="Times New Roman"/>
+          <w:color w:val="ABB2BF"/>
+          <w:sz w:val="21"/>
+          <w:szCs w:val="21"/>
+          <w:lang w:eastAsia="vi-VN"/>
+        </w:rPr>
+        <w:t xml:space="preserve">                    </w:t>
+      </w:r>
+      <w:r>
+        <w:rPr>
+          <w:rFonts w:ascii="Consolas" w:eastAsia="Times New Roman" w:hAnsi="Consolas" w:cs="Times New Roman"/>
+          <w:color w:val="C678DD"/>
+          <w:sz w:val="21"/>
+          <w:szCs w:val="21"/>
+          <w:lang w:eastAsia="vi-VN"/>
+        </w:rPr>
+        <w:t>if</w:t>
+      </w:r>
+      <w:r>
+        <w:rPr>
+          <w:rFonts w:ascii="Consolas" w:eastAsia="Times New Roman" w:hAnsi="Consolas" w:cs="Times New Roman"/>
+          <w:color w:val="ABB2BF"/>
+          <w:sz w:val="21"/>
+          <w:szCs w:val="21"/>
+          <w:lang w:eastAsia="vi-VN"/>
+        </w:rPr>
+        <w:t>(</w:t>
+      </w:r>
+      <w:r>
+        <w:rPr>
+          <w:rFonts w:ascii="Consolas" w:eastAsia="Times New Roman" w:hAnsi="Consolas" w:cs="Times New Roman"/>
+          <w:color w:val="E06C75"/>
+          <w:sz w:val="21"/>
+          <w:szCs w:val="21"/>
+          <w:lang w:eastAsia="vi-VN"/>
+        </w:rPr>
+        <w:t>nx</w:t>
+      </w:r>
+      <w:r>
+        <w:rPr>
+          <w:rFonts w:ascii="Consolas" w:eastAsia="Times New Roman" w:hAnsi="Consolas" w:cs="Times New Roman"/>
+          <w:color w:val="C678DD"/>
+          <w:sz w:val="21"/>
+          <w:szCs w:val="21"/>
+          <w:lang w:eastAsia="vi-VN"/>
+        </w:rPr>
+        <w:t>&gt;=</w:t>
+      </w:r>
+      <w:r>
+        <w:rPr>
+          <w:rFonts w:ascii="Consolas" w:eastAsia="Times New Roman" w:hAnsi="Consolas" w:cs="Times New Roman"/>
+          <w:color w:val="D19A66"/>
+          <w:sz w:val="21"/>
+          <w:szCs w:val="21"/>
+          <w:lang w:eastAsia="vi-VN"/>
+        </w:rPr>
+        <w:t>0</w:t>
+      </w:r>
+      <w:r>
+        <w:rPr>
+          <w:rFonts w:ascii="Consolas" w:eastAsia="Times New Roman" w:hAnsi="Consolas" w:cs="Times New Roman"/>
+          <w:color w:val="ABB2BF"/>
+          <w:sz w:val="21"/>
+          <w:szCs w:val="21"/>
+          <w:lang w:eastAsia="vi-VN"/>
+        </w:rPr>
+        <w:t xml:space="preserve"> </w:t>
+      </w:r>
+      <w:r>
+        <w:rPr>
+          <w:rFonts w:ascii="Consolas" w:eastAsia="Times New Roman" w:hAnsi="Consolas" w:cs="Times New Roman"/>
+          <w:color w:val="56B6C2"/>
+          <w:sz w:val="21"/>
+          <w:szCs w:val="21"/>
+          <w:lang w:eastAsia="vi-VN"/>
+        </w:rPr>
+        <w:t>&amp;&amp;</w:t>
+      </w:r>
+      <w:r>
+        <w:rPr>
+          <w:rFonts w:ascii="Consolas" w:eastAsia="Times New Roman" w:hAnsi="Consolas" w:cs="Times New Roman"/>
+          <w:color w:val="ABB2BF"/>
+          <w:sz w:val="21"/>
+          <w:szCs w:val="21"/>
+          <w:lang w:eastAsia="vi-VN"/>
+        </w:rPr>
+        <w:t xml:space="preserve"> </w:t>
+      </w:r>
+      <w:r>
+        <w:rPr>
+          <w:rFonts w:ascii="Consolas" w:eastAsia="Times New Roman" w:hAnsi="Consolas" w:cs="Times New Roman"/>
+          <w:color w:val="E06C75"/>
+          <w:sz w:val="21"/>
+          <w:szCs w:val="21"/>
+          <w:lang w:eastAsia="vi-VN"/>
+        </w:rPr>
+        <w:t>nx</w:t>
+      </w:r>
+      <w:r>
+        <w:rPr>
+          <w:rFonts w:ascii="Consolas" w:eastAsia="Times New Roman" w:hAnsi="Consolas" w:cs="Times New Roman"/>
+          <w:color w:val="C678DD"/>
+          <w:sz w:val="21"/>
+          <w:szCs w:val="21"/>
+          <w:lang w:eastAsia="vi-VN"/>
+        </w:rPr>
+        <w:t>&lt;</w:t>
+      </w:r>
+      <w:r>
+        <w:rPr>
+          <w:rFonts w:ascii="Consolas" w:eastAsia="Times New Roman" w:hAnsi="Consolas" w:cs="Times New Roman"/>
+          <w:color w:val="E06C75"/>
+          <w:sz w:val="21"/>
+          <w:szCs w:val="21"/>
+          <w:lang w:eastAsia="vi-VN"/>
+        </w:rPr>
+        <w:t>n</w:t>
+      </w:r>
+      <w:r>
+        <w:rPr>
+          <w:rFonts w:ascii="Consolas" w:eastAsia="Times New Roman" w:hAnsi="Consolas" w:cs="Times New Roman"/>
+          <w:color w:val="ABB2BF"/>
+          <w:sz w:val="21"/>
+          <w:szCs w:val="21"/>
+          <w:lang w:eastAsia="vi-VN"/>
+        </w:rPr>
+        <w:t xml:space="preserve"> </w:t>
+      </w:r>
+      <w:r>
+        <w:rPr>
+          <w:rFonts w:ascii="Consolas" w:eastAsia="Times New Roman" w:hAnsi="Consolas" w:cs="Times New Roman"/>
+          <w:color w:val="56B6C2"/>
+          <w:sz w:val="21"/>
+          <w:szCs w:val="21"/>
+          <w:lang w:eastAsia="vi-VN"/>
+        </w:rPr>
+        <w:t>&amp;&amp;</w:t>
+      </w:r>
+      <w:r>
+        <w:rPr>
+          <w:rFonts w:ascii="Consolas" w:eastAsia="Times New Roman" w:hAnsi="Consolas" w:cs="Times New Roman"/>
+          <w:color w:val="ABB2BF"/>
+          <w:sz w:val="21"/>
+          <w:szCs w:val="21"/>
+          <w:lang w:eastAsia="vi-VN"/>
+        </w:rPr>
+        <w:t xml:space="preserve"> </w:t>
+      </w:r>
+      <w:r>
+        <w:rPr>
+          <w:rFonts w:ascii="Consolas" w:eastAsia="Times New Roman" w:hAnsi="Consolas" w:cs="Times New Roman"/>
+          <w:color w:val="E06C75"/>
+          <w:sz w:val="21"/>
+          <w:szCs w:val="21"/>
+          <w:lang w:eastAsia="vi-VN"/>
+        </w:rPr>
+        <w:t>ny</w:t>
+      </w:r>
+      <w:r>
+        <w:rPr>
+          <w:rFonts w:ascii="Consolas" w:eastAsia="Times New Roman" w:hAnsi="Consolas" w:cs="Times New Roman"/>
+          <w:color w:val="C678DD"/>
+          <w:sz w:val="21"/>
+          <w:szCs w:val="21"/>
+          <w:lang w:eastAsia="vi-VN"/>
+        </w:rPr>
+        <w:t>&gt;=</w:t>
+      </w:r>
+      <w:r>
+        <w:rPr>
+          <w:rFonts w:ascii="Consolas" w:eastAsia="Times New Roman" w:hAnsi="Consolas" w:cs="Times New Roman"/>
+          <w:color w:val="D19A66"/>
+          <w:sz w:val="21"/>
+          <w:szCs w:val="21"/>
+          <w:lang w:eastAsia="vi-VN"/>
+        </w:rPr>
+        <w:t>0</w:t>
+      </w:r>
+      <w:r>
+        <w:rPr>
+          <w:rFonts w:ascii="Consolas" w:eastAsia="Times New Roman" w:hAnsi="Consolas" w:cs="Times New Roman"/>
+          <w:color w:val="ABB2BF"/>
+          <w:sz w:val="21"/>
+          <w:szCs w:val="21"/>
+          <w:lang w:eastAsia="vi-VN"/>
+        </w:rPr>
+        <w:t xml:space="preserve"> </w:t>
+      </w:r>
+      <w:r>
+        <w:rPr>
+          <w:rFonts w:ascii="Consolas" w:eastAsia="Times New Roman" w:hAnsi="Consolas" w:cs="Times New Roman"/>
+          <w:color w:val="56B6C2"/>
+          <w:sz w:val="21"/>
+          <w:szCs w:val="21"/>
+          <w:lang w:eastAsia="vi-VN"/>
+        </w:rPr>
+        <w:t>&amp;&amp;</w:t>
+      </w:r>
+      <w:r>
+        <w:rPr>
+          <w:rFonts w:ascii="Consolas" w:eastAsia="Times New Roman" w:hAnsi="Consolas" w:cs="Times New Roman"/>
+          <w:color w:val="ABB2BF"/>
+          <w:sz w:val="21"/>
+          <w:szCs w:val="21"/>
+          <w:lang w:eastAsia="vi-VN"/>
+        </w:rPr>
+        <w:t xml:space="preserve"> </w:t>
+      </w:r>
+      <w:r>
+        <w:rPr>
+          <w:rFonts w:ascii="Consolas" w:eastAsia="Times New Roman" w:hAnsi="Consolas" w:cs="Times New Roman"/>
+          <w:color w:val="E06C75"/>
+          <w:sz w:val="21"/>
+          <w:szCs w:val="21"/>
+          <w:lang w:eastAsia="vi-VN"/>
+        </w:rPr>
+        <w:t>ny</w:t>
+      </w:r>
+      <w:r>
+        <w:rPr>
+          <w:rFonts w:ascii="Consolas" w:eastAsia="Times New Roman" w:hAnsi="Consolas" w:cs="Times New Roman"/>
+          <w:color w:val="C678DD"/>
+          <w:sz w:val="21"/>
+          <w:szCs w:val="21"/>
+          <w:lang w:eastAsia="vi-VN"/>
+        </w:rPr>
+        <w:t>&lt;</w:t>
+      </w:r>
+      <w:r>
+        <w:rPr>
+          <w:rFonts w:ascii="Consolas" w:eastAsia="Times New Roman" w:hAnsi="Consolas" w:cs="Times New Roman"/>
+          <w:color w:val="E06C75"/>
+          <w:sz w:val="21"/>
+          <w:szCs w:val="21"/>
+          <w:lang w:eastAsia="vi-VN"/>
+        </w:rPr>
+        <w:t>m</w:t>
+      </w:r>
+      <w:r>
+        <w:rPr>
+          <w:rFonts w:ascii="Consolas" w:eastAsia="Times New Roman" w:hAnsi="Consolas" w:cs="Times New Roman"/>
+          <w:color w:val="ABB2BF"/>
+          <w:sz w:val="21"/>
+          <w:szCs w:val="21"/>
+          <w:lang w:eastAsia="vi-VN"/>
+        </w:rPr>
+        <w:t xml:space="preserve"> </w:t>
+      </w:r>
+      <w:r>
+        <w:rPr>
+          <w:rFonts w:ascii="Consolas" w:eastAsia="Times New Roman" w:hAnsi="Consolas" w:cs="Times New Roman"/>
+          <w:color w:val="56B6C2"/>
+          <w:sz w:val="21"/>
+          <w:szCs w:val="21"/>
+          <w:lang w:eastAsia="vi-VN"/>
+        </w:rPr>
+        <w:t>&amp;&amp;</w:t>
+      </w:r>
+      <w:r>
+        <w:rPr>
+          <w:rFonts w:ascii="Consolas" w:eastAsia="Times New Roman" w:hAnsi="Consolas" w:cs="Times New Roman"/>
+          <w:color w:val="ABB2BF"/>
+          <w:sz w:val="21"/>
+          <w:szCs w:val="21"/>
+          <w:lang w:eastAsia="vi-VN"/>
+        </w:rPr>
+        <w:t xml:space="preserve"> </w:t>
+      </w:r>
+      <w:r>
+        <w:rPr>
+          <w:rFonts w:ascii="Consolas" w:eastAsia="Times New Roman" w:hAnsi="Consolas" w:cs="Times New Roman"/>
+          <w:i/>
+          <w:iCs/>
+          <w:color w:val="E06C75"/>
+          <w:sz w:val="21"/>
+          <w:szCs w:val="21"/>
+          <w:lang w:eastAsia="vi-VN"/>
+        </w:rPr>
+        <w:t>grid</w:t>
+      </w:r>
+      <w:r>
+        <w:rPr>
+          <w:rFonts w:ascii="Consolas" w:eastAsia="Times New Roman" w:hAnsi="Consolas" w:cs="Times New Roman"/>
+          <w:color w:val="C678DD"/>
+          <w:sz w:val="21"/>
+          <w:szCs w:val="21"/>
+          <w:lang w:eastAsia="vi-VN"/>
+        </w:rPr>
+        <w:t>[</w:t>
+      </w:r>
+      <w:r>
+        <w:rPr>
+          <w:rFonts w:ascii="Consolas" w:eastAsia="Times New Roman" w:hAnsi="Consolas" w:cs="Times New Roman"/>
+          <w:color w:val="E06C75"/>
+          <w:sz w:val="21"/>
+          <w:szCs w:val="21"/>
+          <w:lang w:eastAsia="vi-VN"/>
+        </w:rPr>
+        <w:t>nx</w:t>
+      </w:r>
+      <w:r>
+        <w:rPr>
+          <w:rFonts w:ascii="Consolas" w:eastAsia="Times New Roman" w:hAnsi="Consolas" w:cs="Times New Roman"/>
+          <w:color w:val="C678DD"/>
+          <w:sz w:val="21"/>
+          <w:szCs w:val="21"/>
+          <w:lang w:eastAsia="vi-VN"/>
+        </w:rPr>
+        <w:t>][</w:t>
+      </w:r>
+      <w:r>
+        <w:rPr>
+          <w:rFonts w:ascii="Consolas" w:eastAsia="Times New Roman" w:hAnsi="Consolas" w:cs="Times New Roman"/>
+          <w:color w:val="E06C75"/>
+          <w:sz w:val="21"/>
+          <w:szCs w:val="21"/>
+          <w:lang w:eastAsia="vi-VN"/>
+        </w:rPr>
+        <w:t>ny</w:t>
+      </w:r>
+      <w:r>
+        <w:rPr>
+          <w:rFonts w:ascii="Consolas" w:eastAsia="Times New Roman" w:hAnsi="Consolas" w:cs="Times New Roman"/>
+          <w:color w:val="C678DD"/>
+          <w:sz w:val="21"/>
+          <w:szCs w:val="21"/>
+          <w:lang w:eastAsia="vi-VN"/>
+        </w:rPr>
+        <w:t>]</w:t>
+      </w:r>
+      <w:r>
+        <w:rPr>
+          <w:rFonts w:ascii="Consolas" w:eastAsia="Times New Roman" w:hAnsi="Consolas" w:cs="Times New Roman"/>
+          <w:color w:val="ABB2BF"/>
+          <w:sz w:val="21"/>
+          <w:szCs w:val="21"/>
+          <w:lang w:eastAsia="vi-VN"/>
+        </w:rPr>
+        <w:t xml:space="preserve"> </w:t>
+      </w:r>
+      <w:r>
+        <w:rPr>
+          <w:rFonts w:ascii="Consolas" w:eastAsia="Times New Roman" w:hAnsi="Consolas" w:cs="Times New Roman"/>
+          <w:color w:val="C678DD"/>
+          <w:sz w:val="21"/>
+          <w:szCs w:val="21"/>
+          <w:lang w:eastAsia="vi-VN"/>
+        </w:rPr>
+        <w:t>==</w:t>
+      </w:r>
+      <w:r>
+        <w:rPr>
+          <w:rFonts w:ascii="Consolas" w:eastAsia="Times New Roman" w:hAnsi="Consolas" w:cs="Times New Roman"/>
+          <w:color w:val="ABB2BF"/>
+          <w:sz w:val="21"/>
+          <w:szCs w:val="21"/>
+          <w:lang w:eastAsia="vi-VN"/>
+        </w:rPr>
+        <w:t xml:space="preserve"> </w:t>
+      </w:r>
+      <w:r>
+        <w:rPr>
+          <w:rFonts w:ascii="Consolas" w:eastAsia="Times New Roman" w:hAnsi="Consolas" w:cs="Times New Roman"/>
+          <w:color w:val="D19A66"/>
+          <w:sz w:val="21"/>
+          <w:szCs w:val="21"/>
+          <w:lang w:eastAsia="vi-VN"/>
+        </w:rPr>
+        <w:t>1</w:t>
+      </w:r>
+      <w:r>
+        <w:rPr>
+          <w:rFonts w:ascii="Consolas" w:eastAsia="Times New Roman" w:hAnsi="Consolas" w:cs="Times New Roman"/>
+          <w:color w:val="ABB2BF"/>
+          <w:sz w:val="21"/>
+          <w:szCs w:val="21"/>
+          <w:lang w:eastAsia="vi-VN"/>
+        </w:rPr>
+        <w:t>){</w:t>
+      </w:r>
+      <w:r>
+        <w:rPr>
+          <w:rFonts w:ascii="Consolas" w:eastAsia="Times New Roman" w:hAnsi="Consolas" w:cs="Times New Roman"/>
+          <w:i/>
+          <w:iCs/>
+          <w:color w:val="7F848E"/>
+          <w:sz w:val="21"/>
+          <w:szCs w:val="21"/>
+          <w:lang w:eastAsia="vi-VN"/>
+        </w:rPr>
+        <w:t xml:space="preserve"> // || là toang ngay :)))</w:t>
+      </w:r>
+    </w:p>
+    <w:p>
+      <w:pPr>
+        <w:shd w:val="clear" w:color="auto" w:fill="282C34"/>
+        <w:spacing w:after="0" w:line="285" w:lineRule="atLeast"/>
+        <w:rPr>
+          <w:rFonts w:ascii="Consolas" w:eastAsia="Times New Roman" w:hAnsi="Consolas" w:cs="Times New Roman"/>
+          <w:color w:val="ABB2BF"/>
+          <w:sz w:val="21"/>
+          <w:szCs w:val="21"/>
+          <w:lang w:eastAsia="vi-VN"/>
+        </w:rPr>
+      </w:pPr>
+      <w:r>
+        <w:rPr>
+          <w:rFonts w:ascii="Consolas" w:eastAsia="Times New Roman" w:hAnsi="Consolas" w:cs="Times New Roman"/>
+          <w:color w:val="ABB2BF"/>
+          <w:sz w:val="21"/>
+          <w:szCs w:val="21"/>
+          <w:lang w:eastAsia="vi-VN"/>
+        </w:rPr>
+        <w:t xml:space="preserve">                        </w:t>
+      </w:r>
+      <w:r>
+        <w:rPr>
+          <w:rFonts w:ascii="Consolas" w:eastAsia="Times New Roman" w:hAnsi="Consolas" w:cs="Times New Roman"/>
+          <w:i/>
+          <w:iCs/>
+          <w:color w:val="E06C75"/>
+          <w:sz w:val="21"/>
+          <w:szCs w:val="21"/>
+          <w:lang w:eastAsia="vi-VN"/>
+        </w:rPr>
+        <w:t>grid</w:t>
+      </w:r>
+      <w:r>
+        <w:rPr>
+          <w:rFonts w:ascii="Consolas" w:eastAsia="Times New Roman" w:hAnsi="Consolas" w:cs="Times New Roman"/>
+          <w:color w:val="C678DD"/>
+          <w:sz w:val="21"/>
+          <w:szCs w:val="21"/>
+          <w:lang w:eastAsia="vi-VN"/>
+        </w:rPr>
+        <w:t>[</w:t>
+      </w:r>
+      <w:r>
+        <w:rPr>
+          <w:rFonts w:ascii="Consolas" w:eastAsia="Times New Roman" w:hAnsi="Consolas" w:cs="Times New Roman"/>
+          <w:color w:val="E06C75"/>
+          <w:sz w:val="21"/>
+          <w:szCs w:val="21"/>
+          <w:lang w:eastAsia="vi-VN"/>
+        </w:rPr>
+        <w:t>nx</w:t>
+      </w:r>
+      <w:r>
+        <w:rPr>
+          <w:rFonts w:ascii="Consolas" w:eastAsia="Times New Roman" w:hAnsi="Consolas" w:cs="Times New Roman"/>
+          <w:color w:val="C678DD"/>
+          <w:sz w:val="21"/>
+          <w:szCs w:val="21"/>
+          <w:lang w:eastAsia="vi-VN"/>
+        </w:rPr>
+        <w:t>][</w:t>
+      </w:r>
+      <w:r>
+        <w:rPr>
+          <w:rFonts w:ascii="Consolas" w:eastAsia="Times New Roman" w:hAnsi="Consolas" w:cs="Times New Roman"/>
+          <w:color w:val="E06C75"/>
+          <w:sz w:val="21"/>
+          <w:szCs w:val="21"/>
+          <w:lang w:eastAsia="vi-VN"/>
+        </w:rPr>
+        <w:t>ny</w:t>
+      </w:r>
+      <w:r>
+        <w:rPr>
+          <w:rFonts w:ascii="Consolas" w:eastAsia="Times New Roman" w:hAnsi="Consolas" w:cs="Times New Roman"/>
+          <w:color w:val="C678DD"/>
+          <w:sz w:val="21"/>
+          <w:szCs w:val="21"/>
+          <w:lang w:eastAsia="vi-VN"/>
+        </w:rPr>
+        <w:t>]</w:t>
+      </w:r>
+      <w:r>
+        <w:rPr>
+          <w:rFonts w:ascii="Consolas" w:eastAsia="Times New Roman" w:hAnsi="Consolas" w:cs="Times New Roman"/>
+          <w:color w:val="ABB2BF"/>
+          <w:sz w:val="21"/>
+          <w:szCs w:val="21"/>
+          <w:lang w:eastAsia="vi-VN"/>
+        </w:rPr>
+        <w:t xml:space="preserve"> </w:t>
+      </w:r>
+      <w:r>
+        <w:rPr>
+          <w:rFonts w:ascii="Consolas" w:eastAsia="Times New Roman" w:hAnsi="Consolas" w:cs="Times New Roman"/>
+          <w:color w:val="C678DD"/>
+          <w:sz w:val="21"/>
+          <w:szCs w:val="21"/>
+          <w:lang w:eastAsia="vi-VN"/>
+        </w:rPr>
+        <w:t>=</w:t>
+      </w:r>
+      <w:r>
+        <w:rPr>
+          <w:rFonts w:ascii="Consolas" w:eastAsia="Times New Roman" w:hAnsi="Consolas" w:cs="Times New Roman"/>
+          <w:color w:val="ABB2BF"/>
+          <w:sz w:val="21"/>
+          <w:szCs w:val="21"/>
+          <w:lang w:eastAsia="vi-VN"/>
+        </w:rPr>
+        <w:t xml:space="preserve"> </w:t>
+      </w:r>
+      <w:r>
+        <w:rPr>
+          <w:rFonts w:ascii="Consolas" w:eastAsia="Times New Roman" w:hAnsi="Consolas" w:cs="Times New Roman"/>
+          <w:color w:val="D19A66"/>
+          <w:sz w:val="21"/>
+          <w:szCs w:val="21"/>
+          <w:lang w:eastAsia="vi-VN"/>
+        </w:rPr>
+        <w:t>2</w:t>
+      </w:r>
+      <w:r>
+        <w:rPr>
+          <w:rFonts w:ascii="Consolas" w:eastAsia="Times New Roman" w:hAnsi="Consolas" w:cs="Times New Roman"/>
+          <w:color w:val="ABB2BF"/>
+          <w:sz w:val="21"/>
+          <w:szCs w:val="21"/>
+          <w:lang w:eastAsia="vi-VN"/>
+        </w:rPr>
+        <w:t>;</w:t>
+      </w:r>
+    </w:p>
+    <w:p>
+      <w:pPr>
+        <w:shd w:val="clear" w:color="auto" w:fill="282C34"/>
+        <w:spacing w:after="0" w:line="285" w:lineRule="atLeast"/>
+        <w:rPr>
+          <w:rFonts w:ascii="Consolas" w:eastAsia="Times New Roman" w:hAnsi="Consolas" w:cs="Times New Roman"/>
+          <w:color w:val="ABB2BF"/>
+          <w:sz w:val="21"/>
+          <w:szCs w:val="21"/>
+          <w:lang w:val="en-US" w:eastAsia="vi-VN"/>
+        </w:rPr>
+      </w:pPr>
+      <w:r>
+        <w:rPr>
+          <w:rFonts w:ascii="Consolas" w:eastAsia="Times New Roman" w:hAnsi="Consolas" w:cs="Times New Roman"/>
+          <w:color w:val="ABB2BF"/>
+          <w:sz w:val="21"/>
+          <w:szCs w:val="21"/>
+          <w:lang w:eastAsia="vi-VN"/>
+        </w:rPr>
+        <w:t xml:space="preserve">                        </w:t>
+      </w:r>
+      <w:r>
+        <w:rPr>
+          <w:rFonts w:ascii="Consolas" w:eastAsia="Times New Roman" w:hAnsi="Consolas" w:cs="Times New Roman"/>
+          <w:color w:val="E06C75"/>
+          <w:sz w:val="21"/>
+          <w:szCs w:val="21"/>
+          <w:lang w:eastAsia="vi-VN"/>
+        </w:rPr>
+        <w:t>fruit</w:t>
+      </w:r>
+      <w:r>
+        <w:rPr>
+          <w:rFonts w:ascii="Consolas" w:eastAsia="Times New Roman" w:hAnsi="Consolas" w:cs="Times New Roman"/>
+          <w:color w:val="C678DD"/>
+          <w:sz w:val="21"/>
+          <w:szCs w:val="21"/>
+          <w:lang w:eastAsia="vi-VN"/>
+        </w:rPr>
+        <w:t>--</w:t>
+      </w:r>
+      <w:r>
+        <w:rPr>
+          <w:rFonts w:ascii="Consolas" w:eastAsia="Times New Roman" w:hAnsi="Consolas" w:cs="Times New Roman"/>
+          <w:color w:val="ABB2BF"/>
+          <w:sz w:val="21"/>
+          <w:szCs w:val="21"/>
+          <w:lang w:eastAsia="vi-VN"/>
+        </w:rPr>
+        <w:t>;</w:t>
+      </w:r>
+    </w:p>
+    <w:p>
+      <w:pPr>
+        <w:shd w:val="clear" w:color="auto" w:fill="282C34"/>
+        <w:spacing w:after="0" w:line="285" w:lineRule="atLeast"/>
+        <w:rPr>
+          <w:rFonts w:ascii="Consolas" w:eastAsia="Times New Roman" w:hAnsi="Consolas" w:cs="Times New Roman"/>
+          <w:color w:val="ABB2BF"/>
+          <w:sz w:val="21"/>
+          <w:szCs w:val="21"/>
+          <w:lang w:eastAsia="vi-VN"/>
+        </w:rPr>
+      </w:pPr>
+      <w:r>
+        <w:rPr>
+          <w:rFonts w:ascii="Consolas" w:eastAsia="Times New Roman" w:hAnsi="Consolas" w:cs="Times New Roman"/>
+          <w:color w:val="ABB2BF"/>
+          <w:sz w:val="21"/>
+          <w:szCs w:val="21"/>
+          <w:lang w:eastAsia="vi-VN"/>
+        </w:rPr>
+        <w:t xml:space="preserve">                        </w:t>
+      </w:r>
+      <w:r>
+        <w:rPr>
+          <w:rFonts w:ascii="Consolas" w:eastAsia="Times New Roman" w:hAnsi="Consolas" w:cs="Times New Roman"/>
+          <w:color w:val="E06C75"/>
+          <w:sz w:val="21"/>
+          <w:szCs w:val="21"/>
+          <w:lang w:eastAsia="vi-VN"/>
+        </w:rPr>
+        <w:t>pq</w:t>
+      </w:r>
+      <w:r>
+        <w:rPr>
+          <w:rFonts w:ascii="Consolas" w:eastAsia="Times New Roman" w:hAnsi="Consolas" w:cs="Times New Roman"/>
+          <w:color w:val="ABB2BF"/>
+          <w:sz w:val="21"/>
+          <w:szCs w:val="21"/>
+          <w:lang w:eastAsia="vi-VN"/>
+        </w:rPr>
+        <w:t>.</w:t>
+      </w:r>
+      <w:r>
+        <w:rPr>
+          <w:rFonts w:ascii="Consolas" w:eastAsia="Times New Roman" w:hAnsi="Consolas" w:cs="Times New Roman"/>
+          <w:color w:val="61AFEF"/>
+          <w:sz w:val="21"/>
+          <w:szCs w:val="21"/>
+          <w:lang w:eastAsia="vi-VN"/>
+        </w:rPr>
+        <w:t>push</w:t>
+      </w:r>
+      <w:r>
+        <w:rPr>
+          <w:rFonts w:ascii="Consolas" w:eastAsia="Times New Roman" w:hAnsi="Consolas" w:cs="Times New Roman"/>
+          <w:color w:val="ABB2BF"/>
+          <w:sz w:val="21"/>
+          <w:szCs w:val="21"/>
+          <w:lang w:eastAsia="vi-VN"/>
+        </w:rPr>
+        <w:t>({</w:t>
+      </w:r>
+      <w:r>
+        <w:rPr>
+          <w:rFonts w:ascii="Consolas" w:eastAsia="Times New Roman" w:hAnsi="Consolas" w:cs="Times New Roman"/>
+          <w:color w:val="E06C75"/>
+          <w:sz w:val="21"/>
+          <w:szCs w:val="21"/>
+          <w:lang w:eastAsia="vi-VN"/>
+        </w:rPr>
+        <w:t>nx</w:t>
+      </w:r>
+      <w:r>
+        <w:rPr>
+          <w:rFonts w:ascii="Consolas" w:eastAsia="Times New Roman" w:hAnsi="Consolas" w:cs="Times New Roman"/>
+          <w:color w:val="ABB2BF"/>
+          <w:sz w:val="21"/>
+          <w:szCs w:val="21"/>
+          <w:lang w:eastAsia="vi-VN"/>
+        </w:rPr>
+        <w:t>,</w:t>
+      </w:r>
+      <w:r>
+        <w:rPr>
+          <w:rFonts w:ascii="Consolas" w:eastAsia="Times New Roman" w:hAnsi="Consolas" w:cs="Times New Roman"/>
+          <w:color w:val="E06C75"/>
+          <w:sz w:val="21"/>
+          <w:szCs w:val="21"/>
+          <w:lang w:eastAsia="vi-VN"/>
+        </w:rPr>
+        <w:t>ny</w:t>
+      </w:r>
+      <w:r>
+        <w:rPr>
+          <w:rFonts w:ascii="Consolas" w:eastAsia="Times New Roman" w:hAnsi="Consolas" w:cs="Times New Roman"/>
+          <w:color w:val="ABB2BF"/>
+          <w:sz w:val="21"/>
+          <w:szCs w:val="21"/>
+          <w:lang w:eastAsia="vi-VN"/>
+        </w:rPr>
+        <w:t>});</w:t>
+      </w:r>
+      <w:r>
+        <w:rPr>
+          <w:rFonts w:ascii="Consolas" w:eastAsia="Times New Roman" w:hAnsi="Consolas" w:cs="Times New Roman"/>
+          <w:i/>
+          <w:iCs/>
+          <w:color w:val="7F848E"/>
+          <w:sz w:val="21"/>
+          <w:szCs w:val="21"/>
+          <w:lang w:eastAsia="vi-VN"/>
+        </w:rPr>
+        <w:t xml:space="preserve"> // Cam thối ở lần cũ đã xóa hết , thêm cam MỚI THỐI vào</w:t>
+      </w:r>
+    </w:p>
+    <w:p>
+      <w:pPr>
+        <w:shd w:val="clear" w:color="auto" w:fill="282C34"/>
+        <w:spacing w:after="0" w:line="285" w:lineRule="atLeast"/>
+        <w:rPr>
+          <w:rFonts w:ascii="Consolas" w:eastAsia="Times New Roman" w:hAnsi="Consolas" w:cs="Times New Roman"/>
+          <w:color w:val="ABB2BF"/>
+          <w:sz w:val="21"/>
+          <w:szCs w:val="21"/>
+          <w:lang w:eastAsia="vi-VN"/>
+        </w:rPr>
+      </w:pPr>
+      <w:r>
+        <w:rPr>
+          <w:rFonts w:ascii="Consolas" w:eastAsia="Times New Roman" w:hAnsi="Consolas" w:cs="Times New Roman"/>
+          <w:color w:val="ABB2BF"/>
+          <w:sz w:val="21"/>
+          <w:szCs w:val="21"/>
+          <w:lang w:eastAsia="vi-VN"/>
+        </w:rPr>
+        <w:t xml:space="preserve">                        </w:t>
+      </w:r>
+      <w:r>
+        <w:rPr>
+          <w:rFonts w:ascii="Consolas" w:eastAsia="Times New Roman" w:hAnsi="Consolas" w:cs="Times New Roman"/>
+          <w:color w:val="E06C75"/>
+          <w:sz w:val="21"/>
+          <w:szCs w:val="21"/>
+          <w:lang w:eastAsia="vi-VN"/>
+        </w:rPr>
+        <w:t>check</w:t>
+      </w:r>
+      <w:r>
+        <w:rPr>
+          <w:rFonts w:ascii="Consolas" w:eastAsia="Times New Roman" w:hAnsi="Consolas" w:cs="Times New Roman"/>
+          <w:color w:val="ABB2BF"/>
+          <w:sz w:val="21"/>
+          <w:szCs w:val="21"/>
+          <w:lang w:eastAsia="vi-VN"/>
+        </w:rPr>
+        <w:t xml:space="preserve"> </w:t>
+      </w:r>
+      <w:r>
+        <w:rPr>
+          <w:rFonts w:ascii="Consolas" w:eastAsia="Times New Roman" w:hAnsi="Consolas" w:cs="Times New Roman"/>
+          <w:color w:val="C678DD"/>
+          <w:sz w:val="21"/>
+          <w:szCs w:val="21"/>
+          <w:lang w:eastAsia="vi-VN"/>
+        </w:rPr>
+        <w:t>=</w:t>
+      </w:r>
+      <w:r>
+        <w:rPr>
+          <w:rFonts w:ascii="Consolas" w:eastAsia="Times New Roman" w:hAnsi="Consolas" w:cs="Times New Roman"/>
+          <w:color w:val="ABB2BF"/>
+          <w:sz w:val="21"/>
+          <w:szCs w:val="21"/>
+          <w:lang w:eastAsia="vi-VN"/>
+        </w:rPr>
+        <w:t xml:space="preserve"> </w:t>
+      </w:r>
+      <w:r>
+        <w:rPr>
+          <w:rFonts w:ascii="Consolas" w:eastAsia="Times New Roman" w:hAnsi="Consolas" w:cs="Times New Roman"/>
+          <w:color w:val="D19A66"/>
+          <w:sz w:val="21"/>
+          <w:szCs w:val="21"/>
+          <w:lang w:eastAsia="vi-VN"/>
+        </w:rPr>
+        <w:t>true</w:t>
+      </w:r>
+      <w:r>
+        <w:rPr>
+          <w:rFonts w:ascii="Consolas" w:eastAsia="Times New Roman" w:hAnsi="Consolas" w:cs="Times New Roman"/>
+          <w:color w:val="ABB2BF"/>
+          <w:sz w:val="21"/>
+          <w:szCs w:val="21"/>
+          <w:lang w:eastAsia="vi-VN"/>
+        </w:rPr>
+        <w:t xml:space="preserve">; </w:t>
+      </w:r>
+    </w:p>
+    <w:p>
+      <w:pPr>
+        <w:shd w:val="clear" w:color="auto" w:fill="282C34"/>
+        <w:spacing w:after="0" w:line="285" w:lineRule="atLeast"/>
+        <w:rPr>
+          <w:rFonts w:ascii="Consolas" w:eastAsia="Times New Roman" w:hAnsi="Consolas" w:cs="Times New Roman"/>
+          <w:color w:val="ABB2BF"/>
+          <w:sz w:val="21"/>
+          <w:szCs w:val="21"/>
+          <w:lang w:eastAsia="vi-VN"/>
+        </w:rPr>
+      </w:pPr>
+      <w:r>
+        <w:rPr>
+          <w:rFonts w:ascii="Consolas" w:eastAsia="Times New Roman" w:hAnsi="Consolas" w:cs="Times New Roman"/>
+          <w:color w:val="ABB2BF"/>
+          <w:sz w:val="21"/>
+          <w:szCs w:val="21"/>
+          <w:lang w:eastAsia="vi-VN"/>
+        </w:rPr>
+        <w:t>                    }</w:t>
+      </w:r>
+    </w:p>
+    <w:p>
+      <w:pPr>
+        <w:shd w:val="clear" w:color="auto" w:fill="282C34"/>
+        <w:spacing w:after="0" w:line="285" w:lineRule="atLeast"/>
+        <w:rPr>
+          <w:rFonts w:ascii="Consolas" w:eastAsia="Times New Roman" w:hAnsi="Consolas" w:cs="Times New Roman"/>
+          <w:color w:val="ABB2BF"/>
+          <w:sz w:val="21"/>
+          <w:szCs w:val="21"/>
+          <w:lang w:eastAsia="vi-VN"/>
+        </w:rPr>
+      </w:pPr>
+      <w:r>
+        <w:rPr>
+          <w:rFonts w:ascii="Consolas" w:eastAsia="Times New Roman" w:hAnsi="Consolas" w:cs="Times New Roman"/>
+          <w:color w:val="ABB2BF"/>
+          <w:sz w:val="21"/>
+          <w:szCs w:val="21"/>
+          <w:lang w:eastAsia="vi-VN"/>
+        </w:rPr>
+        <w:t>                }</w:t>
+      </w:r>
+    </w:p>
+    <w:p>
+      <w:pPr>
+        <w:shd w:val="clear" w:color="auto" w:fill="282C34"/>
+        <w:spacing w:after="0" w:line="285" w:lineRule="atLeast"/>
+        <w:rPr>
+          <w:rFonts w:ascii="Consolas" w:eastAsia="Times New Roman" w:hAnsi="Consolas" w:cs="Times New Roman"/>
+          <w:color w:val="ABB2BF"/>
+          <w:sz w:val="21"/>
+          <w:szCs w:val="21"/>
+          <w:lang w:eastAsia="vi-VN"/>
+        </w:rPr>
+      </w:pPr>
+      <w:r>
+        <w:rPr>
+          <w:rFonts w:ascii="Consolas" w:eastAsia="Times New Roman" w:hAnsi="Consolas" w:cs="Times New Roman"/>
+          <w:color w:val="ABB2BF"/>
+          <w:sz w:val="21"/>
+          <w:szCs w:val="21"/>
+          <w:lang w:eastAsia="vi-VN"/>
+        </w:rPr>
+        <w:t>            }</w:t>
+      </w:r>
+    </w:p>
+    <w:p>
+      <w:pPr>
+        <w:shd w:val="clear" w:color="auto" w:fill="282C34"/>
+        <w:spacing w:after="0" w:line="285" w:lineRule="atLeast"/>
+        <w:rPr>
+          <w:rFonts w:ascii="Consolas" w:eastAsia="Times New Roman" w:hAnsi="Consolas" w:cs="Times New Roman"/>
+          <w:color w:val="ABB2BF"/>
+          <w:sz w:val="21"/>
+          <w:szCs w:val="21"/>
+          <w:lang w:eastAsia="vi-VN"/>
+        </w:rPr>
+      </w:pPr>
+      <w:r>
+        <w:rPr>
+          <w:rFonts w:ascii="Consolas" w:eastAsia="Times New Roman" w:hAnsi="Consolas" w:cs="Times New Roman"/>
+          <w:color w:val="ABB2BF"/>
+          <w:sz w:val="21"/>
+          <w:szCs w:val="21"/>
+          <w:lang w:eastAsia="vi-VN"/>
+        </w:rPr>
+        <w:t xml:space="preserve">            </w:t>
+      </w:r>
+      <w:r>
+        <w:rPr>
+          <w:rFonts w:ascii="Consolas" w:eastAsia="Times New Roman" w:hAnsi="Consolas" w:cs="Times New Roman"/>
+          <w:color w:val="C678DD"/>
+          <w:sz w:val="21"/>
+          <w:szCs w:val="21"/>
+          <w:lang w:eastAsia="vi-VN"/>
+        </w:rPr>
+        <w:t>if</w:t>
+      </w:r>
+      <w:r>
+        <w:rPr>
+          <w:rFonts w:ascii="Consolas" w:eastAsia="Times New Roman" w:hAnsi="Consolas" w:cs="Times New Roman"/>
+          <w:color w:val="ABB2BF"/>
+          <w:sz w:val="21"/>
+          <w:szCs w:val="21"/>
+          <w:lang w:eastAsia="vi-VN"/>
+        </w:rPr>
+        <w:t>(</w:t>
+      </w:r>
+      <w:r>
+        <w:rPr>
+          <w:rFonts w:ascii="Consolas" w:eastAsia="Times New Roman" w:hAnsi="Consolas" w:cs="Times New Roman"/>
+          <w:color w:val="E06C75"/>
+          <w:sz w:val="21"/>
+          <w:szCs w:val="21"/>
+          <w:lang w:eastAsia="vi-VN"/>
+        </w:rPr>
+        <w:t>check</w:t>
+      </w:r>
+      <w:r>
+        <w:rPr>
+          <w:rFonts w:ascii="Consolas" w:eastAsia="Times New Roman" w:hAnsi="Consolas" w:cs="Times New Roman"/>
+          <w:color w:val="ABB2BF"/>
+          <w:sz w:val="21"/>
+          <w:szCs w:val="21"/>
+          <w:lang w:eastAsia="vi-VN"/>
+        </w:rPr>
+        <w:t xml:space="preserve">) </w:t>
+      </w:r>
+      <w:r>
+        <w:rPr>
+          <w:rFonts w:ascii="Consolas" w:eastAsia="Times New Roman" w:hAnsi="Consolas" w:cs="Times New Roman"/>
+          <w:color w:val="E06C75"/>
+          <w:sz w:val="21"/>
+          <w:szCs w:val="21"/>
+          <w:lang w:eastAsia="vi-VN"/>
+        </w:rPr>
+        <w:t>minutes</w:t>
+      </w:r>
+      <w:r>
+        <w:rPr>
+          <w:rFonts w:ascii="Consolas" w:eastAsia="Times New Roman" w:hAnsi="Consolas" w:cs="Times New Roman"/>
+          <w:color w:val="C678DD"/>
+          <w:sz w:val="21"/>
+          <w:szCs w:val="21"/>
+          <w:lang w:eastAsia="vi-VN"/>
+        </w:rPr>
+        <w:t>++</w:t>
+      </w:r>
+      <w:r>
+        <w:rPr>
+          <w:rFonts w:ascii="Consolas" w:eastAsia="Times New Roman" w:hAnsi="Consolas" w:cs="Times New Roman"/>
+          <w:color w:val="ABB2BF"/>
+          <w:sz w:val="21"/>
+          <w:szCs w:val="21"/>
+          <w:lang w:eastAsia="vi-VN"/>
+        </w:rPr>
+        <w:t>;</w:t>
+      </w:r>
+      <w:r>
+        <w:rPr>
+          <w:rFonts w:ascii="Consolas" w:eastAsia="Times New Roman" w:hAnsi="Consolas" w:cs="Times New Roman"/>
+          <w:i/>
+          <w:iCs/>
+          <w:color w:val="7F848E"/>
+          <w:sz w:val="21"/>
+          <w:szCs w:val="21"/>
+          <w:lang w:eastAsia="vi-VN"/>
+        </w:rPr>
+        <w:t>// nếu để minutes trong if bên trên luôn thì for nó lặp cho phát 4 lần là cút luôn</w:t>
+      </w:r>
+    </w:p>
+    <w:p>
+      <w:pPr>
+        <w:shd w:val="clear" w:color="auto" w:fill="282C34"/>
+        <w:spacing w:after="0" w:line="285" w:lineRule="atLeast"/>
+        <w:rPr>
+          <w:rFonts w:ascii="Consolas" w:eastAsia="Times New Roman" w:hAnsi="Consolas" w:cs="Times New Roman"/>
+          <w:color w:val="ABB2BF"/>
+          <w:sz w:val="21"/>
+          <w:szCs w:val="21"/>
+          <w:lang w:eastAsia="vi-VN"/>
+        </w:rPr>
+      </w:pPr>
+      <w:r>
+        <w:rPr>
+          <w:rFonts w:ascii="Consolas" w:eastAsia="Times New Roman" w:hAnsi="Consolas" w:cs="Times New Roman"/>
+          <w:color w:val="ABB2BF"/>
+          <w:sz w:val="21"/>
+          <w:szCs w:val="21"/>
+          <w:lang w:eastAsia="vi-VN"/>
+        </w:rPr>
+        <w:t>        }</w:t>
+      </w:r>
+    </w:p>
+    <w:p>
+      <w:pPr>
+        <w:shd w:val="clear" w:color="auto" w:fill="282C34"/>
+        <w:spacing w:after="0" w:line="285" w:lineRule="atLeast"/>
+        <w:rPr>
+          <w:rFonts w:ascii="Consolas" w:eastAsia="Times New Roman" w:hAnsi="Consolas" w:cs="Times New Roman"/>
+          <w:color w:val="ABB2BF"/>
+          <w:sz w:val="21"/>
+          <w:szCs w:val="21"/>
+          <w:lang w:eastAsia="vi-VN"/>
+        </w:rPr>
+      </w:pPr>
+      <w:r>
+        <w:rPr>
+          <w:rFonts w:ascii="Consolas" w:eastAsia="Times New Roman" w:hAnsi="Consolas" w:cs="Times New Roman"/>
+          <w:color w:val="ABB2BF"/>
+          <w:sz w:val="21"/>
+          <w:szCs w:val="21"/>
+          <w:lang w:eastAsia="vi-VN"/>
+        </w:rPr>
+        <w:t xml:space="preserve">        </w:t>
+      </w:r>
+      <w:r>
+        <w:rPr>
+          <w:rFonts w:ascii="Consolas" w:eastAsia="Times New Roman" w:hAnsi="Consolas" w:cs="Times New Roman"/>
+          <w:color w:val="C678DD"/>
+          <w:sz w:val="21"/>
+          <w:szCs w:val="21"/>
+          <w:lang w:eastAsia="vi-VN"/>
+        </w:rPr>
+        <w:t>return</w:t>
+      </w:r>
+      <w:r>
+        <w:rPr>
+          <w:rFonts w:ascii="Consolas" w:eastAsia="Times New Roman" w:hAnsi="Consolas" w:cs="Times New Roman"/>
+          <w:color w:val="ABB2BF"/>
+          <w:sz w:val="21"/>
+          <w:szCs w:val="21"/>
+          <w:lang w:eastAsia="vi-VN"/>
+        </w:rPr>
+        <w:t xml:space="preserve"> </w:t>
+      </w:r>
+      <w:r>
+        <w:rPr>
+          <w:rFonts w:ascii="Consolas" w:eastAsia="Times New Roman" w:hAnsi="Consolas" w:cs="Times New Roman"/>
+          <w:color w:val="E06C75"/>
+          <w:sz w:val="21"/>
+          <w:szCs w:val="21"/>
+          <w:lang w:eastAsia="vi-VN"/>
+        </w:rPr>
+        <w:t>fruit</w:t>
+      </w:r>
+      <w:r>
+        <w:rPr>
+          <w:rFonts w:ascii="Consolas" w:eastAsia="Times New Roman" w:hAnsi="Consolas" w:cs="Times New Roman"/>
+          <w:color w:val="ABB2BF"/>
+          <w:sz w:val="21"/>
+          <w:szCs w:val="21"/>
+          <w:lang w:eastAsia="vi-VN"/>
+        </w:rPr>
+        <w:t xml:space="preserve"> </w:t>
+      </w:r>
+      <w:r>
+        <w:rPr>
+          <w:rFonts w:ascii="Consolas" w:eastAsia="Times New Roman" w:hAnsi="Consolas" w:cs="Times New Roman"/>
+          <w:color w:val="C678DD"/>
+          <w:sz w:val="21"/>
+          <w:szCs w:val="21"/>
+          <w:lang w:eastAsia="vi-VN"/>
+        </w:rPr>
+        <w:t>==</w:t>
+      </w:r>
+      <w:r>
+        <w:rPr>
+          <w:rFonts w:ascii="Consolas" w:eastAsia="Times New Roman" w:hAnsi="Consolas" w:cs="Times New Roman"/>
+          <w:color w:val="ABB2BF"/>
+          <w:sz w:val="21"/>
+          <w:szCs w:val="21"/>
+          <w:lang w:eastAsia="vi-VN"/>
+        </w:rPr>
+        <w:t xml:space="preserve"> </w:t>
+      </w:r>
+      <w:r>
+        <w:rPr>
+          <w:rFonts w:ascii="Consolas" w:eastAsia="Times New Roman" w:hAnsi="Consolas" w:cs="Times New Roman"/>
+          <w:color w:val="D19A66"/>
+          <w:sz w:val="21"/>
+          <w:szCs w:val="21"/>
+          <w:lang w:eastAsia="vi-VN"/>
+        </w:rPr>
+        <w:t>0</w:t>
+      </w:r>
+      <w:r>
+        <w:rPr>
+          <w:rFonts w:ascii="Consolas" w:eastAsia="Times New Roman" w:hAnsi="Consolas" w:cs="Times New Roman"/>
+          <w:color w:val="ABB2BF"/>
+          <w:sz w:val="21"/>
+          <w:szCs w:val="21"/>
+          <w:lang w:eastAsia="vi-VN"/>
+        </w:rPr>
+        <w:t xml:space="preserve"> </w:t>
+      </w:r>
+      <w:r>
+        <w:rPr>
+          <w:rFonts w:ascii="Consolas" w:eastAsia="Times New Roman" w:hAnsi="Consolas" w:cs="Times New Roman"/>
+          <w:color w:val="C678DD"/>
+          <w:sz w:val="21"/>
+          <w:szCs w:val="21"/>
+          <w:lang w:eastAsia="vi-VN"/>
+        </w:rPr>
+        <w:t>?</w:t>
+      </w:r>
+      <w:r>
+        <w:rPr>
+          <w:rFonts w:ascii="Consolas" w:eastAsia="Times New Roman" w:hAnsi="Consolas" w:cs="Times New Roman"/>
+          <w:color w:val="ABB2BF"/>
+          <w:sz w:val="21"/>
+          <w:szCs w:val="21"/>
+          <w:lang w:eastAsia="vi-VN"/>
+        </w:rPr>
+        <w:t xml:space="preserve"> </w:t>
+      </w:r>
+      <w:r>
+        <w:rPr>
+          <w:rFonts w:ascii="Consolas" w:eastAsia="Times New Roman" w:hAnsi="Consolas" w:cs="Times New Roman"/>
+          <w:color w:val="E06C75"/>
+          <w:sz w:val="21"/>
+          <w:szCs w:val="21"/>
+          <w:lang w:eastAsia="vi-VN"/>
+        </w:rPr>
+        <w:t>minutes</w:t>
+      </w:r>
+      <w:r>
+        <w:rPr>
+          <w:rFonts w:ascii="Consolas" w:eastAsia="Times New Roman" w:hAnsi="Consolas" w:cs="Times New Roman"/>
+          <w:color w:val="ABB2BF"/>
+          <w:sz w:val="21"/>
+          <w:szCs w:val="21"/>
+          <w:lang w:eastAsia="vi-VN"/>
+        </w:rPr>
+        <w:t xml:space="preserve"> </w:t>
+      </w:r>
+      <w:r>
+        <w:rPr>
+          <w:rFonts w:ascii="Consolas" w:eastAsia="Times New Roman" w:hAnsi="Consolas" w:cs="Times New Roman"/>
+          <w:color w:val="C678DD"/>
+          <w:sz w:val="21"/>
+          <w:szCs w:val="21"/>
+          <w:lang w:eastAsia="vi-VN"/>
+        </w:rPr>
+        <w:t>:</w:t>
+      </w:r>
+      <w:r>
+        <w:rPr>
+          <w:rFonts w:ascii="Consolas" w:eastAsia="Times New Roman" w:hAnsi="Consolas" w:cs="Times New Roman"/>
+          <w:color w:val="ABB2BF"/>
+          <w:sz w:val="21"/>
+          <w:szCs w:val="21"/>
+          <w:lang w:eastAsia="vi-VN"/>
+        </w:rPr>
+        <w:t xml:space="preserve"> </w:t>
+      </w:r>
+      <w:r>
+        <w:rPr>
+          <w:rFonts w:ascii="Consolas" w:eastAsia="Times New Roman" w:hAnsi="Consolas" w:cs="Times New Roman"/>
+          <w:color w:val="C678DD"/>
+          <w:sz w:val="21"/>
+          <w:szCs w:val="21"/>
+          <w:lang w:eastAsia="vi-VN"/>
+        </w:rPr>
+        <w:t>-</w:t>
+      </w:r>
+      <w:r>
+        <w:rPr>
+          <w:rFonts w:ascii="Consolas" w:eastAsia="Times New Roman" w:hAnsi="Consolas" w:cs="Times New Roman"/>
+          <w:color w:val="D19A66"/>
+          <w:sz w:val="21"/>
+          <w:szCs w:val="21"/>
+          <w:lang w:eastAsia="vi-VN"/>
+        </w:rPr>
+        <w:t>1</w:t>
+      </w:r>
+      <w:r>
+        <w:rPr>
+          <w:rFonts w:ascii="Consolas" w:eastAsia="Times New Roman" w:hAnsi="Consolas" w:cs="Times New Roman"/>
+          <w:color w:val="ABB2BF"/>
+          <w:sz w:val="21"/>
+          <w:szCs w:val="21"/>
+          <w:lang w:eastAsia="vi-VN"/>
+        </w:rPr>
+        <w:t>;</w:t>
+      </w:r>
+    </w:p>
+    <w:p>
+      <w:pPr>
+        <w:shd w:val="clear" w:color="auto" w:fill="282C34"/>
+        <w:spacing w:after="0" w:line="285" w:lineRule="atLeast"/>
+        <w:rPr>
+          <w:rFonts w:ascii="Consolas" w:eastAsia="Times New Roman" w:hAnsi="Consolas" w:cs="Times New Roman"/>
+          <w:color w:val="ABB2BF"/>
+          <w:sz w:val="21"/>
+          <w:szCs w:val="21"/>
+          <w:lang w:eastAsia="vi-VN"/>
+        </w:rPr>
+      </w:pPr>
+      <w:r>
+        <w:rPr>
+          <w:rFonts w:ascii="Consolas" w:eastAsia="Times New Roman" w:hAnsi="Consolas" w:cs="Times New Roman"/>
+          <w:color w:val="ABB2BF"/>
+          <w:sz w:val="21"/>
+          <w:szCs w:val="21"/>
+          <w:lang w:eastAsia="vi-VN"/>
+        </w:rPr>
+        <w:t>    }</w:t>
+      </w:r>
+    </w:p>
+    <w:p>
+      <w:pPr>
+        <w:shd w:val="clear" w:color="auto" w:fill="282C34"/>
+        <w:spacing w:after="0" w:line="285" w:lineRule="atLeast"/>
+        <w:rPr>
+          <w:rFonts w:ascii="Consolas" w:eastAsia="Times New Roman" w:hAnsi="Consolas" w:cs="Times New Roman"/>
+          <w:color w:val="ABB2BF"/>
+          <w:sz w:val="21"/>
+          <w:szCs w:val="21"/>
+          <w:lang w:eastAsia="vi-VN"/>
+        </w:rPr>
+      </w:pPr>
+    </w:p>
+    <w:p>
+      <w:pPr>
+        <w:shd w:val="clear" w:color="auto" w:fill="282C34"/>
+        <w:spacing w:after="0" w:line="285" w:lineRule="atLeast"/>
+        <w:rPr>
+          <w:rFonts w:ascii="Consolas" w:eastAsia="Times New Roman" w:hAnsi="Consolas" w:cs="Times New Roman"/>
+          <w:color w:val="ABB2BF"/>
+          <w:sz w:val="21"/>
+          <w:szCs w:val="21"/>
+          <w:lang w:eastAsia="vi-VN"/>
+        </w:rPr>
+      </w:pPr>
+      <w:r>
+        <w:rPr>
+          <w:rFonts w:ascii="Consolas" w:eastAsia="Times New Roman" w:hAnsi="Consolas" w:cs="Times New Roman"/>
+          <w:color w:val="ABB2BF"/>
+          <w:sz w:val="21"/>
+          <w:szCs w:val="21"/>
+          <w:lang w:eastAsia="vi-VN"/>
+        </w:rPr>
+        <w:t>};</w:t>
+      </w:r>
+    </w:p>
+    <w:p>
+      <w:pPr>
+        <w:rPr>
+          <w:rFonts w:asciiTheme="majorHAnsi" w:hAnsiTheme="majorHAnsi" w:cstheme="majorHAnsi"/>
+          <w:sz w:val="32"/>
+          <w:szCs w:val="32"/>
         </w:rPr>
       </w:pPr>
     </w:p>

</xml_diff>